<commit_message>
refine: reorganize Maya reading volumes
</commit_message>
<xml_diff>
--- a/source-books/book-3-maya-tradition/outputs/Maya_Calendar_Energies.docx
+++ b/source-books/book-3-maya-tradition/outputs/Maya_Calendar_Energies.docx
@@ -111,7 +111,7 @@
           <w:color w:val="6B2F1A"/>
           <w:sz w:val="28"/>
         </w:rPr>
-        <w:t>III. Настройки и энергии Майя и Ацтеков</w:t>
+        <w:t>VII. Календарь и энергия дней</w:t>
       </w:r>
     </w:p>
     <w:p>
@@ -125,7 +125,7 @@
           <w:color w:val="6B2F1A"/>
           <w:sz w:val="28"/>
         </w:rPr>
-        <w:t>VII. Календарь и энергия дней</w:t>
+        <w:t>VIII. Анонсы и предложения</w:t>
       </w:r>
     </w:p>
     <w:p>
@@ -152,22 +152,7 @@
             <w:color w:val="6B2F1A"/>
             <w:u w:val="single"/>
           </w:rPr>
-          <w:t>III. Настройки и энергии Майя и Ацтеков</w:t>
-        </w:r>
-      </w:hyperlink>
-    </w:p>
-    <w:p>
-      <w:pPr>
-        <w:spacing w:before="0" w:after="40" w:line="276" w:lineRule="auto"/>
-        <w:ind w:left="317"/>
-      </w:pPr>
-      <w:hyperlink w:anchor="article_mayaismagic_154">
-        <w:r>
-          <w:rPr>
-            <w:color w:val="6B2F1A"/>
-            <w:u w:val="single"/>
-          </w:rPr>
-          <w:t>ПОДАРОК. Определение своей сути и миссии в Традиции Майя.</w:t>
+          <w:t>VII. Календарь и энергия дней</w:t>
         </w:r>
       </w:hyperlink>
     </w:p>
@@ -183,50 +168,6 @@
             <w:u w:val="single"/>
           </w:rPr>
           <w:t>Традиция Майя</w:t>
-        </w:r>
-      </w:hyperlink>
-    </w:p>
-    <w:p>
-      <w:pPr>
-        <w:spacing w:before="120" w:after="60" w:line="324" w:lineRule="auto"/>
-      </w:pPr>
-      <w:hyperlink w:anchor="chapter_2">
-        <w:r>
-          <w:rPr>
-            <w:color w:val="6B2F1A"/>
-            <w:u w:val="single"/>
-          </w:rPr>
-          <w:t>VII. Календарь и энергия дней</w:t>
-        </w:r>
-      </w:hyperlink>
-    </w:p>
-    <w:p>
-      <w:pPr>
-        <w:spacing w:before="0" w:after="40" w:line="276" w:lineRule="auto"/>
-        <w:ind w:left="317"/>
-      </w:pPr>
-      <w:hyperlink w:anchor="article_templetherapy_573">
-        <w:r>
-          <w:rPr>
-            <w:color w:val="6B2F1A"/>
-            <w:u w:val="single"/>
-          </w:rPr>
-          <w:t>Здесь краткое описание традиции Майя и одного из курсов, который можно пройти как через личные сессии, так и группой! :)</w:t>
-        </w:r>
-      </w:hyperlink>
-    </w:p>
-    <w:p>
-      <w:pPr>
-        <w:spacing w:before="0" w:after="40" w:line="276" w:lineRule="auto"/>
-        <w:ind w:left="317"/>
-      </w:pPr>
-      <w:hyperlink w:anchor="article_templetherapy_574">
-        <w:r>
-          <w:rPr>
-            <w:color w:val="6B2F1A"/>
-            <w:u w:val="single"/>
-          </w:rPr>
-          <w:t>И тогда твоя сила, твоя К'ух будет расти. Тогда ты будешь слышать шопот Кетцалькоатля</w:t>
         </w:r>
       </w:hyperlink>
     </w:p>
@@ -816,6 +757,65 @@
       </w:hyperlink>
     </w:p>
     <w:p>
+      <w:pPr>
+        <w:spacing w:before="120" w:after="60" w:line="324" w:lineRule="auto"/>
+      </w:pPr>
+      <w:hyperlink w:anchor="chapter_2">
+        <w:r>
+          <w:rPr>
+            <w:color w:val="6B2F1A"/>
+            <w:u w:val="single"/>
+          </w:rPr>
+          <w:t>VIII. Анонсы и предложения</w:t>
+        </w:r>
+      </w:hyperlink>
+    </w:p>
+    <w:p>
+      <w:pPr>
+        <w:spacing w:before="0" w:after="40" w:line="276" w:lineRule="auto"/>
+        <w:ind w:left="317"/>
+      </w:pPr>
+      <w:hyperlink w:anchor="article_mayaismagic_154">
+        <w:r>
+          <w:rPr>
+            <w:color w:val="6B2F1A"/>
+            <w:u w:val="single"/>
+          </w:rPr>
+          <w:t>ПОДАРОК. Определение своей сути и миссии в Традиции Майя.</w:t>
+        </w:r>
+      </w:hyperlink>
+    </w:p>
+    <w:p>
+      <w:pPr>
+        <w:spacing w:before="0" w:after="40" w:line="276" w:lineRule="auto"/>
+        <w:ind w:left="317"/>
+      </w:pPr>
+      <w:hyperlink w:anchor="article_templetherapy_573">
+        <w:r>
+          <w:rPr>
+            <w:color w:val="6B2F1A"/>
+            <w:u w:val="single"/>
+          </w:rPr>
+          <w:t>Здесь краткое описание традиции Майя и одного из курсов, который можно пройти как через личные сессии, так и группой! :)</w:t>
+        </w:r>
+      </w:hyperlink>
+    </w:p>
+    <w:p>
+      <w:pPr>
+        <w:spacing w:before="0" w:after="40" w:line="276" w:lineRule="auto"/>
+        <w:ind w:left="317"/>
+      </w:pPr>
+      <w:hyperlink w:anchor="article_templetherapy_574">
+        <w:r>
+          <w:rPr>
+            <w:color w:val="6B2F1A"/>
+            <w:u w:val="single"/>
+          </w:rPr>
+          <w:t>И тогда твоя сила, твоя К'ух будет расти. Тогда ты будешь слышать шопот Кетцалькоатля</w:t>
+        </w:r>
+      </w:hyperlink>
+    </w:p>
+    <w:p>
       <w:bookmarkStart w:id="1" w:name="chapter_1"/>
       <w:pPr>
         <w:spacing w:before="240" w:after="200" w:line="300" w:lineRule="auto"/>
@@ -827,7 +827,7 @@
           <w:color w:val="6D5A4D"/>
           <w:sz w:val="26"/>
         </w:rPr>
-        <w:t>От образов богов читатель переходит к настройкам, каналам, помощникам и практическим формам работы с энергиями. Это авторские практические описания, а не историческая реконструкция.</w:t>
+        <w:t>В завершении — материалы о календаре Хааб и энергии отдельных периодов: после общей карты традиции они читаются как самостоятельный цикл практических текстов.</w:t>
       </w:r>
       <w:bookmarkEnd w:id="1"/>
     </w:p>
@@ -864,7 +864,7 @@
                 <w:color w:val="B7791F"/>
                 <w:sz w:val="20"/>
               </w:rPr>
-              <w:t>III. НАСТРОЙКИ И ЭНЕРГИИ МАЙЯ И АЦТЕКОВ</w:t>
+              <w:t>VII. КАЛЕНДАРЬ И ЭНЕРГИЯ ДНЕЙ</w:t>
             </w:r>
           </w:p>
         </w:tc>
@@ -878,13 +878,13 @@
         <w:tblLook w:firstColumn="1" w:firstRow="1" w:lastColumn="0" w:lastRow="0" w:noHBand="0" w:noVBand="1" w:val="04A0"/>
       </w:tblPr>
       <w:tblGrid>
-        <w:gridCol w:w="3456"/>
-        <w:gridCol w:w="5328"/>
+        <w:gridCol w:w="4392"/>
+        <w:gridCol w:w="5544"/>
       </w:tblGrid>
       <w:tr>
         <w:tc>
           <w:tcPr>
-            <w:tcW w:type="dxa" w:w="5083"/>
+            <w:tcW w:type="dxa" w:w="4392"/>
             <w:tcMar>
               <w:top w:w="100" w:type="dxa"/>
               <w:start w:w="120" w:type="dxa"/>
@@ -893,299 +893,7 @@
             </w:tcMar>
           </w:tcPr>
           <w:p>
-            <w:bookmarkStart w:id="2" w:name="article_mayaismagic_154"/>
-            <w:pPr>
-              <w:spacing w:before="0" w:after="160" w:line="324" w:lineRule="auto"/>
-            </w:pPr>
-            <w:r>
-              <w:rPr>
-                <w:rFonts w:ascii="Georgia" w:hAnsi="Georgia"/>
-                <w:b/>
-                <w:color w:val="6B2F1A"/>
-                <w:sz w:val="40"/>
-              </w:rPr>
-              <w:t>ПОДАРОК. Определение своей сути и миссии в Традиции Майя.</w:t>
-            </w:r>
-            <w:bookmarkEnd w:id="2"/>
-          </w:p>
-          <w:p>
-            <w:pPr>
-              <w:spacing w:before="0" w:after="0" w:line="324" w:lineRule="auto"/>
-            </w:pPr>
-            <w:r>
-              <w:rPr>
-                <w:rFonts w:ascii="Georgia" w:hAnsi="Georgia"/>
-                <w:b/>
-                <w:color w:val="B7791F"/>
-                <w:sz w:val="21"/>
-              </w:rPr>
-              <w:t>Источник: Mayaismagic · пост 154</w:t>
-              <w:br/>
-            </w:r>
-            <w:r>
-              <w:rPr>
-                <w:rFonts w:ascii="Georgia" w:hAnsi="Georgia"/>
-                <w:b w:val="0"/>
-                <w:color w:val="6D5A4D"/>
-                <w:sz w:val="21"/>
-              </w:rPr>
-              <w:t>Дата: 11.02.2025 20:57:43 UTC-05:00</w:t>
-              <w:br/>
-            </w:r>
-            <w:r>
-              <w:rPr>
-                <w:rFonts w:ascii="Georgia" w:hAnsi="Georgia"/>
-                <w:b w:val="0"/>
-                <w:color w:val="6B2F1A"/>
-                <w:sz w:val="21"/>
-              </w:rPr>
-              <w:t>https://t.me/mayaismagic/154</w:t>
-              <w:br/>
-            </w:r>
-            <w:r>
-              <w:rPr>
-                <w:rFonts w:ascii="Georgia" w:hAnsi="Georgia"/>
-                <w:b/>
-                <w:color w:val="B7791F"/>
-                <w:sz w:val="21"/>
-              </w:rPr>
-              <w:t>Источник: TempleTherapy · пост 2255</w:t>
-              <w:br/>
-            </w:r>
-            <w:r>
-              <w:rPr>
-                <w:rFonts w:ascii="Georgia" w:hAnsi="Georgia"/>
-                <w:b w:val="0"/>
-                <w:color w:val="6D5A4D"/>
-                <w:sz w:val="21"/>
-              </w:rPr>
-              <w:t>Дата: 2025-01-29T02:17:21+00:00</w:t>
-              <w:br/>
-            </w:r>
-            <w:r>
-              <w:rPr>
-                <w:rFonts w:ascii="Georgia" w:hAnsi="Georgia"/>
-                <w:b w:val="0"/>
-                <w:color w:val="6B2F1A"/>
-                <w:sz w:val="21"/>
-              </w:rPr>
-              <w:t>https://t.me/TempleTherapy/2255</w:t>
-              <w:br/>
-            </w:r>
-          </w:p>
-        </w:tc>
-        <w:tc>
-          <w:tcPr>
-            <w:tcW w:type="dxa" w:w="5083"/>
-            <w:tcMar>
-              <w:top w:w="100" w:type="dxa"/>
-              <w:start w:w="120" w:type="dxa"/>
-              <w:bottom w:w="100" w:type="dxa"/>
-              <w:end w:w="120" w:type="dxa"/>
-            </w:tcMar>
-            <w:vAlign w:val="top"/>
-          </w:tcPr>
-          <w:p>
-            <w:pPr>
-              <w:jc w:val="right"/>
-            </w:pPr>
-            <w:r>
-              <w:drawing>
-                <wp:inline xmlns:a="http://schemas.openxmlformats.org/drawingml/2006/main" xmlns:pic="http://schemas.openxmlformats.org/drawingml/2006/picture">
-                  <wp:extent cx="3200400" cy="3200400"/>
-                  <wp:docPr id="2" name="Picture 2"/>
-                  <wp:cNvGraphicFramePr>
-                    <a:graphicFrameLocks noChangeAspect="1"/>
-                  </wp:cNvGraphicFramePr>
-                  <a:graphic>
-                    <a:graphicData uri="http://schemas.openxmlformats.org/drawingml/2006/picture">
-                      <pic:pic>
-                        <pic:nvPicPr>
-                          <pic:cNvPr id="0" name="photo_118@11-02-2025_20-57-43.jpg"/>
-                          <pic:cNvPicPr/>
-                        </pic:nvPicPr>
-                        <pic:blipFill>
-                          <a:blip r:embed="rId12"/>
-                          <a:stretch>
-                            <a:fillRect/>
-                          </a:stretch>
-                        </pic:blipFill>
-                        <pic:spPr>
-                          <a:xfrm>
-                            <a:off x="0" y="0"/>
-                            <a:ext cx="3200400" cy="3200400"/>
-                          </a:xfrm>
-                          <a:prstGeom prst="rect"/>
-                        </pic:spPr>
-                      </pic:pic>
-                    </a:graphicData>
-                  </a:graphic>
-                </wp:inline>
-              </w:drawing>
-            </w:r>
-          </w:p>
-        </w:tc>
-      </w:tr>
-    </w:tbl>
-    <w:p>
-      <w:pPr>
-        <w:spacing w:before="240" w:after="140" w:line="300" w:lineRule="auto"/>
-      </w:pPr>
-      <w:r>
-        <w:rPr>
-          <w:rFonts w:ascii="Georgia" w:hAnsi="Georgia"/>
-          <w:b w:val="0"/>
-          <w:color w:val="2F241D"/>
-          <w:sz w:val="30"/>
-        </w:rPr>
-        <w:t>ПОДАРОК. Определение своей сути и миссии в Традиции Майя.</w:t>
-        <w:br/>
-        <w:t>Разобрался с тем, как майя определяли предназначение.</w:t>
-        <w:br/>
-        <w:t>НАМ ПОМОГАЮТ НАСТРОЙКИ</w:t>
-        <w:br/>
-        <w:t>#1. К’инич (K’inich) - внутренний свет человека</w:t>
-        <w:br/>
-        <w:t>#2. Науаль (Nahual) - духовный помощник, покровитель - дает более глубокое включение в одну из 20 энергий сакрального календаря Цолькин.</w:t>
-        <w:br/>
-        <w:t>#3. К'охбаль (K'ojb'al) - долг, миссия - дает фиксацию в выбранном качестве.</w:t>
-        <w:br/>
-        <w:t>Например,</w:t>
-        <w:br/>
-        <w:t>- Имиш - утроба, Первородная мать.</w:t>
-        <w:br/>
-        <w:t>- Науаль Имиш - дает рост внутреннего потенциала творчества.</w:t>
-        <w:br/>
-        <w:t>- К'охбаль Имиш - формирует импульс творить, зачинать.</w:t>
-        <w:br/>
-        <w:t>- Ик" - энергия ветра, перемен, хаоса.</w:t>
-        <w:br/>
-        <w:t>- Науаль Ик' - готовность что-то изменить в своей жизни или жизни других, лидерская позиция агента перемен.</w:t>
-        <w:br/>
-        <w:t>- К'охб'аль Ик' - конкретные действия, желание что-то почистить, улучшить.</w:t>
-        <w:br/>
-        <w:t>❤️🔥🎁</w:t>
-        <w:br/>
-        <w:t>Вы можете написать мне город, свою дату рождения, а я определю ваш Науаль /дух-помощник майя и передам вам личную инициацию в эту энергию.</w:t>
-        <w:br/>
-        <w:t>Это подарок.😍🥰😘</w:t>
-        <w:br/>
-        <w:t>__</w:t>
-        <w:br/>
-        <w:t>PS. Качества в жизни можно выбирать любые те, что вам наболее интересны на сейчас:</w:t>
-        <w:br/>
-        <w:t>Перечень</w:t>
-        <w:br/>
-        <w:t>20 нахуалей майя (дни Цолькина)</w:t>
-        <w:br/>
-        <w:t>1. Imix (Имиш) – Крокодил, источник жизни, вода, интуиция, первичная энергия.</w:t>
-        <w:br/>
-        <w:t>2. Ik' (Ик') – Ветер, дух, дыхание, перемены, вдохновение.</w:t>
-        <w:br/>
-        <w:t>3. Ak'b'al (Ак'баль) – Ночь, тьма, сны, мудрость, тайны, интуиция.</w:t>
-        <w:br/>
-        <w:t>4. K'an (К'ан) – Семя, рост, процветание, потенциал.</w:t>
-        <w:br/>
-        <w:t>5. Chikchan (Чикчан) – Змея, жизненная сила, кундалини, страсть.</w:t>
-        <w:br/>
-        <w:t>6. Kimi (Кими) – Смерть, переход, трансформация, возрождение.</w:t>
-        <w:br/>
-        <w:t>7. Manik' (Маник') – Олень, гармония, жертва, защита.</w:t>
-        <w:br/>
-        <w:t>8. Lamat (Ламат) – Звезда, красота, плодородие, искусство, Венера.</w:t>
-        <w:br/>
-        <w:t>9. Muluc (Мулук) – Вода, очищение, жертва, дождь, карма.</w:t>
-        <w:br/>
-        <w:t>10. Ok (Ок) – Собака, верность, дружба, защита, проводник в мир духов.</w:t>
-        <w:br/>
-        <w:t>11. Chuwen (Чувен) – Обезьяна, творчество, игра, мастерство, ремесло.</w:t>
-        <w:br/>
-        <w:t>12. Eb (Эб) – Дорога, судьба, путь жизни, карма, целительство.</w:t>
-        <w:br/>
-        <w:t>13. B'en (Б'ен) – Тростник, лидерство, сила духа, амбиции.</w:t>
-        <w:br/>
-        <w:t>14. Ix (Иш) – Ягуар, магия, тайные знания, шаманизм.</w:t>
-        <w:br/>
-        <w:t>15. Men (Мен) – Орел, видение, пророчество, духовная сила.</w:t>
-        <w:br/>
-        <w:t>16. Kib' (Киб') – Сова, мудрость, медитация, очищение, прощение.</w:t>
-        <w:br/>
-        <w:t>17. Kaban (Кабан) – Земля, синхронность, наука, эволюция.</w:t>
-        <w:br/>
-        <w:t>18. Etz'nab' (Эц'наб') – Кремень, правда, решительность, духовный меч.</w:t>
-        <w:br/>
-        <w:t>19. Kawak (Кавак) – Буря, очищение, эмоции, перемены.</w:t>
-        <w:br/>
-        <w:t>20. Ajaw (Ахав) – Солнце, просветление, завершение, божественная сила.</w:t>
-        <w:br/>
-        <w:t>Ранее я уже описывал часть этих качеств, если надо могу описать что-то детальней.</w:t>
-        <w:br/>
-        <w:t>Можете скачать методичку по майя</w:t>
-      </w:r>
-    </w:p>
-    <w:tbl>
-      <w:tblPr>
-        <w:tblW w:type="auto" w:w="0"/>
-        <w:tblLayout w:type="fixed"/>
-        <w:tblLook w:firstColumn="1" w:firstRow="1" w:lastColumn="0" w:lastRow="0" w:noHBand="0" w:noVBand="1" w:val="04A0"/>
-      </w:tblPr>
-      <w:tblGrid>
-        <w:gridCol w:w="10166"/>
-      </w:tblGrid>
-      <w:tr>
-        <w:tc>
-          <w:tcPr>
-            <w:tcW w:type="dxa" w:w="10166"/>
-            <w:shd w:fill="FBF4E9"/>
-            <w:tcMar>
-              <w:top w:w="100" w:type="dxa"/>
-              <w:start w:w="120" w:type="dxa"/>
-              <w:bottom w:w="100" w:type="dxa"/>
-              <w:end w:w="120" w:type="dxa"/>
-            </w:tcMar>
-            <w:vAlign w:val="center"/>
-          </w:tcPr>
-          <w:p>
-            <w:pPr>
-              <w:spacing w:before="0" w:after="0" w:line="324" w:lineRule="auto"/>
-            </w:pPr>
-            <w:r>
-              <w:rPr>
-                <w:rFonts w:ascii="Georgia" w:hAnsi="Georgia"/>
-                <w:b/>
-                <w:color w:val="B7791F"/>
-                <w:sz w:val="20"/>
-              </w:rPr>
-              <w:t>III. НАСТРОЙКИ И ЭНЕРГИИ МАЙЯ И АЦТЕКОВ</w:t>
-            </w:r>
-          </w:p>
-        </w:tc>
-      </w:tr>
-    </w:tbl>
-    <w:tbl>
-      <w:tblPr>
-        <w:tblW w:type="auto" w:w="0"/>
-        <w:jc w:val="right"/>
-        <w:tblLayout w:type="fixed"/>
-        <w:tblLook w:firstColumn="1" w:firstRow="1" w:lastColumn="0" w:lastRow="0" w:noHBand="0" w:noVBand="1" w:val="04A0"/>
-      </w:tblPr>
-      <w:tblGrid>
-        <w:gridCol w:w="3456"/>
-        <w:gridCol w:w="5328"/>
-      </w:tblGrid>
-      <w:tr>
-        <w:tc>
-          <w:tcPr>
-            <w:tcW w:type="dxa" w:w="5083"/>
-            <w:tcMar>
-              <w:top w:w="100" w:type="dxa"/>
-              <w:start w:w="120" w:type="dxa"/>
-              <w:bottom w:w="100" w:type="dxa"/>
-              <w:end w:w="120" w:type="dxa"/>
-            </w:tcMar>
-          </w:tcPr>
-          <w:p>
-            <w:bookmarkStart w:id="3" w:name="article_mayaismagic_156"/>
+            <w:bookmarkStart w:id="2" w:name="article_mayaismagic_156"/>
             <w:pPr>
               <w:spacing w:before="0" w:after="160" w:line="324" w:lineRule="auto"/>
             </w:pPr>
@@ -1198,7 +906,7 @@
               </w:rPr>
               <w:t>Традиция Майя</w:t>
             </w:r>
-            <w:bookmarkEnd w:id="3"/>
+            <w:bookmarkEnd w:id="2"/>
           </w:p>
           <w:p>
             <w:pPr>
@@ -1268,7 +976,7 @@
         </w:tc>
         <w:tc>
           <w:tcPr>
-            <w:tcW w:type="dxa" w:w="5083"/>
+            <w:tcW w:type="dxa" w:w="5544"/>
             <w:tcMar>
               <w:top w:w="100" w:type="dxa"/>
               <w:start w:w="120" w:type="dxa"/>
@@ -1284,8 +992,8 @@
             <w:r>
               <w:drawing>
                 <wp:inline xmlns:a="http://schemas.openxmlformats.org/drawingml/2006/main" xmlns:pic="http://schemas.openxmlformats.org/drawingml/2006/picture">
-                  <wp:extent cx="3200400" cy="3200400"/>
-                  <wp:docPr id="3" name="Picture 3"/>
+                  <wp:extent cx="3337560" cy="3337560"/>
+                  <wp:docPr id="2" name="Picture 2"/>
                   <wp:cNvGraphicFramePr>
                     <a:graphicFrameLocks noChangeAspect="1"/>
                   </wp:cNvGraphicFramePr>
@@ -1297,7 +1005,7 @@
                           <pic:cNvPicPr/>
                         </pic:nvPicPr>
                         <pic:blipFill>
-                          <a:blip r:embed="rId13"/>
+                          <a:blip r:embed="rId12"/>
                           <a:stretch>
                             <a:fillRect/>
                           </a:stretch>
@@ -1305,7 +1013,7 @@
                         <pic:spPr>
                           <a:xfrm>
                             <a:off x="0" y="0"/>
-                            <a:ext cx="3200400" cy="3200400"/>
+                            <a:ext cx="3337560" cy="3337560"/>
                           </a:xfrm>
                           <a:prstGeom prst="rect"/>
                         </pic:spPr>
@@ -1389,346 +1097,6 @@
         <w:t>T.me/andytherapist</w:t>
         <w:br/>
         <w:t>.</w:t>
-      </w:r>
-    </w:p>
-    <w:p>
-      <w:bookmarkStart w:id="4" w:name="chapter_2"/>
-      <w:pPr>
-        <w:spacing w:before="240" w:after="200" w:line="300" w:lineRule="auto"/>
-      </w:pPr>
-      <w:r>
-        <w:rPr>
-          <w:rFonts w:ascii="Georgia" w:hAnsi="Georgia"/>
-          <w:b w:val="0"/>
-          <w:color w:val="6D5A4D"/>
-          <w:sz w:val="26"/>
-        </w:rPr>
-        <w:t>В завершении — материалы о календаре Хааб и энергии отдельных периодов: после общей карты традиции они читаются как самостоятельный цикл практических текстов.</w:t>
-      </w:r>
-      <w:bookmarkEnd w:id="4"/>
-    </w:p>
-    <w:tbl>
-      <w:tblPr>
-        <w:tblW w:type="auto" w:w="0"/>
-        <w:tblLayout w:type="fixed"/>
-        <w:tblLook w:firstColumn="1" w:firstRow="1" w:lastColumn="0" w:lastRow="0" w:noHBand="0" w:noVBand="1" w:val="04A0"/>
-      </w:tblPr>
-      <w:tblGrid>
-        <w:gridCol w:w="10166"/>
-      </w:tblGrid>
-      <w:tr>
-        <w:tc>
-          <w:tcPr>
-            <w:tcW w:type="dxa" w:w="10166"/>
-            <w:shd w:fill="FBF4E9"/>
-            <w:tcMar>
-              <w:top w:w="100" w:type="dxa"/>
-              <w:start w:w="120" w:type="dxa"/>
-              <w:bottom w:w="100" w:type="dxa"/>
-              <w:end w:w="120" w:type="dxa"/>
-            </w:tcMar>
-            <w:vAlign w:val="center"/>
-          </w:tcPr>
-          <w:p>
-            <w:pPr>
-              <w:spacing w:before="0" w:after="0" w:line="324" w:lineRule="auto"/>
-            </w:pPr>
-            <w:r>
-              <w:rPr>
-                <w:rFonts w:ascii="Georgia" w:hAnsi="Georgia"/>
-                <w:b/>
-                <w:color w:val="B7791F"/>
-                <w:sz w:val="20"/>
-              </w:rPr>
-              <w:t>VII. КАЛЕНДАРЬ И ЭНЕРГИЯ ДНЕЙ</w:t>
-            </w:r>
-          </w:p>
-        </w:tc>
-      </w:tr>
-    </w:tbl>
-    <w:tbl>
-      <w:tblPr>
-        <w:tblW w:type="auto" w:w="0"/>
-        <w:jc w:val="right"/>
-        <w:tblLayout w:type="fixed"/>
-        <w:tblLook w:firstColumn="1" w:firstRow="1" w:lastColumn="0" w:lastRow="0" w:noHBand="0" w:noVBand="1" w:val="04A0"/>
-      </w:tblPr>
-      <w:tblGrid>
-        <w:gridCol w:w="3456"/>
-        <w:gridCol w:w="5328"/>
-      </w:tblGrid>
-      <w:tr>
-        <w:tc>
-          <w:tcPr>
-            <w:tcW w:type="dxa" w:w="5083"/>
-            <w:tcMar>
-              <w:top w:w="100" w:type="dxa"/>
-              <w:start w:w="120" w:type="dxa"/>
-              <w:bottom w:w="100" w:type="dxa"/>
-              <w:end w:w="120" w:type="dxa"/>
-            </w:tcMar>
-          </w:tcPr>
-          <w:p>
-            <w:bookmarkStart w:id="5" w:name="article_templetherapy_573"/>
-            <w:pPr>
-              <w:spacing w:before="0" w:after="160" w:line="324" w:lineRule="auto"/>
-            </w:pPr>
-            <w:r>
-              <w:rPr>
-                <w:rFonts w:ascii="Georgia" w:hAnsi="Georgia"/>
-                <w:b/>
-                <w:color w:val="6B2F1A"/>
-                <w:sz w:val="40"/>
-              </w:rPr>
-              <w:t>Здесь краткое описание традиции Майя и одного из курсов, который можно пройти как через личные сессии, так и группой! :)</w:t>
-            </w:r>
-            <w:bookmarkEnd w:id="5"/>
-          </w:p>
-          <w:p>
-            <w:pPr>
-              <w:spacing w:before="0" w:after="0" w:line="324" w:lineRule="auto"/>
-            </w:pPr>
-            <w:r>
-              <w:rPr>
-                <w:rFonts w:ascii="Georgia" w:hAnsi="Georgia"/>
-                <w:b/>
-                <w:color w:val="B7791F"/>
-                <w:sz w:val="21"/>
-              </w:rPr>
-              <w:t>Источник: TempleTherapy · пост 573</w:t>
-              <w:br/>
-            </w:r>
-            <w:r>
-              <w:rPr>
-                <w:rFonts w:ascii="Georgia" w:hAnsi="Georgia"/>
-                <w:b w:val="0"/>
-                <w:color w:val="6D5A4D"/>
-                <w:sz w:val="21"/>
-              </w:rPr>
-              <w:t>Дата: 2022-02-11T14:26:26+00:00</w:t>
-              <w:br/>
-            </w:r>
-            <w:r>
-              <w:rPr>
-                <w:rFonts w:ascii="Georgia" w:hAnsi="Georgia"/>
-                <w:b w:val="0"/>
-                <w:color w:val="6B2F1A"/>
-                <w:sz w:val="21"/>
-              </w:rPr>
-              <w:t>https://t.me/TempleTherapy/573</w:t>
-              <w:br/>
-            </w:r>
-          </w:p>
-        </w:tc>
-        <w:tc>
-          <w:tcPr>
-            <w:tcW w:type="dxa" w:w="5083"/>
-            <w:tcMar>
-              <w:top w:w="100" w:type="dxa"/>
-              <w:start w:w="120" w:type="dxa"/>
-              <w:bottom w:w="100" w:type="dxa"/>
-              <w:end w:w="120" w:type="dxa"/>
-            </w:tcMar>
-            <w:vAlign w:val="top"/>
-          </w:tcPr>
-          <w:p>
-            <w:pPr>
-              <w:jc w:val="right"/>
-            </w:pPr>
-            <w:r>
-              <w:drawing>
-                <wp:inline xmlns:a="http://schemas.openxmlformats.org/drawingml/2006/main" xmlns:pic="http://schemas.openxmlformats.org/drawingml/2006/picture">
-                  <wp:extent cx="3200400" cy="2133600"/>
-                  <wp:docPr id="4" name="Picture 4"/>
-                  <wp:cNvGraphicFramePr>
-                    <a:graphicFrameLocks noChangeAspect="1"/>
-                  </wp:cNvGraphicFramePr>
-                  <a:graphic>
-                    <a:graphicData uri="http://schemas.openxmlformats.org/drawingml/2006/picture">
-                      <pic:pic>
-                        <pic:nvPicPr>
-                          <pic:cNvPr id="0" name="post-573-1.jpg"/>
-                          <pic:cNvPicPr/>
-                        </pic:nvPicPr>
-                        <pic:blipFill>
-                          <a:blip r:embed="rId14"/>
-                          <a:stretch>
-                            <a:fillRect/>
-                          </a:stretch>
-                        </pic:blipFill>
-                        <pic:spPr>
-                          <a:xfrm>
-                            <a:off x="0" y="0"/>
-                            <a:ext cx="3200400" cy="2133600"/>
-                          </a:xfrm>
-                          <a:prstGeom prst="rect"/>
-                        </pic:spPr>
-                      </pic:pic>
-                    </a:graphicData>
-                  </a:graphic>
-                </wp:inline>
-              </w:drawing>
-            </w:r>
-          </w:p>
-        </w:tc>
-      </w:tr>
-    </w:tbl>
-    <w:p>
-      <w:pPr>
-        <w:spacing w:before="240" w:after="140" w:line="300" w:lineRule="auto"/>
-      </w:pPr>
-      <w:r>
-        <w:rPr>
-          <w:rFonts w:ascii="Georgia" w:hAnsi="Georgia"/>
-          <w:b w:val="0"/>
-          <w:color w:val="2F241D"/>
-          <w:sz w:val="30"/>
-        </w:rPr>
-        <w:t>Здесь краткое описание традиции Майя и одного из курсов, который можно пройти как через личные сессии, так и группой! :)</w:t>
-        <w:br/>
-        <w:br/>
-        <w:t>АРХЕТИПИЧЕСКИЙ ГИПНОКОУЧИНГ</w:t>
-        <w:br/>
-        <w:br/>
-        <w:t>Цикл. Древние Мистерии.</w:t>
-        <w:br/>
-        <w:br/>
-        <w:t>Курс 6. ИМПУЛЬС ВРЕМЕНИ.</w:t>
-        <w:br/>
-        <w:t>Новый уровень.</w:t>
-        <w:br/>
-        <w:t>(Традиция Майя и Ацтеков)</w:t>
-        <w:br/>
-        <w:br/>
-        <w:t>Традицию Майя часто называют магией времени, так как она сотворила очень интересную модель творения реальности через энергии дней календаря.</w:t>
-        <w:br/>
-        <w:br/>
-        <w:t>Если кто читал мои заметки по дням календаря, там есть механизм весьма любопытной раскрутки от одного дня ко второму.</w:t>
-        <w:br/>
-        <w:br/>
-        <w:t>А запускается она энергией Кетцалькоатля.</w:t>
-        <w:br/>
-        <w:t>Через него вскрывается видение разных параллельных реальностей (=возможностей).</w:t>
-        <w:br/>
-        <w:br/>
-        <w:t>Это чем-то похоже на Эманации Орла в Традиции Толтеков у Кастанеды.</w:t>
-        <w:br/>
-        <w:br/>
-        <w:t>===</w:t>
-        <w:br/>
-        <w:t>Курс Импульс Времени - программа для тех, кто хочет запустить рождение чего-то нового в своей жизни. Семья, отношения, новый бизнес-проект, карьера и т.п.</w:t>
-        <w:br/>
-        <w:br/>
-        <w:t>Этот коучинг-курс базируется на Алгоритме Календаря Древних Майя.</w:t>
-        <w:br/>
-        <w:br/>
-        <w:t>Этот календарь точнее современного. А символика каждого его дня отражает алгоритм развития любого дела.</w:t>
-        <w:br/>
-        <w:br/>
-        <w:t>Мы применим алгоритм Майя к развитию Вашей цели и будем усиливать ее развитие энергией архетипов Майя и Ацтеков.</w:t>
-        <w:br/>
-        <w:br/>
-        <w:t>Тем самым будет повышаться масштаб, качество, эффективность вашего проекта.</w:t>
-        <w:br/>
-        <w:br/>
-        <w:t>Такая работа хороша, если вы хотите запустить новый или масштабировать текущий проект, вывести его на глобальный уровень.</w:t>
-        <w:br/>
-        <w:t>Добавить больше граней и глубины в отношения или в смыслы жизни.</w:t>
-        <w:br/>
-        <w:br/>
-        <w:t>ПРИМЕЧАНИЕ.</w:t>
-        <w:br/>
-        <w:t>Ключевые Архетипы Майя и Ацтеков.</w:t>
-        <w:br/>
-        <w:br/>
-        <w:t>Есть несколько центральных Сил, которые может быть полезно понимать, чтобы лучше прочувствовать культуру майя и ацтеков.</w:t>
-        <w:br/>
-        <w:br/>
-        <w:t>1. Демиург.</w:t>
-        <w:br/>
-        <w:br/>
-        <w:t>А запускается движение календаря Кетцалькоатлем, Пернатым Змеем, Демиургом.</w:t>
-        <w:br/>
-        <w:br/>
-        <w:t>Почему Пернатый змей?</w:t>
-        <w:br/>
-        <w:t>Змея - символ древней мудрости. А оперенья птицы символизируют Верхний Божественный мир, грани реальности.</w:t>
-        <w:br/>
-        <w:br/>
-        <w:t>Через Пернатого змея раскрывается видение разные линий реальности, т.е. возможностей.</w:t>
-        <w:br/>
-        <w:br/>
-        <w:t>Это чем-то похоже на Эманации Орла в Традиции Толтеков у Кастанеды.</w:t>
-        <w:br/>
-        <w:br/>
-        <w:t>2. Потенции мира, энергия.</w:t>
-        <w:br/>
-        <w:t>В этой традиции есть две ключевых стихии:</w:t>
-        <w:br/>
-        <w:t>А) ветер - привносит вероятности, возможности</w:t>
-        <w:br/>
-        <w:t>Иик, Эхекатль.</w:t>
-        <w:br/>
-        <w:t>Б) дождь - символизирует плодородие, блага жизни.</w:t>
-        <w:br/>
-        <w:t>Тлалок.</w:t>
-        <w:br/>
-        <w:t>В) так же есть бог огня и пожаров.</w:t>
-        <w:br/>
-        <w:br/>
-        <w:t>3. Бог Солнца Кинич Ахау, Верховный правитель.</w:t>
-        <w:br/>
-        <w:br/>
-        <w:t>Надо понимать, у любого архетипа, Бога есть светлая и темная (скрытая, дремучая) сторона.</w:t>
-        <w:br/>
-        <w:br/>
-        <w:t>Так, тайный-скрытый близнец Кетцалькоатлья - Шолотль, в виде трехголового пса, отражает неистовое стремление к цели сквозь любые препятствия.</w:t>
-        <w:br/>
-        <w:br/>
-        <w:t>А близнец Бога Солнца Кинич Ахау - проявляется в виде Ягуара, который ночью не зная слабости и пощады громит врагов и  препятствия.</w:t>
-        <w:br/>
-        <w:br/>
-        <w:t>Можно кстати вспомнить два типа спец-наза ацтекских воинов: воины-орлы и тайные воины-ягуары.</w:t>
-        <w:br/>
-        <w:br/>
-        <w:t>4. Древо Жизни.</w:t>
-        <w:br/>
-        <w:t>Мир,  вращается вокруг оси, центрального Древа.</w:t>
-        <w:br/>
-        <w:br/>
-        <w:t>Этим Древо Жизнь иногда проявлено как кукуруза - символ жизни, ключевая еда майя и ацтеков. Отсюда Бог кукурузы - Бог Жизни, целительства, прародитель людей.</w:t>
-        <w:br/>
-        <w:br/>
-        <w:t>5. А хранитель законы, порядки старец-мудрец Ицамна, который восседает птицей на верхушке Древа. Чем-то это может перекликаться с идеей времени, вечности.</w:t>
-        <w:br/>
-        <w:br/>
-        <w:t>6. Ну и Инь-Янь.</w:t>
-        <w:br/>
-        <w:t>У Бога Солнца, Кинич Ахау была возлюбленная/ мать/ жена, что проявлялось в виде Богин Иш Чель.</w:t>
-        <w:br/>
-        <w:t>Она проявлялась в виде разных циклов Луны.</w:t>
-        <w:br/>
-        <w:br/>
-        <w:t>Все становится вполне логичным и понятным :)</w:t>
-        <w:br/>
-        <w:br/>
-        <w:t>7. Лейт-мотив традиции это, конечно, кровь, как проявление жизненной силы, к'ух.</w:t>
-        <w:br/>
-        <w:br/>
-        <w:t>Это где-то пересекается с концепцией ци, прана.</w:t>
-        <w:br/>
-        <w:br/>
-        <w:t>К'ух - это первичная энергия, которая вращает миры, запускает любые процессы.</w:t>
-        <w:br/>
-        <w:t>Это та энергия, которой Кетцалькоатль сотворил мир. Это тот импульс творения, на накоплении и трансформации которого было построена вся майянская религия.</w:t>
-        <w:br/>
-        <w:br/>
-        <w:t>Это энергия, которая запускает Жизнь, Календарь, т.е. символично говоря, движение Солнца.</w:t>
-        <w:br/>
-        <w:br/>
-        <w:t>К'ух надо очищать.</w:t>
-        <w:br/>
-        <w:t>Слушать Богов, Мир, жить в гармонии с Календарем, т.е. синхронизироваться с миром.</w:t>
       </w:r>
     </w:p>
     <w:tbl>
@@ -1778,13 +1146,13 @@
         <w:tblLook w:firstColumn="1" w:firstRow="1" w:lastColumn="0" w:lastRow="0" w:noHBand="0" w:noVBand="1" w:val="04A0"/>
       </w:tblPr>
       <w:tblGrid>
-        <w:gridCol w:w="3456"/>
-        <w:gridCol w:w="5328"/>
+        <w:gridCol w:w="4392"/>
+        <w:gridCol w:w="5544"/>
       </w:tblGrid>
       <w:tr>
         <w:tc>
           <w:tcPr>
-            <w:tcW w:type="dxa" w:w="5083"/>
+            <w:tcW w:type="dxa" w:w="4392"/>
             <w:tcMar>
               <w:top w:w="100" w:type="dxa"/>
               <w:start w:w="120" w:type="dxa"/>
@@ -1793,192 +1161,7 @@
             </w:tcMar>
           </w:tcPr>
           <w:p>
-            <w:bookmarkStart w:id="6" w:name="article_templetherapy_574"/>
-            <w:pPr>
-              <w:spacing w:before="0" w:after="160" w:line="324" w:lineRule="auto"/>
-            </w:pPr>
-            <w:r>
-              <w:rPr>
-                <w:rFonts w:ascii="Georgia" w:hAnsi="Georgia"/>
-                <w:b/>
-                <w:color w:val="6B2F1A"/>
-                <w:sz w:val="40"/>
-              </w:rPr>
-              <w:t>И тогда твоя сила, твоя К'ух будет расти. Тогда ты будешь слышать шопот Кетцалькоатля</w:t>
-            </w:r>
-            <w:bookmarkEnd w:id="6"/>
-          </w:p>
-          <w:p>
-            <w:pPr>
-              <w:spacing w:before="0" w:after="0" w:line="324" w:lineRule="auto"/>
-            </w:pPr>
-            <w:r>
-              <w:rPr>
-                <w:rFonts w:ascii="Georgia" w:hAnsi="Georgia"/>
-                <w:b/>
-                <w:color w:val="B7791F"/>
-                <w:sz w:val="21"/>
-              </w:rPr>
-              <w:t>Источник: TempleTherapy · пост 574</w:t>
-              <w:br/>
-            </w:r>
-            <w:r>
-              <w:rPr>
-                <w:rFonts w:ascii="Georgia" w:hAnsi="Georgia"/>
-                <w:b w:val="0"/>
-                <w:color w:val="6D5A4D"/>
-                <w:sz w:val="21"/>
-              </w:rPr>
-              <w:t>Дата: 2022-02-11T14:26:26+00:00</w:t>
-              <w:br/>
-            </w:r>
-            <w:r>
-              <w:rPr>
-                <w:rFonts w:ascii="Georgia" w:hAnsi="Georgia"/>
-                <w:b w:val="0"/>
-                <w:color w:val="6B2F1A"/>
-                <w:sz w:val="21"/>
-              </w:rPr>
-              <w:t>https://t.me/TempleTherapy/574</w:t>
-              <w:br/>
-            </w:r>
-          </w:p>
-        </w:tc>
-        <w:tc>
-          <w:tcPr>
-            <w:tcW w:type="dxa" w:w="5083"/>
-            <w:tcMar>
-              <w:top w:w="100" w:type="dxa"/>
-              <w:start w:w="120" w:type="dxa"/>
-              <w:bottom w:w="100" w:type="dxa"/>
-              <w:end w:w="120" w:type="dxa"/>
-            </w:tcMar>
-            <w:vAlign w:val="top"/>
-          </w:tcPr>
-          <w:p>
-            <w:pPr>
-              <w:jc w:val="right"/>
-            </w:pPr>
-            <w:r>
-              <w:drawing>
-                <wp:inline xmlns:a="http://schemas.openxmlformats.org/drawingml/2006/main" xmlns:pic="http://schemas.openxmlformats.org/drawingml/2006/picture">
-                  <wp:extent cx="3200400" cy="3200400"/>
-                  <wp:docPr id="5" name="Picture 5"/>
-                  <wp:cNvGraphicFramePr>
-                    <a:graphicFrameLocks noChangeAspect="1"/>
-                  </wp:cNvGraphicFramePr>
-                  <a:graphic>
-                    <a:graphicData uri="http://schemas.openxmlformats.org/drawingml/2006/picture">
-                      <pic:pic>
-                        <pic:nvPicPr>
-                          <pic:cNvPr id="0" name="post-8-1.jpg"/>
-                          <pic:cNvPicPr/>
-                        </pic:nvPicPr>
-                        <pic:blipFill>
-                          <a:blip r:embed="rId15"/>
-                          <a:stretch>
-                            <a:fillRect/>
-                          </a:stretch>
-                        </pic:blipFill>
-                        <pic:spPr>
-                          <a:xfrm>
-                            <a:off x="0" y="0"/>
-                            <a:ext cx="3200400" cy="3200400"/>
-                          </a:xfrm>
-                          <a:prstGeom prst="rect"/>
-                        </pic:spPr>
-                      </pic:pic>
-                    </a:graphicData>
-                  </a:graphic>
-                </wp:inline>
-              </w:drawing>
-            </w:r>
-          </w:p>
-        </w:tc>
-      </w:tr>
-    </w:tbl>
-    <w:p>
-      <w:pPr>
-        <w:spacing w:before="240" w:after="140" w:line="300" w:lineRule="auto"/>
-      </w:pPr>
-      <w:r>
-        <w:rPr>
-          <w:rFonts w:ascii="Georgia" w:hAnsi="Georgia"/>
-          <w:b w:val="0"/>
-          <w:color w:val="2F241D"/>
-          <w:sz w:val="30"/>
-        </w:rPr>
-        <w:t>И тогда твоя сила, твоя К'ух будет расти. Тогда ты будешь слышать шопот Кетцалькоатля</w:t>
-        <w:br/>
-        <w:t>Видеть его перья-эманации (т.е. возможности) и слышать его мудрость (т.е. активировать интуицию, включаться в информополе планеты, коллективное бессознательное).</w:t>
-        <w:br/>
-        <w:br/>
-        <w:t>В рамках Курса Круг Пернатого Змея мы как раз будем учиться синхронизироваться с энергиями Календаря Майя, чувствовать Ритм Времени, и простраивать свои цели, проекты так, чтобы они расширялись и активировались под действием архетипов древней традиции.</w:t>
-      </w:r>
-    </w:p>
-    <w:tbl>
-      <w:tblPr>
-        <w:tblW w:type="auto" w:w="0"/>
-        <w:tblLayout w:type="fixed"/>
-        <w:tblLook w:firstColumn="1" w:firstRow="1" w:lastColumn="0" w:lastRow="0" w:noHBand="0" w:noVBand="1" w:val="04A0"/>
-      </w:tblPr>
-      <w:tblGrid>
-        <w:gridCol w:w="10166"/>
-      </w:tblGrid>
-      <w:tr>
-        <w:tc>
-          <w:tcPr>
-            <w:tcW w:type="dxa" w:w="10166"/>
-            <w:shd w:fill="FBF4E9"/>
-            <w:tcMar>
-              <w:top w:w="100" w:type="dxa"/>
-              <w:start w:w="120" w:type="dxa"/>
-              <w:bottom w:w="100" w:type="dxa"/>
-              <w:end w:w="120" w:type="dxa"/>
-            </w:tcMar>
-            <w:vAlign w:val="center"/>
-          </w:tcPr>
-          <w:p>
-            <w:pPr>
-              <w:spacing w:before="0" w:after="0" w:line="324" w:lineRule="auto"/>
-            </w:pPr>
-            <w:r>
-              <w:rPr>
-                <w:rFonts w:ascii="Georgia" w:hAnsi="Georgia"/>
-                <w:b/>
-                <w:color w:val="B7791F"/>
-                <w:sz w:val="20"/>
-              </w:rPr>
-              <w:t>VII. КАЛЕНДАРЬ И ЭНЕРГИЯ ДНЕЙ</w:t>
-            </w:r>
-          </w:p>
-        </w:tc>
-      </w:tr>
-    </w:tbl>
-    <w:tbl>
-      <w:tblPr>
-        <w:tblW w:type="auto" w:w="0"/>
-        <w:jc w:val="right"/>
-        <w:tblLayout w:type="fixed"/>
-        <w:tblLook w:firstColumn="1" w:firstRow="1" w:lastColumn="0" w:lastRow="0" w:noHBand="0" w:noVBand="1" w:val="04A0"/>
-      </w:tblPr>
-      <w:tblGrid>
-        <w:gridCol w:w="3456"/>
-        <w:gridCol w:w="5328"/>
-      </w:tblGrid>
-      <w:tr>
-        <w:tc>
-          <w:tcPr>
-            <w:tcW w:type="dxa" w:w="5083"/>
-            <w:tcMar>
-              <w:top w:w="100" w:type="dxa"/>
-              <w:start w:w="120" w:type="dxa"/>
-              <w:bottom w:w="100" w:type="dxa"/>
-              <w:end w:w="120" w:type="dxa"/>
-            </w:tcMar>
-          </w:tcPr>
-          <w:p>
-            <w:bookmarkStart w:id="7" w:name="article_templetherapy_100"/>
+            <w:bookmarkStart w:id="3" w:name="article_templetherapy_100"/>
             <w:pPr>
               <w:spacing w:before="0" w:after="160" w:line="324" w:lineRule="auto"/>
             </w:pPr>
@@ -1991,7 +1174,7 @@
               </w:rPr>
               <w:t>Если у Вас есть желание, можем немного углубиться в Эманации Пернатого Змея - Значенич Энергии Дня (Кина) согласно традиции Майя и Ацтеков</w:t>
             </w:r>
-            <w:bookmarkEnd w:id="7"/>
+            <w:bookmarkEnd w:id="3"/>
           </w:p>
           <w:p>
             <w:pPr>
@@ -2031,7 +1214,7 @@
         </w:tc>
         <w:tc>
           <w:tcPr>
-            <w:tcW w:type="dxa" w:w="5083"/>
+            <w:tcW w:type="dxa" w:w="5544"/>
             <w:tcMar>
               <w:top w:w="100" w:type="dxa"/>
               <w:start w:w="120" w:type="dxa"/>
@@ -2047,8 +1230,8 @@
             <w:r>
               <w:drawing>
                 <wp:inline xmlns:a="http://schemas.openxmlformats.org/drawingml/2006/main" xmlns:pic="http://schemas.openxmlformats.org/drawingml/2006/picture">
-                  <wp:extent cx="3200400" cy="3200400"/>
-                  <wp:docPr id="6" name="Picture 6"/>
+                  <wp:extent cx="3337560" cy="3337560"/>
+                  <wp:docPr id="3" name="Picture 3"/>
                   <wp:cNvGraphicFramePr>
                     <a:graphicFrameLocks noChangeAspect="1"/>
                   </wp:cNvGraphicFramePr>
@@ -2068,7 +1251,7 @@
                         <pic:spPr>
                           <a:xfrm>
                             <a:off x="0" y="0"/>
-                            <a:ext cx="3200400" cy="3200400"/>
+                            <a:ext cx="3337560" cy="3337560"/>
                           </a:xfrm>
                           <a:prstGeom prst="rect"/>
                         </pic:spPr>
@@ -2143,13 +1326,13 @@
         <w:tblLook w:firstColumn="1" w:firstRow="1" w:lastColumn="0" w:lastRow="0" w:noHBand="0" w:noVBand="1" w:val="04A0"/>
       </w:tblPr>
       <w:tblGrid>
-        <w:gridCol w:w="3456"/>
-        <w:gridCol w:w="5328"/>
+        <w:gridCol w:w="4392"/>
+        <w:gridCol w:w="5544"/>
       </w:tblGrid>
       <w:tr>
         <w:tc>
           <w:tcPr>
-            <w:tcW w:type="dxa" w:w="5083"/>
+            <w:tcW w:type="dxa" w:w="4392"/>
             <w:tcMar>
               <w:top w:w="100" w:type="dxa"/>
               <w:start w:w="120" w:type="dxa"/>
@@ -2158,7 +1341,7 @@
             </w:tcMar>
           </w:tcPr>
           <w:p>
-            <w:bookmarkStart w:id="8" w:name="article_mayaismagic_79"/>
+            <w:bookmarkStart w:id="4" w:name="article_mayaismagic_79"/>
             <w:pPr>
               <w:spacing w:before="0" w:after="160" w:line="324" w:lineRule="auto"/>
             </w:pPr>
@@ -2171,7 +1354,7 @@
               </w:rPr>
               <w:t>Первый месяц Календаря Хааб - Pop ("поп"). Мастер.</w:t>
             </w:r>
-            <w:bookmarkEnd w:id="8"/>
+            <w:bookmarkEnd w:id="4"/>
           </w:p>
           <w:p>
             <w:pPr>
@@ -2211,7 +1394,7 @@
         </w:tc>
         <w:tc>
           <w:tcPr>
-            <w:tcW w:type="dxa" w:w="5083"/>
+            <w:tcW w:type="dxa" w:w="5544"/>
             <w:tcMar>
               <w:top w:w="100" w:type="dxa"/>
               <w:start w:w="120" w:type="dxa"/>
@@ -2227,8 +1410,8 @@
             <w:r>
               <w:drawing>
                 <wp:inline xmlns:a="http://schemas.openxmlformats.org/drawingml/2006/main" xmlns:pic="http://schemas.openxmlformats.org/drawingml/2006/picture">
-                  <wp:extent cx="3200400" cy="3200400"/>
-                  <wp:docPr id="7" name="Picture 7"/>
+                  <wp:extent cx="3337560" cy="3337560"/>
+                  <wp:docPr id="4" name="Picture 4"/>
                   <wp:cNvGraphicFramePr>
                     <a:graphicFrameLocks noChangeAspect="1"/>
                   </wp:cNvGraphicFramePr>
@@ -2240,7 +1423,7 @@
                           <pic:cNvPicPr/>
                         </pic:nvPicPr>
                         <pic:blipFill>
-                          <a:blip r:embed="rId16"/>
+                          <a:blip r:embed="rId13"/>
                           <a:stretch>
                             <a:fillRect/>
                           </a:stretch>
@@ -2248,7 +1431,7 @@
                         <pic:spPr>
                           <a:xfrm>
                             <a:off x="0" y="0"/>
-                            <a:ext cx="3200400" cy="3200400"/>
+                            <a:ext cx="3337560" cy="3337560"/>
                           </a:xfrm>
                           <a:prstGeom prst="rect"/>
                         </pic:spPr>
@@ -2357,13 +1540,13 @@
         <w:tblLook w:firstColumn="1" w:firstRow="1" w:lastColumn="0" w:lastRow="0" w:noHBand="0" w:noVBand="1" w:val="04A0"/>
       </w:tblPr>
       <w:tblGrid>
-        <w:gridCol w:w="3456"/>
-        <w:gridCol w:w="5328"/>
+        <w:gridCol w:w="4392"/>
+        <w:gridCol w:w="5544"/>
       </w:tblGrid>
       <w:tr>
         <w:tc>
           <w:tcPr>
-            <w:tcW w:type="dxa" w:w="5083"/>
+            <w:tcW w:type="dxa" w:w="4392"/>
             <w:tcMar>
               <w:top w:w="100" w:type="dxa"/>
               <w:start w:w="120" w:type="dxa"/>
@@ -2372,7 +1555,7 @@
             </w:tcMar>
           </w:tcPr>
           <w:p>
-            <w:bookmarkStart w:id="9" w:name="article_mayaismagic_80"/>
+            <w:bookmarkStart w:id="5" w:name="article_mayaismagic_80"/>
             <w:pPr>
               <w:spacing w:before="0" w:after="160" w:line="324" w:lineRule="auto"/>
             </w:pPr>
@@ -2385,7 +1568,7 @@
               </w:rPr>
               <w:t>2 месяц: Uo (wo). Молчаливый исследователь.</w:t>
             </w:r>
-            <w:bookmarkEnd w:id="9"/>
+            <w:bookmarkEnd w:id="5"/>
           </w:p>
           <w:p>
             <w:pPr>
@@ -2425,7 +1608,7 @@
         </w:tc>
         <w:tc>
           <w:tcPr>
-            <w:tcW w:type="dxa" w:w="5083"/>
+            <w:tcW w:type="dxa" w:w="5544"/>
             <w:tcMar>
               <w:top w:w="100" w:type="dxa"/>
               <w:start w:w="120" w:type="dxa"/>
@@ -2441,8 +1624,8 @@
             <w:r>
               <w:drawing>
                 <wp:inline xmlns:a="http://schemas.openxmlformats.org/drawingml/2006/main" xmlns:pic="http://schemas.openxmlformats.org/drawingml/2006/picture">
-                  <wp:extent cx="3200400" cy="3200400"/>
-                  <wp:docPr id="8" name="Picture 8"/>
+                  <wp:extent cx="3337560" cy="3337560"/>
+                  <wp:docPr id="5" name="Picture 5"/>
                   <wp:cNvGraphicFramePr>
                     <a:graphicFrameLocks noChangeAspect="1"/>
                   </wp:cNvGraphicFramePr>
@@ -2454,7 +1637,7 @@
                           <pic:cNvPicPr/>
                         </pic:nvPicPr>
                         <pic:blipFill>
-                          <a:blip r:embed="rId17"/>
+                          <a:blip r:embed="rId14"/>
                           <a:stretch>
                             <a:fillRect/>
                           </a:stretch>
@@ -2462,7 +1645,7 @@
                         <pic:spPr>
                           <a:xfrm>
                             <a:off x="0" y="0"/>
-                            <a:ext cx="3200400" cy="3200400"/>
+                            <a:ext cx="3337560" cy="3337560"/>
                           </a:xfrm>
                           <a:prstGeom prst="rect"/>
                         </pic:spPr>
@@ -2573,13 +1756,13 @@
         <w:tblLook w:firstColumn="1" w:firstRow="1" w:lastColumn="0" w:lastRow="0" w:noHBand="0" w:noVBand="1" w:val="04A0"/>
       </w:tblPr>
       <w:tblGrid>
-        <w:gridCol w:w="3456"/>
-        <w:gridCol w:w="5328"/>
+        <w:gridCol w:w="4392"/>
+        <w:gridCol w:w="5544"/>
       </w:tblGrid>
       <w:tr>
         <w:tc>
           <w:tcPr>
-            <w:tcW w:type="dxa" w:w="5083"/>
+            <w:tcW w:type="dxa" w:w="4392"/>
             <w:tcMar>
               <w:top w:w="100" w:type="dxa"/>
               <w:start w:w="120" w:type="dxa"/>
@@ -2588,7 +1771,7 @@
             </w:tcMar>
           </w:tcPr>
           <w:p>
-            <w:bookmarkStart w:id="10" w:name="article_mayaismagic_89"/>
+            <w:bookmarkStart w:id="6" w:name="article_mayaismagic_89"/>
             <w:pPr>
               <w:spacing w:before="0" w:after="160" w:line="324" w:lineRule="auto"/>
             </w:pPr>
@@ -2601,7 +1784,7 @@
               </w:rPr>
               <w:t>3 месяц календаря майя, Zip</w:t>
             </w:r>
-            <w:bookmarkEnd w:id="10"/>
+            <w:bookmarkEnd w:id="6"/>
           </w:p>
           <w:p>
             <w:pPr>
@@ -2671,7 +1854,7 @@
         </w:tc>
         <w:tc>
           <w:tcPr>
-            <w:tcW w:type="dxa" w:w="5083"/>
+            <w:tcW w:type="dxa" w:w="5544"/>
             <w:tcMar>
               <w:top w:w="100" w:type="dxa"/>
               <w:start w:w="120" w:type="dxa"/>
@@ -2687,8 +1870,8 @@
             <w:r>
               <w:drawing>
                 <wp:inline xmlns:a="http://schemas.openxmlformats.org/drawingml/2006/main" xmlns:pic="http://schemas.openxmlformats.org/drawingml/2006/picture">
-                  <wp:extent cx="3200400" cy="3185570"/>
-                  <wp:docPr id="9" name="Picture 9"/>
+                  <wp:extent cx="3337560" cy="3322094"/>
+                  <wp:docPr id="6" name="Picture 6"/>
                   <wp:cNvGraphicFramePr>
                     <a:graphicFrameLocks noChangeAspect="1"/>
                   </wp:cNvGraphicFramePr>
@@ -2700,7 +1883,7 @@
                           <pic:cNvPicPr/>
                         </pic:nvPicPr>
                         <pic:blipFill>
-                          <a:blip r:embed="rId18"/>
+                          <a:blip r:embed="rId15"/>
                           <a:stretch>
                             <a:fillRect/>
                           </a:stretch>
@@ -2708,7 +1891,7 @@
                         <pic:spPr>
                           <a:xfrm>
                             <a:off x="0" y="0"/>
-                            <a:ext cx="3200400" cy="3185570"/>
+                            <a:ext cx="3337560" cy="3322094"/>
                           </a:xfrm>
                           <a:prstGeom prst="rect"/>
                         </pic:spPr>
@@ -2825,13 +2008,13 @@
         <w:tblLook w:firstColumn="1" w:firstRow="1" w:lastColumn="0" w:lastRow="0" w:noHBand="0" w:noVBand="1" w:val="04A0"/>
       </w:tblPr>
       <w:tblGrid>
-        <w:gridCol w:w="3456"/>
-        <w:gridCol w:w="5328"/>
+        <w:gridCol w:w="4392"/>
+        <w:gridCol w:w="5544"/>
       </w:tblGrid>
       <w:tr>
         <w:tc>
           <w:tcPr>
-            <w:tcW w:type="dxa" w:w="5083"/>
+            <w:tcW w:type="dxa" w:w="4392"/>
             <w:tcMar>
               <w:top w:w="100" w:type="dxa"/>
               <w:start w:w="120" w:type="dxa"/>
@@ -2840,7 +2023,7 @@
             </w:tcMar>
           </w:tcPr>
           <w:p>
-            <w:bookmarkStart w:id="11" w:name="article_mayaismagic_81"/>
+            <w:bookmarkStart w:id="7" w:name="article_mayaismagic_81"/>
             <w:pPr>
               <w:spacing w:before="0" w:after="160" w:line="324" w:lineRule="auto"/>
             </w:pPr>
@@ -2853,7 +2036,7 @@
               </w:rPr>
               <w:t>4 месяц. ZOTZ. Внимательность и знания.</w:t>
             </w:r>
-            <w:bookmarkEnd w:id="11"/>
+            <w:bookmarkEnd w:id="7"/>
           </w:p>
           <w:p>
             <w:pPr>
@@ -2893,7 +2076,7 @@
         </w:tc>
         <w:tc>
           <w:tcPr>
-            <w:tcW w:type="dxa" w:w="5083"/>
+            <w:tcW w:type="dxa" w:w="5544"/>
             <w:tcMar>
               <w:top w:w="100" w:type="dxa"/>
               <w:start w:w="120" w:type="dxa"/>
@@ -2909,8 +2092,8 @@
             <w:r>
               <w:drawing>
                 <wp:inline xmlns:a="http://schemas.openxmlformats.org/drawingml/2006/main" xmlns:pic="http://schemas.openxmlformats.org/drawingml/2006/picture">
-                  <wp:extent cx="3200400" cy="3200400"/>
-                  <wp:docPr id="10" name="Picture 10"/>
+                  <wp:extent cx="3337560" cy="3337560"/>
+                  <wp:docPr id="7" name="Picture 7"/>
                   <wp:cNvGraphicFramePr>
                     <a:graphicFrameLocks noChangeAspect="1"/>
                   </wp:cNvGraphicFramePr>
@@ -2922,7 +2105,7 @@
                           <pic:cNvPicPr/>
                         </pic:nvPicPr>
                         <pic:blipFill>
-                          <a:blip r:embed="rId19"/>
+                          <a:blip r:embed="rId16"/>
                           <a:stretch>
                             <a:fillRect/>
                           </a:stretch>
@@ -2930,7 +2113,7 @@
                         <pic:spPr>
                           <a:xfrm>
                             <a:off x="0" y="0"/>
-                            <a:ext cx="3200400" cy="3200400"/>
+                            <a:ext cx="3337560" cy="3337560"/>
                           </a:xfrm>
                           <a:prstGeom prst="rect"/>
                         </pic:spPr>
@@ -3043,13 +2226,13 @@
         <w:tblLook w:firstColumn="1" w:firstRow="1" w:lastColumn="0" w:lastRow="0" w:noHBand="0" w:noVBand="1" w:val="04A0"/>
       </w:tblPr>
       <w:tblGrid>
-        <w:gridCol w:w="3456"/>
-        <w:gridCol w:w="5328"/>
+        <w:gridCol w:w="4392"/>
+        <w:gridCol w:w="5544"/>
       </w:tblGrid>
       <w:tr>
         <w:tc>
           <w:tcPr>
-            <w:tcW w:type="dxa" w:w="5083"/>
+            <w:tcW w:type="dxa" w:w="4392"/>
             <w:tcMar>
               <w:top w:w="100" w:type="dxa"/>
               <w:start w:w="120" w:type="dxa"/>
@@ -3058,7 +2241,7 @@
             </w:tcMar>
           </w:tcPr>
           <w:p>
-            <w:bookmarkStart w:id="12" w:name="article_mayaismagic_82"/>
+            <w:bookmarkStart w:id="8" w:name="article_mayaismagic_82"/>
             <w:pPr>
               <w:spacing w:before="0" w:after="160" w:line="324" w:lineRule="auto"/>
             </w:pPr>
@@ -3071,7 +2254,7 @@
               </w:rPr>
               <w:t>5 месяц Хааб. TZEC. 1 окт.</w:t>
             </w:r>
-            <w:bookmarkEnd w:id="12"/>
+            <w:bookmarkEnd w:id="8"/>
           </w:p>
           <w:p>
             <w:pPr>
@@ -3111,7 +2294,7 @@
         </w:tc>
         <w:tc>
           <w:tcPr>
-            <w:tcW w:type="dxa" w:w="5083"/>
+            <w:tcW w:type="dxa" w:w="5544"/>
             <w:tcMar>
               <w:top w:w="100" w:type="dxa"/>
               <w:start w:w="120" w:type="dxa"/>
@@ -3127,8 +2310,8 @@
             <w:r>
               <w:drawing>
                 <wp:inline xmlns:a="http://schemas.openxmlformats.org/drawingml/2006/main" xmlns:pic="http://schemas.openxmlformats.org/drawingml/2006/picture">
-                  <wp:extent cx="3200400" cy="3185570"/>
-                  <wp:docPr id="11" name="Picture 11"/>
+                  <wp:extent cx="3337560" cy="3322094"/>
+                  <wp:docPr id="8" name="Picture 8"/>
                   <wp:cNvGraphicFramePr>
                     <a:graphicFrameLocks noChangeAspect="1"/>
                   </wp:cNvGraphicFramePr>
@@ -3140,7 +2323,7 @@
                           <pic:cNvPicPr/>
                         </pic:nvPicPr>
                         <pic:blipFill>
-                          <a:blip r:embed="rId20"/>
+                          <a:blip r:embed="rId17"/>
                           <a:stretch>
                             <a:fillRect/>
                           </a:stretch>
@@ -3148,7 +2331,7 @@
                         <pic:spPr>
                           <a:xfrm>
                             <a:off x="0" y="0"/>
-                            <a:ext cx="3200400" cy="3185570"/>
+                            <a:ext cx="3337560" cy="3322094"/>
                           </a:xfrm>
                           <a:prstGeom prst="rect"/>
                         </pic:spPr>
@@ -3271,13 +2454,13 @@
         <w:tblLook w:firstColumn="1" w:firstRow="1" w:lastColumn="0" w:lastRow="0" w:noHBand="0" w:noVBand="1" w:val="04A0"/>
       </w:tblPr>
       <w:tblGrid>
-        <w:gridCol w:w="3456"/>
-        <w:gridCol w:w="5328"/>
+        <w:gridCol w:w="4392"/>
+        <w:gridCol w:w="5544"/>
       </w:tblGrid>
       <w:tr>
         <w:tc>
           <w:tcPr>
-            <w:tcW w:type="dxa" w:w="5083"/>
+            <w:tcW w:type="dxa" w:w="4392"/>
             <w:tcMar>
               <w:top w:w="100" w:type="dxa"/>
               <w:start w:w="120" w:type="dxa"/>
@@ -3286,7 +2469,7 @@
             </w:tcMar>
           </w:tcPr>
           <w:p>
-            <w:bookmarkStart w:id="13" w:name="article_mayaismagic_94"/>
+            <w:bookmarkStart w:id="9" w:name="article_mayaismagic_94"/>
             <w:pPr>
               <w:spacing w:before="0" w:after="160" w:line="324" w:lineRule="auto"/>
             </w:pPr>
@@ -3299,7 +2482,7 @@
               </w:rPr>
               <w:t>6 месяц Майя. XUL</w:t>
             </w:r>
-            <w:bookmarkEnd w:id="13"/>
+            <w:bookmarkEnd w:id="9"/>
           </w:p>
           <w:p>
             <w:pPr>
@@ -3339,7 +2522,7 @@
         </w:tc>
         <w:tc>
           <w:tcPr>
-            <w:tcW w:type="dxa" w:w="5083"/>
+            <w:tcW w:type="dxa" w:w="5544"/>
             <w:tcMar>
               <w:top w:w="100" w:type="dxa"/>
               <w:start w:w="120" w:type="dxa"/>
@@ -3355,8 +2538,8 @@
             <w:r>
               <w:drawing>
                 <wp:inline xmlns:a="http://schemas.openxmlformats.org/drawingml/2006/main" xmlns:pic="http://schemas.openxmlformats.org/drawingml/2006/picture">
-                  <wp:extent cx="3200400" cy="3200400"/>
-                  <wp:docPr id="12" name="Picture 12"/>
+                  <wp:extent cx="3337560" cy="3337560"/>
+                  <wp:docPr id="9" name="Picture 9"/>
                   <wp:cNvGraphicFramePr>
                     <a:graphicFrameLocks noChangeAspect="1"/>
                   </wp:cNvGraphicFramePr>
@@ -3368,7 +2551,7 @@
                           <pic:cNvPicPr/>
                         </pic:nvPicPr>
                         <pic:blipFill>
-                          <a:blip r:embed="rId21"/>
+                          <a:blip r:embed="rId18"/>
                           <a:stretch>
                             <a:fillRect/>
                           </a:stretch>
@@ -3376,7 +2559,7 @@
                         <pic:spPr>
                           <a:xfrm>
                             <a:off x="0" y="0"/>
-                            <a:ext cx="3200400" cy="3200400"/>
+                            <a:ext cx="3337560" cy="3337560"/>
                           </a:xfrm>
                           <a:prstGeom prst="rect"/>
                         </pic:spPr>
@@ -3499,13 +2682,13 @@
         <w:tblLook w:firstColumn="1" w:firstRow="1" w:lastColumn="0" w:lastRow="0" w:noHBand="0" w:noVBand="1" w:val="04A0"/>
       </w:tblPr>
       <w:tblGrid>
-        <w:gridCol w:w="3456"/>
-        <w:gridCol w:w="5328"/>
+        <w:gridCol w:w="4392"/>
+        <w:gridCol w:w="5544"/>
       </w:tblGrid>
       <w:tr>
         <w:tc>
           <w:tcPr>
-            <w:tcW w:type="dxa" w:w="5083"/>
+            <w:tcW w:type="dxa" w:w="4392"/>
             <w:tcMar>
               <w:top w:w="100" w:type="dxa"/>
               <w:start w:w="120" w:type="dxa"/>
@@ -3514,7 +2697,7 @@
             </w:tcMar>
           </w:tcPr>
           <w:p>
-            <w:bookmarkStart w:id="14" w:name="article_mayaismagic_78"/>
+            <w:bookmarkStart w:id="10" w:name="article_mayaismagic_78"/>
             <w:pPr>
               <w:spacing w:before="0" w:after="160" w:line="324" w:lineRule="auto"/>
             </w:pPr>
@@ -3527,7 +2710,7 @@
               </w:rPr>
               <w:t>Алхимия Майя.</w:t>
             </w:r>
-            <w:bookmarkEnd w:id="14"/>
+            <w:bookmarkEnd w:id="10"/>
           </w:p>
           <w:p>
             <w:pPr>
@@ -3567,7 +2750,7 @@
         </w:tc>
         <w:tc>
           <w:tcPr>
-            <w:tcW w:type="dxa" w:w="5083"/>
+            <w:tcW w:type="dxa" w:w="5544"/>
             <w:tcMar>
               <w:top w:w="100" w:type="dxa"/>
               <w:start w:w="120" w:type="dxa"/>
@@ -3583,8 +2766,8 @@
             <w:r>
               <w:drawing>
                 <wp:inline xmlns:a="http://schemas.openxmlformats.org/drawingml/2006/main" xmlns:pic="http://schemas.openxmlformats.org/drawingml/2006/picture">
-                  <wp:extent cx="3200400" cy="4267200"/>
-                  <wp:docPr id="13" name="Picture 13"/>
+                  <wp:extent cx="3337560" cy="4450080"/>
+                  <wp:docPr id="10" name="Picture 10"/>
                   <wp:cNvGraphicFramePr>
                     <a:graphicFrameLocks noChangeAspect="1"/>
                   </wp:cNvGraphicFramePr>
@@ -3596,7 +2779,7 @@
                           <pic:cNvPicPr/>
                         </pic:nvPicPr>
                         <pic:blipFill>
-                          <a:blip r:embed="rId22"/>
+                          <a:blip r:embed="rId19"/>
                           <a:stretch>
                             <a:fillRect/>
                           </a:stretch>
@@ -3604,7 +2787,7 @@
                         <pic:spPr>
                           <a:xfrm>
                             <a:off x="0" y="0"/>
-                            <a:ext cx="3200400" cy="4267200"/>
+                            <a:ext cx="3337560" cy="4450080"/>
                           </a:xfrm>
                           <a:prstGeom prst="rect"/>
                         </pic:spPr>
@@ -3723,13 +2906,13 @@
         <w:tblLook w:firstColumn="1" w:firstRow="1" w:lastColumn="0" w:lastRow="0" w:noHBand="0" w:noVBand="1" w:val="04A0"/>
       </w:tblPr>
       <w:tblGrid>
-        <w:gridCol w:w="3456"/>
-        <w:gridCol w:w="5328"/>
+        <w:gridCol w:w="4392"/>
+        <w:gridCol w:w="5544"/>
       </w:tblGrid>
       <w:tr>
         <w:tc>
           <w:tcPr>
-            <w:tcW w:type="dxa" w:w="5083"/>
+            <w:tcW w:type="dxa" w:w="4392"/>
             <w:tcMar>
               <w:top w:w="100" w:type="dxa"/>
               <w:start w:w="120" w:type="dxa"/>
@@ -3738,7 +2921,7 @@
             </w:tcMar>
           </w:tcPr>
           <w:p>
-            <w:bookmarkStart w:id="15" w:name="article_mayaismagic_85"/>
+            <w:bookmarkStart w:id="11" w:name="article_mayaismagic_85"/>
             <w:pPr>
               <w:spacing w:before="0" w:after="160" w:line="324" w:lineRule="auto"/>
             </w:pPr>
@@ -3751,7 +2934,7 @@
               </w:rPr>
               <w:t>ПРАКТИЧЕСКИЙ ЭФФЕКТ.</w:t>
             </w:r>
-            <w:bookmarkEnd w:id="15"/>
+            <w:bookmarkEnd w:id="11"/>
           </w:p>
           <w:p>
             <w:pPr>
@@ -3791,7 +2974,7 @@
         </w:tc>
         <w:tc>
           <w:tcPr>
-            <w:tcW w:type="dxa" w:w="5083"/>
+            <w:tcW w:type="dxa" w:w="5544"/>
             <w:tcMar>
               <w:top w:w="100" w:type="dxa"/>
               <w:start w:w="120" w:type="dxa"/>
@@ -3807,8 +2990,8 @@
             <w:r>
               <w:drawing>
                 <wp:inline xmlns:a="http://schemas.openxmlformats.org/drawingml/2006/main" xmlns:pic="http://schemas.openxmlformats.org/drawingml/2006/picture">
-                  <wp:extent cx="3200400" cy="3185570"/>
-                  <wp:docPr id="14" name="Picture 14"/>
+                  <wp:extent cx="3337560" cy="3322094"/>
+                  <wp:docPr id="11" name="Picture 11"/>
                   <wp:cNvGraphicFramePr>
                     <a:graphicFrameLocks noChangeAspect="1"/>
                   </wp:cNvGraphicFramePr>
@@ -3820,7 +3003,7 @@
                           <pic:cNvPicPr/>
                         </pic:nvPicPr>
                         <pic:blipFill>
-                          <a:blip r:embed="rId23"/>
+                          <a:blip r:embed="rId20"/>
                           <a:stretch>
                             <a:fillRect/>
                           </a:stretch>
@@ -3828,7 +3011,7 @@
                         <pic:spPr>
                           <a:xfrm>
                             <a:off x="0" y="0"/>
-                            <a:ext cx="3200400" cy="3185570"/>
+                            <a:ext cx="3337560" cy="3322094"/>
                           </a:xfrm>
                           <a:prstGeom prst="rect"/>
                         </pic:spPr>
@@ -3963,13 +3146,13 @@
         <w:tblLook w:firstColumn="1" w:firstRow="1" w:lastColumn="0" w:lastRow="0" w:noHBand="0" w:noVBand="1" w:val="04A0"/>
       </w:tblPr>
       <w:tblGrid>
-        <w:gridCol w:w="3456"/>
-        <w:gridCol w:w="5328"/>
+        <w:gridCol w:w="4392"/>
+        <w:gridCol w:w="5544"/>
       </w:tblGrid>
       <w:tr>
         <w:tc>
           <w:tcPr>
-            <w:tcW w:type="dxa" w:w="5083"/>
+            <w:tcW w:type="dxa" w:w="4392"/>
             <w:tcMar>
               <w:top w:w="100" w:type="dxa"/>
               <w:start w:w="120" w:type="dxa"/>
@@ -3978,7 +3161,7 @@
             </w:tcMar>
           </w:tcPr>
           <w:p>
-            <w:bookmarkStart w:id="16" w:name="article_templetherapy_57"/>
+            <w:bookmarkStart w:id="12" w:name="article_templetherapy_57"/>
             <w:pPr>
               <w:spacing w:before="0" w:after="160" w:line="324" w:lineRule="auto"/>
             </w:pPr>
@@ -3991,7 +3174,7 @@
               </w:rPr>
               <w:t>У меня немного появилось время. Давайте продолжим исследование Шаманизма народов Майя.</w:t>
             </w:r>
-            <w:bookmarkEnd w:id="16"/>
+            <w:bookmarkEnd w:id="12"/>
           </w:p>
           <w:p>
             <w:pPr>
@@ -4031,7 +3214,7 @@
         </w:tc>
         <w:tc>
           <w:tcPr>
-            <w:tcW w:type="dxa" w:w="5083"/>
+            <w:tcW w:type="dxa" w:w="5544"/>
             <w:tcMar>
               <w:top w:w="100" w:type="dxa"/>
               <w:start w:w="120" w:type="dxa"/>
@@ -4047,8 +3230,8 @@
             <w:r>
               <w:drawing>
                 <wp:inline xmlns:a="http://schemas.openxmlformats.org/drawingml/2006/main" xmlns:pic="http://schemas.openxmlformats.org/drawingml/2006/picture">
-                  <wp:extent cx="3200400" cy="3200400"/>
-                  <wp:docPr id="15" name="Picture 15"/>
+                  <wp:extent cx="3337560" cy="3337560"/>
+                  <wp:docPr id="12" name="Picture 12"/>
                   <wp:cNvGraphicFramePr>
                     <a:graphicFrameLocks noChangeAspect="1"/>
                   </wp:cNvGraphicFramePr>
@@ -4060,7 +3243,7 @@
                           <pic:cNvPicPr/>
                         </pic:nvPicPr>
                         <pic:blipFill>
-                          <a:blip r:embed="rId24"/>
+                          <a:blip r:embed="rId21"/>
                           <a:stretch>
                             <a:fillRect/>
                           </a:stretch>
@@ -4068,7 +3251,7 @@
                         <pic:spPr>
                           <a:xfrm>
                             <a:off x="0" y="0"/>
-                            <a:ext cx="3200400" cy="3200400"/>
+                            <a:ext cx="3337560" cy="3337560"/>
                           </a:xfrm>
                           <a:prstGeom prst="rect"/>
                         </pic:spPr>
@@ -4243,13 +3426,13 @@
         <w:tblLook w:firstColumn="1" w:firstRow="1" w:lastColumn="0" w:lastRow="0" w:noHBand="0" w:noVBand="1" w:val="04A0"/>
       </w:tblPr>
       <w:tblGrid>
-        <w:gridCol w:w="3456"/>
-        <w:gridCol w:w="5328"/>
+        <w:gridCol w:w="4392"/>
+        <w:gridCol w:w="5544"/>
       </w:tblGrid>
       <w:tr>
         <w:tc>
           <w:tcPr>
-            <w:tcW w:type="dxa" w:w="5083"/>
+            <w:tcW w:type="dxa" w:w="4392"/>
             <w:tcMar>
               <w:top w:w="100" w:type="dxa"/>
               <w:start w:w="120" w:type="dxa"/>
@@ -4258,7 +3441,7 @@
             </w:tcMar>
           </w:tcPr>
           <w:p>
-            <w:bookmarkStart w:id="17" w:name="article_templetherapy_103"/>
+            <w:bookmarkStart w:id="13" w:name="article_templetherapy_103"/>
             <w:pPr>
               <w:spacing w:before="0" w:after="160" w:line="324" w:lineRule="auto"/>
             </w:pPr>
@@ -4271,7 +3454,7 @@
               </w:rPr>
               <w:t>Символ 7 апреля - МАНИК.</w:t>
             </w:r>
-            <w:bookmarkEnd w:id="17"/>
+            <w:bookmarkEnd w:id="13"/>
           </w:p>
           <w:p>
             <w:pPr>
@@ -4311,7 +3494,7 @@
         </w:tc>
         <w:tc>
           <w:tcPr>
-            <w:tcW w:type="dxa" w:w="5083"/>
+            <w:tcW w:type="dxa" w:w="5544"/>
             <w:tcMar>
               <w:top w:w="100" w:type="dxa"/>
               <w:start w:w="120" w:type="dxa"/>
@@ -4327,8 +3510,8 @@
             <w:r>
               <w:drawing>
                 <wp:inline xmlns:a="http://schemas.openxmlformats.org/drawingml/2006/main" xmlns:pic="http://schemas.openxmlformats.org/drawingml/2006/picture">
-                  <wp:extent cx="3200400" cy="3200400"/>
-                  <wp:docPr id="16" name="Picture 16"/>
+                  <wp:extent cx="3337560" cy="3337560"/>
+                  <wp:docPr id="13" name="Picture 13"/>
                   <wp:cNvGraphicFramePr>
                     <a:graphicFrameLocks noChangeAspect="1"/>
                   </wp:cNvGraphicFramePr>
@@ -4348,7 +3531,7 @@
                         <pic:spPr>
                           <a:xfrm>
                             <a:off x="0" y="0"/>
-                            <a:ext cx="3200400" cy="3200400"/>
+                            <a:ext cx="3337560" cy="3337560"/>
                           </a:xfrm>
                           <a:prstGeom prst="rect"/>
                         </pic:spPr>
@@ -4548,13 +3731,13 @@
         <w:tblLook w:firstColumn="1" w:firstRow="1" w:lastColumn="0" w:lastRow="0" w:noHBand="0" w:noVBand="1" w:val="04A0"/>
       </w:tblPr>
       <w:tblGrid>
-        <w:gridCol w:w="3456"/>
-        <w:gridCol w:w="5328"/>
+        <w:gridCol w:w="4392"/>
+        <w:gridCol w:w="5544"/>
       </w:tblGrid>
       <w:tr>
         <w:tc>
           <w:tcPr>
-            <w:tcW w:type="dxa" w:w="5083"/>
+            <w:tcW w:type="dxa" w:w="4392"/>
             <w:tcMar>
               <w:top w:w="100" w:type="dxa"/>
               <w:start w:w="120" w:type="dxa"/>
@@ -4563,7 +3746,7 @@
             </w:tcMar>
           </w:tcPr>
           <w:p>
-            <w:bookmarkStart w:id="18" w:name="article_templetherapy_104"/>
+            <w:bookmarkStart w:id="14" w:name="article_templetherapy_104"/>
             <w:pPr>
               <w:spacing w:before="0" w:after="160" w:line="324" w:lineRule="auto"/>
             </w:pPr>
@@ -4576,7 +3759,7 @@
               </w:rPr>
               <w:t>Если взять Поток Маник через Рейки Иггдрасиль - предлагаю свою версию:</w:t>
             </w:r>
-            <w:bookmarkEnd w:id="18"/>
+            <w:bookmarkEnd w:id="14"/>
           </w:p>
           <w:p>
             <w:pPr>
@@ -4616,7 +3799,7 @@
         </w:tc>
         <w:tc>
           <w:tcPr>
-            <w:tcW w:type="dxa" w:w="5083"/>
+            <w:tcW w:type="dxa" w:w="5544"/>
             <w:tcMar>
               <w:top w:w="100" w:type="dxa"/>
               <w:start w:w="120" w:type="dxa"/>
@@ -4632,8 +3815,8 @@
             <w:r>
               <w:drawing>
                 <wp:inline xmlns:a="http://schemas.openxmlformats.org/drawingml/2006/main" xmlns:pic="http://schemas.openxmlformats.org/drawingml/2006/picture">
-                  <wp:extent cx="3200400" cy="3200400"/>
-                  <wp:docPr id="17" name="Picture 17"/>
+                  <wp:extent cx="3337560" cy="3337560"/>
+                  <wp:docPr id="14" name="Picture 14"/>
                   <wp:cNvGraphicFramePr>
                     <a:graphicFrameLocks noChangeAspect="1"/>
                   </wp:cNvGraphicFramePr>
@@ -4653,7 +3836,7 @@
                         <pic:spPr>
                           <a:xfrm>
                             <a:off x="0" y="0"/>
-                            <a:ext cx="3200400" cy="3200400"/>
+                            <a:ext cx="3337560" cy="3337560"/>
                           </a:xfrm>
                           <a:prstGeom prst="rect"/>
                         </pic:spPr>
@@ -4769,13 +3952,13 @@
         <w:tblLook w:firstColumn="1" w:firstRow="1" w:lastColumn="0" w:lastRow="0" w:noHBand="0" w:noVBand="1" w:val="04A0"/>
       </w:tblPr>
       <w:tblGrid>
-        <w:gridCol w:w="3456"/>
-        <w:gridCol w:w="5328"/>
+        <w:gridCol w:w="4392"/>
+        <w:gridCol w:w="5544"/>
       </w:tblGrid>
       <w:tr>
         <w:tc>
           <w:tcPr>
-            <w:tcW w:type="dxa" w:w="5083"/>
+            <w:tcW w:type="dxa" w:w="4392"/>
             <w:tcMar>
               <w:top w:w="100" w:type="dxa"/>
               <w:start w:w="120" w:type="dxa"/>
@@ -4784,7 +3967,7 @@
             </w:tcMar>
           </w:tcPr>
           <w:p>
-            <w:bookmarkStart w:id="19" w:name="article_templetherapy_109"/>
+            <w:bookmarkStart w:id="15" w:name="article_templetherapy_109"/>
             <w:pPr>
               <w:spacing w:before="0" w:after="160" w:line="324" w:lineRule="auto"/>
             </w:pPr>
@@ -4797,7 +3980,7 @@
               </w:rPr>
               <w:t>8 апреля.</w:t>
             </w:r>
-            <w:bookmarkEnd w:id="19"/>
+            <w:bookmarkEnd w:id="15"/>
           </w:p>
           <w:p>
             <w:pPr>
@@ -4837,7 +4020,7 @@
         </w:tc>
         <w:tc>
           <w:tcPr>
-            <w:tcW w:type="dxa" w:w="5083"/>
+            <w:tcW w:type="dxa" w:w="5544"/>
             <w:tcMar>
               <w:top w:w="100" w:type="dxa"/>
               <w:start w:w="120" w:type="dxa"/>
@@ -4853,8 +4036,8 @@
             <w:r>
               <w:drawing>
                 <wp:inline xmlns:a="http://schemas.openxmlformats.org/drawingml/2006/main" xmlns:pic="http://schemas.openxmlformats.org/drawingml/2006/picture">
-                  <wp:extent cx="3200400" cy="3200400"/>
-                  <wp:docPr id="18" name="Picture 18"/>
+                  <wp:extent cx="3337560" cy="3337560"/>
+                  <wp:docPr id="15" name="Picture 15"/>
                   <wp:cNvGraphicFramePr>
                     <a:graphicFrameLocks noChangeAspect="1"/>
                   </wp:cNvGraphicFramePr>
@@ -4874,7 +4057,7 @@
                         <pic:spPr>
                           <a:xfrm>
                             <a:off x="0" y="0"/>
-                            <a:ext cx="3200400" cy="3200400"/>
+                            <a:ext cx="3337560" cy="3337560"/>
                           </a:xfrm>
                           <a:prstGeom prst="rect"/>
                         </pic:spPr>
@@ -5034,13 +4217,13 @@
         <w:tblLook w:firstColumn="1" w:firstRow="1" w:lastColumn="0" w:lastRow="0" w:noHBand="0" w:noVBand="1" w:val="04A0"/>
       </w:tblPr>
       <w:tblGrid>
-        <w:gridCol w:w="3456"/>
-        <w:gridCol w:w="5328"/>
+        <w:gridCol w:w="4392"/>
+        <w:gridCol w:w="5544"/>
       </w:tblGrid>
       <w:tr>
         <w:tc>
           <w:tcPr>
-            <w:tcW w:type="dxa" w:w="5083"/>
+            <w:tcW w:type="dxa" w:w="4392"/>
             <w:tcMar>
               <w:top w:w="100" w:type="dxa"/>
               <w:start w:w="120" w:type="dxa"/>
@@ -5049,7 +4232,7 @@
             </w:tcMar>
           </w:tcPr>
           <w:p>
-            <w:bookmarkStart w:id="20" w:name="article_templetherapy_110"/>
+            <w:bookmarkStart w:id="16" w:name="article_templetherapy_110"/>
             <w:pPr>
               <w:spacing w:before="0" w:after="160" w:line="324" w:lineRule="auto"/>
             </w:pPr>
@@ -5062,7 +4245,7 @@
               </w:rPr>
               <w:t>НАСТРОЙКА: ЛАМАТ (Эгрегор Майя).</w:t>
             </w:r>
-            <w:bookmarkEnd w:id="20"/>
+            <w:bookmarkEnd w:id="16"/>
           </w:p>
           <w:p>
             <w:pPr>
@@ -5102,7 +4285,7 @@
         </w:tc>
         <w:tc>
           <w:tcPr>
-            <w:tcW w:type="dxa" w:w="5083"/>
+            <w:tcW w:type="dxa" w:w="5544"/>
             <w:tcMar>
               <w:top w:w="100" w:type="dxa"/>
               <w:start w:w="120" w:type="dxa"/>
@@ -5118,8 +4301,8 @@
             <w:r>
               <w:drawing>
                 <wp:inline xmlns:a="http://schemas.openxmlformats.org/drawingml/2006/main" xmlns:pic="http://schemas.openxmlformats.org/drawingml/2006/picture">
-                  <wp:extent cx="3200400" cy="3200400"/>
-                  <wp:docPr id="19" name="Picture 19"/>
+                  <wp:extent cx="3337560" cy="3337560"/>
+                  <wp:docPr id="16" name="Picture 16"/>
                   <wp:cNvGraphicFramePr>
                     <a:graphicFrameLocks noChangeAspect="1"/>
                   </wp:cNvGraphicFramePr>
@@ -5139,7 +4322,7 @@
                         <pic:spPr>
                           <a:xfrm>
                             <a:off x="0" y="0"/>
-                            <a:ext cx="3200400" cy="3200400"/>
+                            <a:ext cx="3337560" cy="3337560"/>
                           </a:xfrm>
                           <a:prstGeom prst="rect"/>
                         </pic:spPr>
@@ -5265,13 +4448,13 @@
         <w:tblLook w:firstColumn="1" w:firstRow="1" w:lastColumn="0" w:lastRow="0" w:noHBand="0" w:noVBand="1" w:val="04A0"/>
       </w:tblPr>
       <w:tblGrid>
-        <w:gridCol w:w="3456"/>
-        <w:gridCol w:w="5328"/>
+        <w:gridCol w:w="4392"/>
+        <w:gridCol w:w="5544"/>
       </w:tblGrid>
       <w:tr>
         <w:tc>
           <w:tcPr>
-            <w:tcW w:type="dxa" w:w="5083"/>
+            <w:tcW w:type="dxa" w:w="4392"/>
             <w:tcMar>
               <w:top w:w="100" w:type="dxa"/>
               <w:start w:w="120" w:type="dxa"/>
@@ -5280,7 +4463,7 @@
             </w:tcMar>
           </w:tcPr>
           <w:p>
-            <w:bookmarkStart w:id="21" w:name="article_templetherapy_111"/>
+            <w:bookmarkStart w:id="17" w:name="article_templetherapy_111"/>
             <w:pPr>
               <w:spacing w:before="0" w:after="160" w:line="324" w:lineRule="auto"/>
             </w:pPr>
@@ -5293,7 +4476,7 @@
               </w:rPr>
               <w:t>9 апреля - день Луны.</w:t>
             </w:r>
-            <w:bookmarkEnd w:id="21"/>
+            <w:bookmarkEnd w:id="17"/>
           </w:p>
           <w:p>
             <w:pPr>
@@ -5333,7 +4516,7 @@
         </w:tc>
         <w:tc>
           <w:tcPr>
-            <w:tcW w:type="dxa" w:w="5083"/>
+            <w:tcW w:type="dxa" w:w="5544"/>
             <w:tcMar>
               <w:top w:w="100" w:type="dxa"/>
               <w:start w:w="120" w:type="dxa"/>
@@ -5349,8 +4532,8 @@
             <w:r>
               <w:drawing>
                 <wp:inline xmlns:a="http://schemas.openxmlformats.org/drawingml/2006/main" xmlns:pic="http://schemas.openxmlformats.org/drawingml/2006/picture">
-                  <wp:extent cx="3200400" cy="3200400"/>
-                  <wp:docPr id="20" name="Picture 20"/>
+                  <wp:extent cx="3337560" cy="3337560"/>
+                  <wp:docPr id="17" name="Picture 17"/>
                   <wp:cNvGraphicFramePr>
                     <a:graphicFrameLocks noChangeAspect="1"/>
                   </wp:cNvGraphicFramePr>
@@ -5370,7 +4553,7 @@
                         <pic:spPr>
                           <a:xfrm>
                             <a:off x="0" y="0"/>
-                            <a:ext cx="3200400" cy="3200400"/>
+                            <a:ext cx="3337560" cy="3337560"/>
                           </a:xfrm>
                           <a:prstGeom prst="rect"/>
                         </pic:spPr>
@@ -5528,13 +4711,13 @@
         <w:tblLook w:firstColumn="1" w:firstRow="1" w:lastColumn="0" w:lastRow="0" w:noHBand="0" w:noVBand="1" w:val="04A0"/>
       </w:tblPr>
       <w:tblGrid>
-        <w:gridCol w:w="3456"/>
-        <w:gridCol w:w="5328"/>
+        <w:gridCol w:w="4392"/>
+        <w:gridCol w:w="5544"/>
       </w:tblGrid>
       <w:tr>
         <w:tc>
           <w:tcPr>
-            <w:tcW w:type="dxa" w:w="5083"/>
+            <w:tcW w:type="dxa" w:w="4392"/>
             <w:tcMar>
               <w:top w:w="100" w:type="dxa"/>
               <w:start w:w="120" w:type="dxa"/>
@@ -5543,7 +4726,7 @@
             </w:tcMar>
           </w:tcPr>
           <w:p>
-            <w:bookmarkStart w:id="22" w:name="article_templetherapy_113"/>
+            <w:bookmarkStart w:id="18" w:name="article_templetherapy_113"/>
             <w:pPr>
               <w:spacing w:before="0" w:after="160" w:line="324" w:lineRule="auto"/>
             </w:pPr>
@@ -5556,7 +4739,7 @@
               </w:rPr>
               <w:t>11 апреля. День Мастера (Оьезьяны).</w:t>
             </w:r>
-            <w:bookmarkEnd w:id="22"/>
+            <w:bookmarkEnd w:id="18"/>
           </w:p>
           <w:p>
             <w:pPr>
@@ -5596,7 +4779,7 @@
         </w:tc>
         <w:tc>
           <w:tcPr>
-            <w:tcW w:type="dxa" w:w="5083"/>
+            <w:tcW w:type="dxa" w:w="5544"/>
             <w:tcMar>
               <w:top w:w="100" w:type="dxa"/>
               <w:start w:w="120" w:type="dxa"/>
@@ -5612,8 +4795,8 @@
             <w:r>
               <w:drawing>
                 <wp:inline xmlns:a="http://schemas.openxmlformats.org/drawingml/2006/main" xmlns:pic="http://schemas.openxmlformats.org/drawingml/2006/picture">
-                  <wp:extent cx="3200400" cy="3200400"/>
-                  <wp:docPr id="21" name="Picture 21"/>
+                  <wp:extent cx="3337560" cy="3337560"/>
+                  <wp:docPr id="18" name="Picture 18"/>
                   <wp:cNvGraphicFramePr>
                     <a:graphicFrameLocks noChangeAspect="1"/>
                   </wp:cNvGraphicFramePr>
@@ -5633,7 +4816,7 @@
                         <pic:spPr>
                           <a:xfrm>
                             <a:off x="0" y="0"/>
-                            <a:ext cx="3200400" cy="3200400"/>
+                            <a:ext cx="3337560" cy="3337560"/>
                           </a:xfrm>
                           <a:prstGeom prst="rect"/>
                         </pic:spPr>
@@ -5831,13 +5014,13 @@
         <w:tblLook w:firstColumn="1" w:firstRow="1" w:lastColumn="0" w:lastRow="0" w:noHBand="0" w:noVBand="1" w:val="04A0"/>
       </w:tblPr>
       <w:tblGrid>
-        <w:gridCol w:w="3456"/>
-        <w:gridCol w:w="5328"/>
+        <w:gridCol w:w="4392"/>
+        <w:gridCol w:w="5544"/>
       </w:tblGrid>
       <w:tr>
         <w:tc>
           <w:tcPr>
-            <w:tcW w:type="dxa" w:w="5083"/>
+            <w:tcW w:type="dxa" w:w="4392"/>
             <w:tcMar>
               <w:top w:w="100" w:type="dxa"/>
               <w:start w:w="120" w:type="dxa"/>
@@ -5846,7 +5029,7 @@
             </w:tcMar>
           </w:tcPr>
           <w:p>
-            <w:bookmarkStart w:id="23" w:name="article_templetherapy_117"/>
+            <w:bookmarkStart w:id="19" w:name="article_templetherapy_117"/>
             <w:pPr>
               <w:spacing w:before="0" w:after="160" w:line="324" w:lineRule="auto"/>
             </w:pPr>
@@ -5859,7 +5042,7 @@
               </w:rPr>
               <w:t>14 апреля - День Ягуара (Волшебника).</w:t>
             </w:r>
-            <w:bookmarkEnd w:id="23"/>
+            <w:bookmarkEnd w:id="19"/>
           </w:p>
           <w:p>
             <w:pPr>
@@ -5899,7 +5082,7 @@
         </w:tc>
         <w:tc>
           <w:tcPr>
-            <w:tcW w:type="dxa" w:w="5083"/>
+            <w:tcW w:type="dxa" w:w="5544"/>
             <w:tcMar>
               <w:top w:w="100" w:type="dxa"/>
               <w:start w:w="120" w:type="dxa"/>
@@ -5915,8 +5098,8 @@
             <w:r>
               <w:drawing>
                 <wp:inline xmlns:a="http://schemas.openxmlformats.org/drawingml/2006/main" xmlns:pic="http://schemas.openxmlformats.org/drawingml/2006/picture">
-                  <wp:extent cx="3200400" cy="3200400"/>
-                  <wp:docPr id="22" name="Picture 22"/>
+                  <wp:extent cx="3337560" cy="3337560"/>
+                  <wp:docPr id="19" name="Picture 19"/>
                   <wp:cNvGraphicFramePr>
                     <a:graphicFrameLocks noChangeAspect="1"/>
                   </wp:cNvGraphicFramePr>
@@ -5936,7 +5119,7 @@
                         <pic:spPr>
                           <a:xfrm>
                             <a:off x="0" y="0"/>
-                            <a:ext cx="3200400" cy="3200400"/>
+                            <a:ext cx="3337560" cy="3337560"/>
                           </a:xfrm>
                           <a:prstGeom prst="rect"/>
                         </pic:spPr>
@@ -6135,13 +5318,13 @@
         <w:tblLook w:firstColumn="1" w:firstRow="1" w:lastColumn="0" w:lastRow="0" w:noHBand="0" w:noVBand="1" w:val="04A0"/>
       </w:tblPr>
       <w:tblGrid>
-        <w:gridCol w:w="3456"/>
-        <w:gridCol w:w="5328"/>
+        <w:gridCol w:w="4392"/>
+        <w:gridCol w:w="5544"/>
       </w:tblGrid>
       <w:tr>
         <w:tc>
           <w:tcPr>
-            <w:tcW w:type="dxa" w:w="5083"/>
+            <w:tcW w:type="dxa" w:w="4392"/>
             <w:tcMar>
               <w:top w:w="100" w:type="dxa"/>
               <w:start w:w="120" w:type="dxa"/>
@@ -6150,7 +5333,7 @@
             </w:tcMar>
           </w:tcPr>
           <w:p>
-            <w:bookmarkStart w:id="24" w:name="article_templetherapy_119"/>
+            <w:bookmarkStart w:id="20" w:name="article_templetherapy_119"/>
             <w:pPr>
               <w:spacing w:before="0" w:after="160" w:line="324" w:lineRule="auto"/>
             </w:pPr>
@@ -6163,7 +5346,7 @@
               </w:rPr>
               <w:t>13 апреля - День Тростника.</w:t>
             </w:r>
-            <w:bookmarkEnd w:id="24"/>
+            <w:bookmarkEnd w:id="20"/>
           </w:p>
           <w:p>
             <w:pPr>
@@ -6203,7 +5386,7 @@
         </w:tc>
         <w:tc>
           <w:tcPr>
-            <w:tcW w:type="dxa" w:w="5083"/>
+            <w:tcW w:type="dxa" w:w="5544"/>
             <w:tcMar>
               <w:top w:w="100" w:type="dxa"/>
               <w:start w:w="120" w:type="dxa"/>
@@ -6219,8 +5402,8 @@
             <w:r>
               <w:drawing>
                 <wp:inline xmlns:a="http://schemas.openxmlformats.org/drawingml/2006/main" xmlns:pic="http://schemas.openxmlformats.org/drawingml/2006/picture">
-                  <wp:extent cx="3200400" cy="3200400"/>
-                  <wp:docPr id="23" name="Picture 23"/>
+                  <wp:extent cx="3337560" cy="3337560"/>
+                  <wp:docPr id="20" name="Picture 20"/>
                   <wp:cNvGraphicFramePr>
                     <a:graphicFrameLocks noChangeAspect="1"/>
                   </wp:cNvGraphicFramePr>
@@ -6240,7 +5423,7 @@
                         <pic:spPr>
                           <a:xfrm>
                             <a:off x="0" y="0"/>
-                            <a:ext cx="3200400" cy="3200400"/>
+                            <a:ext cx="3337560" cy="3337560"/>
                           </a:xfrm>
                           <a:prstGeom prst="rect"/>
                         </pic:spPr>
@@ -6384,13 +5567,13 @@
         <w:tblLook w:firstColumn="1" w:firstRow="1" w:lastColumn="0" w:lastRow="0" w:noHBand="0" w:noVBand="1" w:val="04A0"/>
       </w:tblPr>
       <w:tblGrid>
-        <w:gridCol w:w="3456"/>
-        <w:gridCol w:w="5328"/>
+        <w:gridCol w:w="4392"/>
+        <w:gridCol w:w="5544"/>
       </w:tblGrid>
       <w:tr>
         <w:tc>
           <w:tcPr>
-            <w:tcW w:type="dxa" w:w="5083"/>
+            <w:tcW w:type="dxa" w:w="4392"/>
             <w:tcMar>
               <w:top w:w="100" w:type="dxa"/>
               <w:start w:w="120" w:type="dxa"/>
@@ -6399,7 +5582,7 @@
             </w:tcMar>
           </w:tcPr>
           <w:p>
-            <w:bookmarkStart w:id="25" w:name="article_templetherapy_121"/>
+            <w:bookmarkStart w:id="21" w:name="article_templetherapy_121"/>
             <w:pPr>
               <w:spacing w:before="0" w:after="160" w:line="324" w:lineRule="auto"/>
             </w:pPr>
@@ -6412,7 +5595,7 @@
               </w:rPr>
               <w:t>Используй смелость и почувствуй свой путь через любые процессы, что кажутся сложными или некомфортными. Слушай сердце, небесный странник.</w:t>
             </w:r>
-            <w:bookmarkEnd w:id="25"/>
+            <w:bookmarkEnd w:id="21"/>
           </w:p>
           <w:p>
             <w:pPr>
@@ -6452,7 +5635,7 @@
         </w:tc>
         <w:tc>
           <w:tcPr>
-            <w:tcW w:type="dxa" w:w="5083"/>
+            <w:tcW w:type="dxa" w:w="5544"/>
             <w:tcMar>
               <w:top w:w="100" w:type="dxa"/>
               <w:start w:w="120" w:type="dxa"/>
@@ -6468,8 +5651,8 @@
             <w:r>
               <w:drawing>
                 <wp:inline xmlns:a="http://schemas.openxmlformats.org/drawingml/2006/main" xmlns:pic="http://schemas.openxmlformats.org/drawingml/2006/picture">
-                  <wp:extent cx="3200400" cy="3200400"/>
-                  <wp:docPr id="24" name="Picture 24"/>
+                  <wp:extent cx="3337560" cy="3337560"/>
+                  <wp:docPr id="21" name="Picture 21"/>
                   <wp:cNvGraphicFramePr>
                     <a:graphicFrameLocks noChangeAspect="1"/>
                   </wp:cNvGraphicFramePr>
@@ -6489,7 +5672,7 @@
                         <pic:spPr>
                           <a:xfrm>
                             <a:off x="0" y="0"/>
-                            <a:ext cx="3200400" cy="3200400"/>
+                            <a:ext cx="3337560" cy="3337560"/>
                           </a:xfrm>
                           <a:prstGeom prst="rect"/>
                         </pic:spPr>
@@ -6634,13 +5817,13 @@
         <w:tblLook w:firstColumn="1" w:firstRow="1" w:lastColumn="0" w:lastRow="0" w:noHBand="0" w:noVBand="1" w:val="04A0"/>
       </w:tblPr>
       <w:tblGrid>
-        <w:gridCol w:w="3456"/>
-        <w:gridCol w:w="5328"/>
+        <w:gridCol w:w="4392"/>
+        <w:gridCol w:w="5544"/>
       </w:tblGrid>
       <w:tr>
         <w:tc>
           <w:tcPr>
-            <w:tcW w:type="dxa" w:w="5083"/>
+            <w:tcW w:type="dxa" w:w="4392"/>
             <w:tcMar>
               <w:top w:w="100" w:type="dxa"/>
               <w:start w:w="120" w:type="dxa"/>
@@ -6649,7 +5832,7 @@
             </w:tcMar>
           </w:tcPr>
           <w:p>
-            <w:bookmarkStart w:id="26" w:name="article_templetherapy_122"/>
+            <w:bookmarkStart w:id="22" w:name="article_templetherapy_122"/>
             <w:pPr>
               <w:spacing w:before="0" w:after="160" w:line="324" w:lineRule="auto"/>
             </w:pPr>
@@ -6662,7 +5845,7 @@
               </w:rPr>
               <w:t>15 апреля - День Орла (шамана).</w:t>
             </w:r>
-            <w:bookmarkEnd w:id="26"/>
+            <w:bookmarkEnd w:id="22"/>
           </w:p>
           <w:p>
             <w:pPr>
@@ -6702,7 +5885,7 @@
         </w:tc>
         <w:tc>
           <w:tcPr>
-            <w:tcW w:type="dxa" w:w="5083"/>
+            <w:tcW w:type="dxa" w:w="5544"/>
             <w:tcMar>
               <w:top w:w="100" w:type="dxa"/>
               <w:start w:w="120" w:type="dxa"/>
@@ -6718,8 +5901,8 @@
             <w:r>
               <w:drawing>
                 <wp:inline xmlns:a="http://schemas.openxmlformats.org/drawingml/2006/main" xmlns:pic="http://schemas.openxmlformats.org/drawingml/2006/picture">
-                  <wp:extent cx="3200400" cy="3200400"/>
-                  <wp:docPr id="25" name="Picture 25"/>
+                  <wp:extent cx="3337560" cy="3337560"/>
+                  <wp:docPr id="22" name="Picture 22"/>
                   <wp:cNvGraphicFramePr>
                     <a:graphicFrameLocks noChangeAspect="1"/>
                   </wp:cNvGraphicFramePr>
@@ -6739,7 +5922,7 @@
                         <pic:spPr>
                           <a:xfrm>
                             <a:off x="0" y="0"/>
-                            <a:ext cx="3200400" cy="3200400"/>
+                            <a:ext cx="3337560" cy="3337560"/>
                           </a:xfrm>
                           <a:prstGeom prst="rect"/>
                         </pic:spPr>
@@ -6967,13 +6150,13 @@
         <w:tblLook w:firstColumn="1" w:firstRow="1" w:lastColumn="0" w:lastRow="0" w:noHBand="0" w:noVBand="1" w:val="04A0"/>
       </w:tblPr>
       <w:tblGrid>
-        <w:gridCol w:w="3456"/>
-        <w:gridCol w:w="5328"/>
+        <w:gridCol w:w="4392"/>
+        <w:gridCol w:w="5544"/>
       </w:tblGrid>
       <w:tr>
         <w:tc>
           <w:tcPr>
-            <w:tcW w:type="dxa" w:w="5083"/>
+            <w:tcW w:type="dxa" w:w="4392"/>
             <w:tcMar>
               <w:top w:w="100" w:type="dxa"/>
               <w:start w:w="120" w:type="dxa"/>
@@ -6982,7 +6165,7 @@
             </w:tcMar>
           </w:tcPr>
           <w:p>
-            <w:bookmarkStart w:id="27" w:name="article_templetherapy_124"/>
+            <w:bookmarkStart w:id="23" w:name="article_templetherapy_124"/>
             <w:pPr>
               <w:spacing w:before="0" w:after="160" w:line="324" w:lineRule="auto"/>
             </w:pPr>
@@ -6995,7 +6178,7 @@
               </w:rPr>
               <w:t>18 апреля. День ножа/ зеркала.</w:t>
             </w:r>
-            <w:bookmarkEnd w:id="27"/>
+            <w:bookmarkEnd w:id="23"/>
           </w:p>
           <w:p>
             <w:pPr>
@@ -7035,7 +6218,7 @@
         </w:tc>
         <w:tc>
           <w:tcPr>
-            <w:tcW w:type="dxa" w:w="5083"/>
+            <w:tcW w:type="dxa" w:w="5544"/>
             <w:tcMar>
               <w:top w:w="100" w:type="dxa"/>
               <w:start w:w="120" w:type="dxa"/>
@@ -7051,8 +6234,8 @@
             <w:r>
               <w:drawing>
                 <wp:inline xmlns:a="http://schemas.openxmlformats.org/drawingml/2006/main" xmlns:pic="http://schemas.openxmlformats.org/drawingml/2006/picture">
-                  <wp:extent cx="3200400" cy="3200400"/>
-                  <wp:docPr id="26" name="Picture 26"/>
+                  <wp:extent cx="3337560" cy="3337560"/>
+                  <wp:docPr id="23" name="Picture 23"/>
                   <wp:cNvGraphicFramePr>
                     <a:graphicFrameLocks noChangeAspect="1"/>
                   </wp:cNvGraphicFramePr>
@@ -7072,7 +6255,7 @@
                         <pic:spPr>
                           <a:xfrm>
                             <a:off x="0" y="0"/>
-                            <a:ext cx="3200400" cy="3200400"/>
+                            <a:ext cx="3337560" cy="3337560"/>
                           </a:xfrm>
                           <a:prstGeom prst="rect"/>
                         </pic:spPr>
@@ -7272,13 +6455,13 @@
         <w:tblLook w:firstColumn="1" w:firstRow="1" w:lastColumn="0" w:lastRow="0" w:noHBand="0" w:noVBand="1" w:val="04A0"/>
       </w:tblPr>
       <w:tblGrid>
-        <w:gridCol w:w="3456"/>
-        <w:gridCol w:w="5328"/>
+        <w:gridCol w:w="4392"/>
+        <w:gridCol w:w="5544"/>
       </w:tblGrid>
       <w:tr>
         <w:tc>
           <w:tcPr>
-            <w:tcW w:type="dxa" w:w="5083"/>
+            <w:tcW w:type="dxa" w:w="4392"/>
             <w:tcMar>
               <w:top w:w="100" w:type="dxa"/>
               <w:start w:w="120" w:type="dxa"/>
@@ -7287,7 +6470,7 @@
             </w:tcMar>
           </w:tcPr>
           <w:p>
-            <w:bookmarkStart w:id="28" w:name="article_templetherapy_125"/>
+            <w:bookmarkStart w:id="24" w:name="article_templetherapy_125"/>
             <w:pPr>
               <w:spacing w:before="0" w:after="160" w:line="324" w:lineRule="auto"/>
             </w:pPr>
@@ -7300,7 +6483,7 @@
               </w:rPr>
               <w:t>Я есть Эцнаб, зал зеркал.</w:t>
             </w:r>
-            <w:bookmarkEnd w:id="28"/>
+            <w:bookmarkEnd w:id="24"/>
           </w:p>
           <w:p>
             <w:pPr>
@@ -7340,7 +6523,7 @@
         </w:tc>
         <w:tc>
           <w:tcPr>
-            <w:tcW w:type="dxa" w:w="5083"/>
+            <w:tcW w:type="dxa" w:w="5544"/>
             <w:tcMar>
               <w:top w:w="100" w:type="dxa"/>
               <w:start w:w="120" w:type="dxa"/>
@@ -7356,8 +6539,8 @@
             <w:r>
               <w:drawing>
                 <wp:inline xmlns:a="http://schemas.openxmlformats.org/drawingml/2006/main" xmlns:pic="http://schemas.openxmlformats.org/drawingml/2006/picture">
-                  <wp:extent cx="3200400" cy="3200400"/>
-                  <wp:docPr id="27" name="Picture 27"/>
+                  <wp:extent cx="3337560" cy="3337560"/>
+                  <wp:docPr id="24" name="Picture 24"/>
                   <wp:cNvGraphicFramePr>
                     <a:graphicFrameLocks noChangeAspect="1"/>
                   </wp:cNvGraphicFramePr>
@@ -7377,7 +6560,7 @@
                         <pic:spPr>
                           <a:xfrm>
                             <a:off x="0" y="0"/>
-                            <a:ext cx="3200400" cy="3200400"/>
+                            <a:ext cx="3337560" cy="3337560"/>
                           </a:xfrm>
                           <a:prstGeom prst="rect"/>
                         </pic:spPr>
@@ -7559,13 +6742,13 @@
         <w:tblLook w:firstColumn="1" w:firstRow="1" w:lastColumn="0" w:lastRow="0" w:noHBand="0" w:noVBand="1" w:val="04A0"/>
       </w:tblPr>
       <w:tblGrid>
-        <w:gridCol w:w="3456"/>
-        <w:gridCol w:w="5328"/>
+        <w:gridCol w:w="4392"/>
+        <w:gridCol w:w="5544"/>
       </w:tblGrid>
       <w:tr>
         <w:tc>
           <w:tcPr>
-            <w:tcW w:type="dxa" w:w="5083"/>
+            <w:tcW w:type="dxa" w:w="4392"/>
             <w:tcMar>
               <w:top w:w="100" w:type="dxa"/>
               <w:start w:w="120" w:type="dxa"/>
@@ -7574,7 +6757,7 @@
             </w:tcMar>
           </w:tcPr>
           <w:p>
-            <w:bookmarkStart w:id="29" w:name="article_templetherapy_127"/>
+            <w:bookmarkStart w:id="25" w:name="article_templetherapy_127"/>
             <w:pPr>
               <w:spacing w:before="0" w:after="160" w:line="324" w:lineRule="auto"/>
             </w:pPr>
@@ -7587,7 +6770,7 @@
               </w:rPr>
               <w:t>19 апреля Кввак. День Молнии, Бури.</w:t>
             </w:r>
-            <w:bookmarkEnd w:id="29"/>
+            <w:bookmarkEnd w:id="25"/>
           </w:p>
           <w:p>
             <w:pPr>
@@ -7627,7 +6810,7 @@
         </w:tc>
         <w:tc>
           <w:tcPr>
-            <w:tcW w:type="dxa" w:w="5083"/>
+            <w:tcW w:type="dxa" w:w="5544"/>
             <w:tcMar>
               <w:top w:w="100" w:type="dxa"/>
               <w:start w:w="120" w:type="dxa"/>
@@ -7643,8 +6826,8 @@
             <w:r>
               <w:drawing>
                 <wp:inline xmlns:a="http://schemas.openxmlformats.org/drawingml/2006/main" xmlns:pic="http://schemas.openxmlformats.org/drawingml/2006/picture">
-                  <wp:extent cx="3200400" cy="3200400"/>
-                  <wp:docPr id="28" name="Picture 28"/>
+                  <wp:extent cx="3337560" cy="3337560"/>
+                  <wp:docPr id="25" name="Picture 25"/>
                   <wp:cNvGraphicFramePr>
                     <a:graphicFrameLocks noChangeAspect="1"/>
                   </wp:cNvGraphicFramePr>
@@ -7664,7 +6847,7 @@
                         <pic:spPr>
                           <a:xfrm>
                             <a:off x="0" y="0"/>
-                            <a:ext cx="3200400" cy="3200400"/>
+                            <a:ext cx="3337560" cy="3337560"/>
                           </a:xfrm>
                           <a:prstGeom prst="rect"/>
                         </pic:spPr>
@@ -7836,13 +7019,13 @@
         <w:tblLook w:firstColumn="1" w:firstRow="1" w:lastColumn="0" w:lastRow="0" w:noHBand="0" w:noVBand="1" w:val="04A0"/>
       </w:tblPr>
       <w:tblGrid>
-        <w:gridCol w:w="3456"/>
-        <w:gridCol w:w="5328"/>
+        <w:gridCol w:w="4392"/>
+        <w:gridCol w:w="5544"/>
       </w:tblGrid>
       <w:tr>
         <w:tc>
           <w:tcPr>
-            <w:tcW w:type="dxa" w:w="5083"/>
+            <w:tcW w:type="dxa" w:w="4392"/>
             <w:tcMar>
               <w:top w:w="100" w:type="dxa"/>
               <w:start w:w="120" w:type="dxa"/>
@@ -7851,7 +7034,7 @@
             </w:tcMar>
           </w:tcPr>
           <w:p>
-            <w:bookmarkStart w:id="30" w:name="article_templetherapy_128"/>
+            <w:bookmarkStart w:id="26" w:name="article_templetherapy_128"/>
             <w:pPr>
               <w:spacing w:before="0" w:after="160" w:line="324" w:lineRule="auto"/>
             </w:pPr>
@@ -7864,7 +7047,7 @@
               </w:rPr>
               <w:t>Ты пришёл к границе того, что ты знал о себе. Кавак манит тебя шагнуть в огонь, который изменит каждый уровень твоего существа. Осмелься шагнуть в неизвестное - и твои метаморфозы начнутся!</w:t>
             </w:r>
-            <w:bookmarkEnd w:id="30"/>
+            <w:bookmarkEnd w:id="26"/>
           </w:p>
           <w:p>
             <w:pPr>
@@ -7904,7 +7087,7 @@
         </w:tc>
         <w:tc>
           <w:tcPr>
-            <w:tcW w:type="dxa" w:w="5083"/>
+            <w:tcW w:type="dxa" w:w="5544"/>
             <w:tcMar>
               <w:top w:w="100" w:type="dxa"/>
               <w:start w:w="120" w:type="dxa"/>
@@ -7920,8 +7103,8 @@
             <w:r>
               <w:drawing>
                 <wp:inline xmlns:a="http://schemas.openxmlformats.org/drawingml/2006/main" xmlns:pic="http://schemas.openxmlformats.org/drawingml/2006/picture">
-                  <wp:extent cx="3200400" cy="3200400"/>
-                  <wp:docPr id="29" name="Picture 29"/>
+                  <wp:extent cx="3337560" cy="3337560"/>
+                  <wp:docPr id="26" name="Picture 26"/>
                   <wp:cNvGraphicFramePr>
                     <a:graphicFrameLocks noChangeAspect="1"/>
                   </wp:cNvGraphicFramePr>
@@ -7941,7 +7124,7 @@
                         <pic:spPr>
                           <a:xfrm>
                             <a:off x="0" y="0"/>
-                            <a:ext cx="3200400" cy="3200400"/>
+                            <a:ext cx="3337560" cy="3337560"/>
                           </a:xfrm>
                           <a:prstGeom prst="rect"/>
                         </pic:spPr>
@@ -8102,13 +7285,13 @@
         <w:tblLook w:firstColumn="1" w:firstRow="1" w:lastColumn="0" w:lastRow="0" w:noHBand="0" w:noVBand="1" w:val="04A0"/>
       </w:tblPr>
       <w:tblGrid>
-        <w:gridCol w:w="3456"/>
-        <w:gridCol w:w="5328"/>
+        <w:gridCol w:w="4392"/>
+        <w:gridCol w:w="5544"/>
       </w:tblGrid>
       <w:tr>
         <w:tc>
           <w:tcPr>
-            <w:tcW w:type="dxa" w:w="5083"/>
+            <w:tcW w:type="dxa" w:w="4392"/>
             <w:tcMar>
               <w:top w:w="100" w:type="dxa"/>
               <w:start w:w="120" w:type="dxa"/>
@@ -8117,7 +7300,7 @@
             </w:tcMar>
           </w:tcPr>
           <w:p>
-            <w:bookmarkStart w:id="31" w:name="article_templetherapy_129"/>
+            <w:bookmarkStart w:id="27" w:name="article_templetherapy_129"/>
             <w:pPr>
               <w:spacing w:before="0" w:after="160" w:line="324" w:lineRule="auto"/>
             </w:pPr>
@@ -8130,7 +7313,7 @@
               </w:rPr>
               <w:t>20 апреля. 20й знак - Ахау. Властелин. Владыка. Солнце.</w:t>
             </w:r>
-            <w:bookmarkEnd w:id="31"/>
+            <w:bookmarkEnd w:id="27"/>
           </w:p>
           <w:p>
             <w:pPr>
@@ -8170,7 +7353,7 @@
         </w:tc>
         <w:tc>
           <w:tcPr>
-            <w:tcW w:type="dxa" w:w="5083"/>
+            <w:tcW w:type="dxa" w:w="5544"/>
             <w:tcMar>
               <w:top w:w="100" w:type="dxa"/>
               <w:start w:w="120" w:type="dxa"/>
@@ -8186,8 +7369,8 @@
             <w:r>
               <w:drawing>
                 <wp:inline xmlns:a="http://schemas.openxmlformats.org/drawingml/2006/main" xmlns:pic="http://schemas.openxmlformats.org/drawingml/2006/picture">
-                  <wp:extent cx="3200400" cy="3200400"/>
-                  <wp:docPr id="30" name="Picture 30"/>
+                  <wp:extent cx="3337560" cy="3337560"/>
+                  <wp:docPr id="27" name="Picture 27"/>
                   <wp:cNvGraphicFramePr>
                     <a:graphicFrameLocks noChangeAspect="1"/>
                   </wp:cNvGraphicFramePr>
@@ -8207,7 +7390,7 @@
                         <pic:spPr>
                           <a:xfrm>
                             <a:off x="0" y="0"/>
-                            <a:ext cx="3200400" cy="3200400"/>
+                            <a:ext cx="3337560" cy="3337560"/>
                           </a:xfrm>
                           <a:prstGeom prst="rect"/>
                         </pic:spPr>
@@ -8401,13 +7584,13 @@
         <w:tblLook w:firstColumn="1" w:firstRow="1" w:lastColumn="0" w:lastRow="0" w:noHBand="0" w:noVBand="1" w:val="04A0"/>
       </w:tblPr>
       <w:tblGrid>
-        <w:gridCol w:w="3456"/>
-        <w:gridCol w:w="5328"/>
+        <w:gridCol w:w="4392"/>
+        <w:gridCol w:w="5544"/>
       </w:tblGrid>
       <w:tr>
         <w:tc>
           <w:tcPr>
-            <w:tcW w:type="dxa" w:w="5083"/>
+            <w:tcW w:type="dxa" w:w="4392"/>
             <w:tcMar>
               <w:top w:w="100" w:type="dxa"/>
               <w:start w:w="120" w:type="dxa"/>
@@ -8416,7 +7599,7 @@
             </w:tcMar>
           </w:tcPr>
           <w:p>
-            <w:bookmarkStart w:id="32" w:name="article_templetherapy_130"/>
+            <w:bookmarkStart w:id="28" w:name="article_templetherapy_130"/>
             <w:pPr>
               <w:spacing w:before="0" w:after="160" w:line="324" w:lineRule="auto"/>
             </w:pPr>
@@ -8429,7 +7612,7 @@
               </w:rPr>
               <w:t>Я есть вкус любовного нектара амброзии, напитывающегося через всё творение, как миллиарды звёзд, формирующих светящееся тело космического танцора, вращая Вселенные через время и пространство.</w:t>
             </w:r>
-            <w:bookmarkEnd w:id="32"/>
+            <w:bookmarkEnd w:id="28"/>
           </w:p>
           <w:p>
             <w:pPr>
@@ -8469,7 +7652,7 @@
         </w:tc>
         <w:tc>
           <w:tcPr>
-            <w:tcW w:type="dxa" w:w="5083"/>
+            <w:tcW w:type="dxa" w:w="5544"/>
             <w:tcMar>
               <w:top w:w="100" w:type="dxa"/>
               <w:start w:w="120" w:type="dxa"/>
@@ -8485,8 +7668,8 @@
             <w:r>
               <w:drawing>
                 <wp:inline xmlns:a="http://schemas.openxmlformats.org/drawingml/2006/main" xmlns:pic="http://schemas.openxmlformats.org/drawingml/2006/picture">
-                  <wp:extent cx="3200400" cy="3200400"/>
-                  <wp:docPr id="31" name="Picture 31"/>
+                  <wp:extent cx="3337560" cy="3337560"/>
+                  <wp:docPr id="28" name="Picture 28"/>
                   <wp:cNvGraphicFramePr>
                     <a:graphicFrameLocks noChangeAspect="1"/>
                   </wp:cNvGraphicFramePr>
@@ -8506,7 +7689,7 @@
                         <pic:spPr>
                           <a:xfrm>
                             <a:off x="0" y="0"/>
-                            <a:ext cx="3200400" cy="3200400"/>
+                            <a:ext cx="3337560" cy="3337560"/>
                           </a:xfrm>
                           <a:prstGeom prst="rect"/>
                         </pic:spPr>
@@ -8715,13 +7898,13 @@
         <w:tblLook w:firstColumn="1" w:firstRow="1" w:lastColumn="0" w:lastRow="0" w:noHBand="0" w:noVBand="1" w:val="04A0"/>
       </w:tblPr>
       <w:tblGrid>
-        <w:gridCol w:w="3456"/>
-        <w:gridCol w:w="5328"/>
+        <w:gridCol w:w="4392"/>
+        <w:gridCol w:w="5544"/>
       </w:tblGrid>
       <w:tr>
         <w:tc>
           <w:tcPr>
-            <w:tcW w:type="dxa" w:w="5083"/>
+            <w:tcW w:type="dxa" w:w="4392"/>
             <w:tcMar>
               <w:top w:w="100" w:type="dxa"/>
               <w:start w:w="120" w:type="dxa"/>
@@ -8730,7 +7913,7 @@
             </w:tcMar>
           </w:tcPr>
           <w:p>
-            <w:bookmarkStart w:id="33" w:name="article_templetherapy_132"/>
+            <w:bookmarkStart w:id="29" w:name="article_templetherapy_132"/>
             <w:pPr>
               <w:spacing w:before="0" w:after="160" w:line="324" w:lineRule="auto"/>
             </w:pPr>
@@ -8743,7 +7926,7 @@
               </w:rPr>
               <w:t>21 апреля - Имиш. Дракон. Крокодил. Древо Мира.</w:t>
             </w:r>
-            <w:bookmarkEnd w:id="33"/>
+            <w:bookmarkEnd w:id="29"/>
           </w:p>
           <w:p>
             <w:pPr>
@@ -8783,7 +7966,7 @@
         </w:tc>
         <w:tc>
           <w:tcPr>
-            <w:tcW w:type="dxa" w:w="5083"/>
+            <w:tcW w:type="dxa" w:w="5544"/>
             <w:tcMar>
               <w:top w:w="100" w:type="dxa"/>
               <w:start w:w="120" w:type="dxa"/>
@@ -8799,8 +7982,8 @@
             <w:r>
               <w:drawing>
                 <wp:inline xmlns:a="http://schemas.openxmlformats.org/drawingml/2006/main" xmlns:pic="http://schemas.openxmlformats.org/drawingml/2006/picture">
-                  <wp:extent cx="3200400" cy="3200400"/>
-                  <wp:docPr id="32" name="Picture 32"/>
+                  <wp:extent cx="3337560" cy="3337560"/>
+                  <wp:docPr id="29" name="Picture 29"/>
                   <wp:cNvGraphicFramePr>
                     <a:graphicFrameLocks noChangeAspect="1"/>
                   </wp:cNvGraphicFramePr>
@@ -8820,7 +8003,7 @@
                         <pic:spPr>
                           <a:xfrm>
                             <a:off x="0" y="0"/>
-                            <a:ext cx="3200400" cy="3200400"/>
+                            <a:ext cx="3337560" cy="3337560"/>
                           </a:xfrm>
                           <a:prstGeom prst="rect"/>
                         </pic:spPr>
@@ -8995,13 +8178,13 @@
         <w:tblLook w:firstColumn="1" w:firstRow="1" w:lastColumn="0" w:lastRow="0" w:noHBand="0" w:noVBand="1" w:val="04A0"/>
       </w:tblPr>
       <w:tblGrid>
-        <w:gridCol w:w="3456"/>
-        <w:gridCol w:w="5328"/>
+        <w:gridCol w:w="4392"/>
+        <w:gridCol w:w="5544"/>
       </w:tblGrid>
       <w:tr>
         <w:tc>
           <w:tcPr>
-            <w:tcW w:type="dxa" w:w="5083"/>
+            <w:tcW w:type="dxa" w:w="4392"/>
             <w:tcMar>
               <w:top w:w="100" w:type="dxa"/>
               <w:start w:w="120" w:type="dxa"/>
@@ -9010,7 +8193,7 @@
             </w:tcMar>
           </w:tcPr>
           <w:p>
-            <w:bookmarkStart w:id="34" w:name="article_templetherapy_133"/>
+            <w:bookmarkStart w:id="30" w:name="article_templetherapy_133"/>
             <w:pPr>
               <w:spacing w:before="0" w:after="160" w:line="324" w:lineRule="auto"/>
             </w:pPr>
@@ -9023,7 +8206,7 @@
               </w:rPr>
               <w:t>Я - Имиш, Первородная Мать.</w:t>
             </w:r>
-            <w:bookmarkEnd w:id="34"/>
+            <w:bookmarkEnd w:id="30"/>
           </w:p>
           <w:p>
             <w:pPr>
@@ -9063,7 +8246,7 @@
         </w:tc>
         <w:tc>
           <w:tcPr>
-            <w:tcW w:type="dxa" w:w="5083"/>
+            <w:tcW w:type="dxa" w:w="5544"/>
             <w:tcMar>
               <w:top w:w="100" w:type="dxa"/>
               <w:start w:w="120" w:type="dxa"/>
@@ -9079,8 +8262,8 @@
             <w:r>
               <w:drawing>
                 <wp:inline xmlns:a="http://schemas.openxmlformats.org/drawingml/2006/main" xmlns:pic="http://schemas.openxmlformats.org/drawingml/2006/picture">
-                  <wp:extent cx="3200400" cy="3200400"/>
-                  <wp:docPr id="33" name="Picture 33"/>
+                  <wp:extent cx="3337560" cy="3337560"/>
+                  <wp:docPr id="30" name="Picture 30"/>
                   <wp:cNvGraphicFramePr>
                     <a:graphicFrameLocks noChangeAspect="1"/>
                   </wp:cNvGraphicFramePr>
@@ -9100,7 +8283,7 @@
                         <pic:spPr>
                           <a:xfrm>
                             <a:off x="0" y="0"/>
-                            <a:ext cx="3200400" cy="3200400"/>
+                            <a:ext cx="3337560" cy="3337560"/>
                           </a:xfrm>
                           <a:prstGeom prst="rect"/>
                         </pic:spPr>
@@ -9263,13 +8446,13 @@
         <w:tblLook w:firstColumn="1" w:firstRow="1" w:lastColumn="0" w:lastRow="0" w:noHBand="0" w:noVBand="1" w:val="04A0"/>
       </w:tblPr>
       <w:tblGrid>
-        <w:gridCol w:w="3456"/>
-        <w:gridCol w:w="5328"/>
+        <w:gridCol w:w="4392"/>
+        <w:gridCol w:w="5544"/>
       </w:tblGrid>
       <w:tr>
         <w:tc>
           <w:tcPr>
-            <w:tcW w:type="dxa" w:w="5083"/>
+            <w:tcW w:type="dxa" w:w="4392"/>
             <w:tcMar>
               <w:top w:w="100" w:type="dxa"/>
               <w:start w:w="120" w:type="dxa"/>
@@ -9278,7 +8461,7 @@
             </w:tcMar>
           </w:tcPr>
           <w:p>
-            <w:bookmarkStart w:id="35" w:name="article_templetherapy_135"/>
+            <w:bookmarkStart w:id="31" w:name="article_templetherapy_135"/>
             <w:pPr>
               <w:spacing w:before="0" w:after="160" w:line="324" w:lineRule="auto"/>
             </w:pPr>
@@ -9291,7 +8474,7 @@
               </w:rPr>
               <w:t>22 апреля - ИК. Ветер.</w:t>
             </w:r>
-            <w:bookmarkEnd w:id="35"/>
+            <w:bookmarkEnd w:id="31"/>
           </w:p>
           <w:p>
             <w:pPr>
@@ -9331,7 +8514,7 @@
         </w:tc>
         <w:tc>
           <w:tcPr>
-            <w:tcW w:type="dxa" w:w="5083"/>
+            <w:tcW w:type="dxa" w:w="5544"/>
             <w:tcMar>
               <w:top w:w="100" w:type="dxa"/>
               <w:start w:w="120" w:type="dxa"/>
@@ -9347,8 +8530,8 @@
             <w:r>
               <w:drawing>
                 <wp:inline xmlns:a="http://schemas.openxmlformats.org/drawingml/2006/main" xmlns:pic="http://schemas.openxmlformats.org/drawingml/2006/picture">
-                  <wp:extent cx="3200400" cy="3200400"/>
-                  <wp:docPr id="34" name="Picture 34"/>
+                  <wp:extent cx="3337560" cy="3337560"/>
+                  <wp:docPr id="31" name="Picture 31"/>
                   <wp:cNvGraphicFramePr>
                     <a:graphicFrameLocks noChangeAspect="1"/>
                   </wp:cNvGraphicFramePr>
@@ -9368,7 +8551,7 @@
                         <pic:spPr>
                           <a:xfrm>
                             <a:off x="0" y="0"/>
-                            <a:ext cx="3200400" cy="3200400"/>
+                            <a:ext cx="3337560" cy="3337560"/>
                           </a:xfrm>
                           <a:prstGeom prst="rect"/>
                         </pic:spPr>
@@ -9558,13 +8741,13 @@
         <w:tblLook w:firstColumn="1" w:firstRow="1" w:lastColumn="0" w:lastRow="0" w:noHBand="0" w:noVBand="1" w:val="04A0"/>
       </w:tblPr>
       <w:tblGrid>
-        <w:gridCol w:w="3456"/>
-        <w:gridCol w:w="5328"/>
+        <w:gridCol w:w="4392"/>
+        <w:gridCol w:w="5544"/>
       </w:tblGrid>
       <w:tr>
         <w:tc>
           <w:tcPr>
-            <w:tcW w:type="dxa" w:w="5083"/>
+            <w:tcW w:type="dxa" w:w="4392"/>
             <w:tcMar>
               <w:top w:w="100" w:type="dxa"/>
               <w:start w:w="120" w:type="dxa"/>
@@ -9573,7 +8756,7 @@
             </w:tcMar>
           </w:tcPr>
           <w:p>
-            <w:bookmarkStart w:id="36" w:name="article_templetherapy_136"/>
+            <w:bookmarkStart w:id="32" w:name="article_templetherapy_136"/>
             <w:pPr>
               <w:spacing w:before="0" w:after="160" w:line="324" w:lineRule="auto"/>
             </w:pPr>
@@ -9586,7 +8769,7 @@
               </w:rPr>
               <w:t>Вдохните глубоко. Я зажигаю очертания твоего потенциала, я отражаю могущество твоего присутствия. Я - частота невидимых сил, через которую в данный момент реальность происходит.</w:t>
             </w:r>
-            <w:bookmarkEnd w:id="36"/>
+            <w:bookmarkEnd w:id="32"/>
           </w:p>
           <w:p>
             <w:pPr>
@@ -9626,7 +8809,7 @@
         </w:tc>
         <w:tc>
           <w:tcPr>
-            <w:tcW w:type="dxa" w:w="5083"/>
+            <w:tcW w:type="dxa" w:w="5544"/>
             <w:tcMar>
               <w:top w:w="100" w:type="dxa"/>
               <w:start w:w="120" w:type="dxa"/>
@@ -9642,8 +8825,8 @@
             <w:r>
               <w:drawing>
                 <wp:inline xmlns:a="http://schemas.openxmlformats.org/drawingml/2006/main" xmlns:pic="http://schemas.openxmlformats.org/drawingml/2006/picture">
-                  <wp:extent cx="3200400" cy="3200400"/>
-                  <wp:docPr id="35" name="Picture 35"/>
+                  <wp:extent cx="3337560" cy="3337560"/>
+                  <wp:docPr id="32" name="Picture 32"/>
                   <wp:cNvGraphicFramePr>
                     <a:graphicFrameLocks noChangeAspect="1"/>
                   </wp:cNvGraphicFramePr>
@@ -9663,7 +8846,7 @@
                         <pic:spPr>
                           <a:xfrm>
                             <a:off x="0" y="0"/>
-                            <a:ext cx="3200400" cy="3200400"/>
+                            <a:ext cx="3337560" cy="3337560"/>
                           </a:xfrm>
                           <a:prstGeom prst="rect"/>
                         </pic:spPr>
@@ -9846,13 +9029,13 @@
         <w:tblLook w:firstColumn="1" w:firstRow="1" w:lastColumn="0" w:lastRow="0" w:noHBand="0" w:noVBand="1" w:val="04A0"/>
       </w:tblPr>
       <w:tblGrid>
-        <w:gridCol w:w="3456"/>
-        <w:gridCol w:w="5328"/>
+        <w:gridCol w:w="4392"/>
+        <w:gridCol w:w="5544"/>
       </w:tblGrid>
       <w:tr>
         <w:tc>
           <w:tcPr>
-            <w:tcW w:type="dxa" w:w="5083"/>
+            <w:tcW w:type="dxa" w:w="4392"/>
             <w:tcMar>
               <w:top w:w="100" w:type="dxa"/>
               <w:start w:w="120" w:type="dxa"/>
@@ -9861,7 +9044,7 @@
             </w:tcMar>
           </w:tcPr>
           <w:p>
-            <w:bookmarkStart w:id="37" w:name="article_templetherapy_143"/>
+            <w:bookmarkStart w:id="33" w:name="article_templetherapy_143"/>
             <w:pPr>
               <w:spacing w:before="0" w:after="160" w:line="324" w:lineRule="auto"/>
             </w:pPr>
@@ -9874,7 +9057,7 @@
               </w:rPr>
               <w:t>23 апреля. День тьмы, ночи, сна.</w:t>
             </w:r>
-            <w:bookmarkEnd w:id="37"/>
+            <w:bookmarkEnd w:id="33"/>
           </w:p>
           <w:p>
             <w:pPr>
@@ -9914,7 +9097,7 @@
         </w:tc>
         <w:tc>
           <w:tcPr>
-            <w:tcW w:type="dxa" w:w="5083"/>
+            <w:tcW w:type="dxa" w:w="5544"/>
             <w:tcMar>
               <w:top w:w="100" w:type="dxa"/>
               <w:start w:w="120" w:type="dxa"/>
@@ -9930,8 +9113,8 @@
             <w:r>
               <w:drawing>
                 <wp:inline xmlns:a="http://schemas.openxmlformats.org/drawingml/2006/main" xmlns:pic="http://schemas.openxmlformats.org/drawingml/2006/picture">
-                  <wp:extent cx="3200400" cy="2471420"/>
-                  <wp:docPr id="36" name="Picture 36"/>
+                  <wp:extent cx="3337560" cy="2577338"/>
+                  <wp:docPr id="33" name="Picture 33"/>
                   <wp:cNvGraphicFramePr>
                     <a:graphicFrameLocks noChangeAspect="1"/>
                   </wp:cNvGraphicFramePr>
@@ -9943,7 +9126,7 @@
                           <pic:cNvPicPr/>
                         </pic:nvPicPr>
                         <pic:blipFill>
-                          <a:blip r:embed="rId25"/>
+                          <a:blip r:embed="rId22"/>
                           <a:stretch>
                             <a:fillRect/>
                           </a:stretch>
@@ -9951,7 +9134,7 @@
                         <pic:spPr>
                           <a:xfrm>
                             <a:off x="0" y="0"/>
-                            <a:ext cx="3200400" cy="2471420"/>
+                            <a:ext cx="3337560" cy="2577338"/>
                           </a:xfrm>
                           <a:prstGeom prst="rect"/>
                         </pic:spPr>
@@ -10053,13 +9236,13 @@
         <w:tblLook w:firstColumn="1" w:firstRow="1" w:lastColumn="0" w:lastRow="0" w:noHBand="0" w:noVBand="1" w:val="04A0"/>
       </w:tblPr>
       <w:tblGrid>
-        <w:gridCol w:w="3456"/>
-        <w:gridCol w:w="5328"/>
+        <w:gridCol w:w="4392"/>
+        <w:gridCol w:w="5544"/>
       </w:tblGrid>
       <w:tr>
         <w:tc>
           <w:tcPr>
-            <w:tcW w:type="dxa" w:w="5083"/>
+            <w:tcW w:type="dxa" w:w="4392"/>
             <w:tcMar>
               <w:top w:w="100" w:type="dxa"/>
               <w:start w:w="120" w:type="dxa"/>
@@ -10068,7 +9251,7 @@
             </w:tcMar>
           </w:tcPr>
           <w:p>
-            <w:bookmarkStart w:id="38" w:name="article_templetherapy_146"/>
+            <w:bookmarkStart w:id="34" w:name="article_templetherapy_146"/>
             <w:pPr>
               <w:spacing w:before="0" w:after="160" w:line="324" w:lineRule="auto"/>
             </w:pPr>
@@ -10081,7 +9264,7 @@
               </w:rPr>
               <w:t>Люди Ночи, наделенные «телесной молнией», молнией в крови, могут быть превосходными шаманами и прорицателями. Киче-майя считают, что они должны странствовать по иным мирам в поисках мудрости.</w:t>
             </w:r>
-            <w:bookmarkEnd w:id="38"/>
+            <w:bookmarkEnd w:id="34"/>
           </w:p>
           <w:p>
             <w:pPr>
@@ -10121,7 +9304,7 @@
         </w:tc>
         <w:tc>
           <w:tcPr>
-            <w:tcW w:type="dxa" w:w="5083"/>
+            <w:tcW w:type="dxa" w:w="5544"/>
             <w:tcMar>
               <w:top w:w="100" w:type="dxa"/>
               <w:start w:w="120" w:type="dxa"/>
@@ -10137,8 +9320,8 @@
             <w:r>
               <w:drawing>
                 <wp:inline xmlns:a="http://schemas.openxmlformats.org/drawingml/2006/main" xmlns:pic="http://schemas.openxmlformats.org/drawingml/2006/picture">
-                  <wp:extent cx="3200400" cy="3200400"/>
-                  <wp:docPr id="37" name="Picture 37"/>
+                  <wp:extent cx="3337560" cy="3337560"/>
+                  <wp:docPr id="34" name="Picture 34"/>
                   <wp:cNvGraphicFramePr>
                     <a:graphicFrameLocks noChangeAspect="1"/>
                   </wp:cNvGraphicFramePr>
@@ -10158,7 +9341,7 @@
                         <pic:spPr>
                           <a:xfrm>
                             <a:off x="0" y="0"/>
-                            <a:ext cx="3200400" cy="3200400"/>
+                            <a:ext cx="3337560" cy="3337560"/>
                           </a:xfrm>
                           <a:prstGeom prst="rect"/>
                         </pic:spPr>
@@ -10236,13 +9419,13 @@
         <w:tblLook w:firstColumn="1" w:firstRow="1" w:lastColumn="0" w:lastRow="0" w:noHBand="0" w:noVBand="1" w:val="04A0"/>
       </w:tblPr>
       <w:tblGrid>
-        <w:gridCol w:w="3456"/>
-        <w:gridCol w:w="5328"/>
+        <w:gridCol w:w="4392"/>
+        <w:gridCol w:w="5544"/>
       </w:tblGrid>
       <w:tr>
         <w:tc>
           <w:tcPr>
-            <w:tcW w:type="dxa" w:w="5083"/>
+            <w:tcW w:type="dxa" w:w="4392"/>
             <w:tcMar>
               <w:top w:w="100" w:type="dxa"/>
               <w:start w:w="120" w:type="dxa"/>
@@ -10251,7 +9434,7 @@
             </w:tcMar>
           </w:tcPr>
           <w:p>
-            <w:bookmarkStart w:id="39" w:name="article_templetherapy_147"/>
+            <w:bookmarkStart w:id="35" w:name="article_templetherapy_147"/>
             <w:pPr>
               <w:spacing w:before="0" w:after="160" w:line="324" w:lineRule="auto"/>
             </w:pPr>
@@ -10264,7 +9447,7 @@
               </w:rPr>
               <w:t>НАСТРОЙКА. АКБАЛЬ. ЭГРЕГОР МАЙЯ.</w:t>
             </w:r>
-            <w:bookmarkEnd w:id="39"/>
+            <w:bookmarkEnd w:id="35"/>
           </w:p>
           <w:p>
             <w:pPr>
@@ -10304,7 +9487,7 @@
         </w:tc>
         <w:tc>
           <w:tcPr>
-            <w:tcW w:type="dxa" w:w="5083"/>
+            <w:tcW w:type="dxa" w:w="5544"/>
             <w:tcMar>
               <w:top w:w="100" w:type="dxa"/>
               <w:start w:w="120" w:type="dxa"/>
@@ -10320,8 +9503,8 @@
             <w:r>
               <w:drawing>
                 <wp:inline xmlns:a="http://schemas.openxmlformats.org/drawingml/2006/main" xmlns:pic="http://schemas.openxmlformats.org/drawingml/2006/picture">
-                  <wp:extent cx="3200400" cy="3200400"/>
-                  <wp:docPr id="38" name="Picture 38"/>
+                  <wp:extent cx="3337560" cy="3337560"/>
+                  <wp:docPr id="35" name="Picture 35"/>
                   <wp:cNvGraphicFramePr>
                     <a:graphicFrameLocks noChangeAspect="1"/>
                   </wp:cNvGraphicFramePr>
@@ -10341,7 +9524,7 @@
                         <pic:spPr>
                           <a:xfrm>
                             <a:off x="0" y="0"/>
-                            <a:ext cx="3200400" cy="3200400"/>
+                            <a:ext cx="3337560" cy="3337560"/>
                           </a:xfrm>
                           <a:prstGeom prst="rect"/>
                         </pic:spPr>
@@ -10498,13 +9681,13 @@
         <w:tblLook w:firstColumn="1" w:firstRow="1" w:lastColumn="0" w:lastRow="0" w:noHBand="0" w:noVBand="1" w:val="04A0"/>
       </w:tblPr>
       <w:tblGrid>
-        <w:gridCol w:w="3456"/>
-        <w:gridCol w:w="5328"/>
+        <w:gridCol w:w="4392"/>
+        <w:gridCol w:w="5544"/>
       </w:tblGrid>
       <w:tr>
         <w:tc>
           <w:tcPr>
-            <w:tcW w:type="dxa" w:w="5083"/>
+            <w:tcW w:type="dxa" w:w="4392"/>
             <w:tcMar>
               <w:top w:w="100" w:type="dxa"/>
               <w:start w:w="120" w:type="dxa"/>
@@ -10513,7 +9696,7 @@
             </w:tcMar>
           </w:tcPr>
           <w:p>
-            <w:bookmarkStart w:id="40" w:name="article_templetherapy_149"/>
+            <w:bookmarkStart w:id="36" w:name="article_templetherapy_149"/>
             <w:pPr>
               <w:spacing w:before="0" w:after="160" w:line="324" w:lineRule="auto"/>
             </w:pPr>
@@ -10526,7 +9709,7 @@
               </w:rPr>
               <w:t>24 апреля. Время Возрождения. КАН.</w:t>
             </w:r>
-            <w:bookmarkEnd w:id="40"/>
+            <w:bookmarkEnd w:id="36"/>
           </w:p>
           <w:p>
             <w:pPr>
@@ -10566,7 +9749,7 @@
         </w:tc>
         <w:tc>
           <w:tcPr>
-            <w:tcW w:type="dxa" w:w="5083"/>
+            <w:tcW w:type="dxa" w:w="5544"/>
             <w:tcMar>
               <w:top w:w="100" w:type="dxa"/>
               <w:start w:w="120" w:type="dxa"/>
@@ -10582,8 +9765,8 @@
             <w:r>
               <w:drawing>
                 <wp:inline xmlns:a="http://schemas.openxmlformats.org/drawingml/2006/main" xmlns:pic="http://schemas.openxmlformats.org/drawingml/2006/picture">
-                  <wp:extent cx="3200400" cy="3200400"/>
-                  <wp:docPr id="39" name="Picture 39"/>
+                  <wp:extent cx="3337560" cy="3337560"/>
+                  <wp:docPr id="36" name="Picture 36"/>
                   <wp:cNvGraphicFramePr>
                     <a:graphicFrameLocks noChangeAspect="1"/>
                   </wp:cNvGraphicFramePr>
@@ -10603,7 +9786,7 @@
                         <pic:spPr>
                           <a:xfrm>
                             <a:off x="0" y="0"/>
-                            <a:ext cx="3200400" cy="3200400"/>
+                            <a:ext cx="3337560" cy="3337560"/>
                           </a:xfrm>
                           <a:prstGeom prst="rect"/>
                         </pic:spPr>
@@ -10768,13 +9951,13 @@
         <w:tblLook w:firstColumn="1" w:firstRow="1" w:lastColumn="0" w:lastRow="0" w:noHBand="0" w:noVBand="1" w:val="04A0"/>
       </w:tblPr>
       <w:tblGrid>
-        <w:gridCol w:w="3456"/>
-        <w:gridCol w:w="5328"/>
+        <w:gridCol w:w="4392"/>
+        <w:gridCol w:w="5544"/>
       </w:tblGrid>
       <w:tr>
         <w:tc>
           <w:tcPr>
-            <w:tcW w:type="dxa" w:w="5083"/>
+            <w:tcW w:type="dxa" w:w="4392"/>
             <w:tcMar>
               <w:top w:w="100" w:type="dxa"/>
               <w:start w:w="120" w:type="dxa"/>
@@ -10783,7 +9966,7 @@
             </w:tcMar>
           </w:tcPr>
           <w:p>
-            <w:bookmarkStart w:id="41" w:name="article_templetherapy_151"/>
+            <w:bookmarkStart w:id="37" w:name="article_templetherapy_151"/>
             <w:pPr>
               <w:spacing w:before="0" w:after="160" w:line="324" w:lineRule="auto"/>
             </w:pPr>
@@ -10796,7 +9979,7 @@
               </w:rPr>
               <w:t>ПРОРАБОТКА ТЕНИ:</w:t>
             </w:r>
-            <w:bookmarkEnd w:id="41"/>
+            <w:bookmarkEnd w:id="37"/>
           </w:p>
           <w:p>
             <w:pPr>
@@ -10836,7 +10019,7 @@
         </w:tc>
         <w:tc>
           <w:tcPr>
-            <w:tcW w:type="dxa" w:w="5083"/>
+            <w:tcW w:type="dxa" w:w="5544"/>
             <w:tcMar>
               <w:top w:w="100" w:type="dxa"/>
               <w:start w:w="120" w:type="dxa"/>
@@ -10852,8 +10035,8 @@
             <w:r>
               <w:drawing>
                 <wp:inline xmlns:a="http://schemas.openxmlformats.org/drawingml/2006/main" xmlns:pic="http://schemas.openxmlformats.org/drawingml/2006/picture">
-                  <wp:extent cx="3200400" cy="3200400"/>
-                  <wp:docPr id="40" name="Picture 40"/>
+                  <wp:extent cx="3337560" cy="3337560"/>
+                  <wp:docPr id="37" name="Picture 37"/>
                   <wp:cNvGraphicFramePr>
                     <a:graphicFrameLocks noChangeAspect="1"/>
                   </wp:cNvGraphicFramePr>
@@ -10873,7 +10056,7 @@
                         <pic:spPr>
                           <a:xfrm>
                             <a:off x="0" y="0"/>
-                            <a:ext cx="3200400" cy="3200400"/>
+                            <a:ext cx="3337560" cy="3337560"/>
                           </a:xfrm>
                           <a:prstGeom prst="rect"/>
                         </pic:spPr>
@@ -11043,13 +10226,13 @@
         <w:tblLook w:firstColumn="1" w:firstRow="1" w:lastColumn="0" w:lastRow="0" w:noHBand="0" w:noVBand="1" w:val="04A0"/>
       </w:tblPr>
       <w:tblGrid>
-        <w:gridCol w:w="3456"/>
-        <w:gridCol w:w="5328"/>
+        <w:gridCol w:w="4392"/>
+        <w:gridCol w:w="5544"/>
       </w:tblGrid>
       <w:tr>
         <w:tc>
           <w:tcPr>
-            <w:tcW w:type="dxa" w:w="5083"/>
+            <w:tcW w:type="dxa" w:w="4392"/>
             <w:tcMar>
               <w:top w:w="100" w:type="dxa"/>
               <w:start w:w="120" w:type="dxa"/>
@@ -11058,7 +10241,7 @@
             </w:tcMar>
           </w:tcPr>
           <w:p>
-            <w:bookmarkStart w:id="42" w:name="article_templetherapy_154"/>
+            <w:bookmarkStart w:id="38" w:name="article_templetherapy_154"/>
             <w:pPr>
               <w:spacing w:before="0" w:after="160" w:line="324" w:lineRule="auto"/>
             </w:pPr>
@@ -11071,7 +10254,7 @@
               </w:rPr>
               <w:t>25 апреля - День Кетцалькоатля.</w:t>
             </w:r>
-            <w:bookmarkEnd w:id="42"/>
+            <w:bookmarkEnd w:id="38"/>
           </w:p>
           <w:p>
             <w:pPr>
@@ -11111,7 +10294,7 @@
         </w:tc>
         <w:tc>
           <w:tcPr>
-            <w:tcW w:type="dxa" w:w="5083"/>
+            <w:tcW w:type="dxa" w:w="5544"/>
             <w:tcMar>
               <w:top w:w="100" w:type="dxa"/>
               <w:start w:w="120" w:type="dxa"/>
@@ -11127,8 +10310,8 @@
             <w:r>
               <w:drawing>
                 <wp:inline xmlns:a="http://schemas.openxmlformats.org/drawingml/2006/main" xmlns:pic="http://schemas.openxmlformats.org/drawingml/2006/picture">
-                  <wp:extent cx="3200400" cy="4480560"/>
-                  <wp:docPr id="41" name="Picture 41"/>
+                  <wp:extent cx="3337560" cy="4672584"/>
+                  <wp:docPr id="38" name="Picture 38"/>
                   <wp:cNvGraphicFramePr>
                     <a:graphicFrameLocks noChangeAspect="1"/>
                   </wp:cNvGraphicFramePr>
@@ -11140,7 +10323,7 @@
                           <pic:cNvPicPr/>
                         </pic:nvPicPr>
                         <pic:blipFill>
-                          <a:blip r:embed="rId26"/>
+                          <a:blip r:embed="rId23"/>
                           <a:stretch>
                             <a:fillRect/>
                           </a:stretch>
@@ -11148,7 +10331,7 @@
                         <pic:spPr>
                           <a:xfrm>
                             <a:off x="0" y="0"/>
-                            <a:ext cx="3200400" cy="4480560"/>
+                            <a:ext cx="3337560" cy="4672584"/>
                           </a:xfrm>
                           <a:prstGeom prst="rect"/>
                         </pic:spPr>
@@ -11245,13 +10428,13 @@
         <w:tblLook w:firstColumn="1" w:firstRow="1" w:lastColumn="0" w:lastRow="0" w:noHBand="0" w:noVBand="1" w:val="04A0"/>
       </w:tblPr>
       <w:tblGrid>
-        <w:gridCol w:w="3456"/>
-        <w:gridCol w:w="5328"/>
+        <w:gridCol w:w="4392"/>
+        <w:gridCol w:w="5544"/>
       </w:tblGrid>
       <w:tr>
         <w:tc>
           <w:tcPr>
-            <w:tcW w:type="dxa" w:w="5083"/>
+            <w:tcW w:type="dxa" w:w="4392"/>
             <w:tcMar>
               <w:top w:w="100" w:type="dxa"/>
               <w:start w:w="120" w:type="dxa"/>
@@ -11260,7 +10443,7 @@
             </w:tcMar>
           </w:tcPr>
           <w:p>
-            <w:bookmarkStart w:id="43" w:name="article_templetherapy_156"/>
+            <w:bookmarkStart w:id="39" w:name="article_templetherapy_156"/>
             <w:pPr>
               <w:spacing w:before="0" w:after="160" w:line="324" w:lineRule="auto"/>
             </w:pPr>
@@ -11273,7 +10456,7 @@
               </w:rPr>
               <w:t>Почувствуйте новые способы поведения, что принесут вам больше жизненной силы, спонтанности и приятных открытий в вашу жизнь. Если вы выбрали Чикчан, вас просят взглянуть на проблемы сексуальности и интимности. Выбирая этот звездный иероглиф, предполагается, что вы желаете поделиться вашим глубинным состоянием себя и, что вы стремитесь к глубинной связи и интимности.</w:t>
             </w:r>
-            <w:bookmarkEnd w:id="43"/>
+            <w:bookmarkEnd w:id="39"/>
           </w:p>
           <w:p>
             <w:pPr>
@@ -11313,7 +10496,7 @@
         </w:tc>
         <w:tc>
           <w:tcPr>
-            <w:tcW w:type="dxa" w:w="5083"/>
+            <w:tcW w:type="dxa" w:w="5544"/>
             <w:tcMar>
               <w:top w:w="100" w:type="dxa"/>
               <w:start w:w="120" w:type="dxa"/>
@@ -11329,8 +10512,8 @@
             <w:r>
               <w:drawing>
                 <wp:inline xmlns:a="http://schemas.openxmlformats.org/drawingml/2006/main" xmlns:pic="http://schemas.openxmlformats.org/drawingml/2006/picture">
-                  <wp:extent cx="3200400" cy="3200400"/>
-                  <wp:docPr id="42" name="Picture 42"/>
+                  <wp:extent cx="3337560" cy="3337560"/>
+                  <wp:docPr id="39" name="Picture 39"/>
                   <wp:cNvGraphicFramePr>
                     <a:graphicFrameLocks noChangeAspect="1"/>
                   </wp:cNvGraphicFramePr>
@@ -11350,7 +10533,7 @@
                         <pic:spPr>
                           <a:xfrm>
                             <a:off x="0" y="0"/>
-                            <a:ext cx="3200400" cy="3200400"/>
+                            <a:ext cx="3337560" cy="3337560"/>
                           </a:xfrm>
                           <a:prstGeom prst="rect"/>
                         </pic:spPr>
@@ -11475,13 +10658,13 @@
         <w:tblLook w:firstColumn="1" w:firstRow="1" w:lastColumn="0" w:lastRow="0" w:noHBand="0" w:noVBand="1" w:val="04A0"/>
       </w:tblPr>
       <w:tblGrid>
-        <w:gridCol w:w="3456"/>
-        <w:gridCol w:w="5328"/>
+        <w:gridCol w:w="4392"/>
+        <w:gridCol w:w="5544"/>
       </w:tblGrid>
       <w:tr>
         <w:tc>
           <w:tcPr>
-            <w:tcW w:type="dxa" w:w="5083"/>
+            <w:tcW w:type="dxa" w:w="4392"/>
             <w:tcMar>
               <w:top w:w="100" w:type="dxa"/>
               <w:start w:w="120" w:type="dxa"/>
@@ -11490,7 +10673,7 @@
             </w:tcMar>
           </w:tcPr>
           <w:p>
-            <w:bookmarkStart w:id="44" w:name="article_templetherapy_158"/>
+            <w:bookmarkStart w:id="40" w:name="article_templetherapy_158"/>
             <w:pPr>
               <w:spacing w:before="0" w:after="160" w:line="324" w:lineRule="auto"/>
             </w:pPr>
@@ -11503,7 +10686,7 @@
               </w:rPr>
               <w:t>Простите себя. Простите других. Отпустите. Сдайтесь тому, что ограничивает Вас. Встретьте то, чему Вы сопротивляетесь. Опыт любой потери учит, что всегда можно всё исправить. Через Ваше устремление пройти тёмным лесом озарения и откровения естественно придут.</w:t>
             </w:r>
-            <w:bookmarkEnd w:id="44"/>
+            <w:bookmarkEnd w:id="40"/>
           </w:p>
           <w:p>
             <w:pPr>
@@ -11543,7 +10726,7 @@
         </w:tc>
         <w:tc>
           <w:tcPr>
-            <w:tcW w:type="dxa" w:w="5083"/>
+            <w:tcW w:type="dxa" w:w="5544"/>
             <w:tcMar>
               <w:top w:w="100" w:type="dxa"/>
               <w:start w:w="120" w:type="dxa"/>
@@ -11559,8 +10742,8 @@
             <w:r>
               <w:drawing>
                 <wp:inline xmlns:a="http://schemas.openxmlformats.org/drawingml/2006/main" xmlns:pic="http://schemas.openxmlformats.org/drawingml/2006/picture">
-                  <wp:extent cx="3200400" cy="3200400"/>
-                  <wp:docPr id="43" name="Picture 43"/>
+                  <wp:extent cx="3337560" cy="3337560"/>
+                  <wp:docPr id="40" name="Picture 40"/>
                   <wp:cNvGraphicFramePr>
                     <a:graphicFrameLocks noChangeAspect="1"/>
                   </wp:cNvGraphicFramePr>
@@ -11580,7 +10763,7 @@
                         <pic:spPr>
                           <a:xfrm>
                             <a:off x="0" y="0"/>
-                            <a:ext cx="3200400" cy="3200400"/>
+                            <a:ext cx="3337560" cy="3337560"/>
                           </a:xfrm>
                           <a:prstGeom prst="rect"/>
                         </pic:spPr>
@@ -11727,13 +10910,13 @@
         <w:tblLook w:firstColumn="1" w:firstRow="1" w:lastColumn="0" w:lastRow="0" w:noHBand="0" w:noVBand="1" w:val="04A0"/>
       </w:tblPr>
       <w:tblGrid>
-        <w:gridCol w:w="3456"/>
-        <w:gridCol w:w="5328"/>
+        <w:gridCol w:w="4392"/>
+        <w:gridCol w:w="5544"/>
       </w:tblGrid>
       <w:tr>
         <w:tc>
           <w:tcPr>
-            <w:tcW w:type="dxa" w:w="5083"/>
+            <w:tcW w:type="dxa" w:w="4392"/>
             <w:tcMar>
               <w:top w:w="100" w:type="dxa"/>
               <w:start w:w="120" w:type="dxa"/>
@@ -11742,7 +10925,7 @@
             </w:tcMar>
           </w:tcPr>
           <w:p>
-            <w:bookmarkStart w:id="45" w:name="article_templetherapy_163"/>
+            <w:bookmarkStart w:id="41" w:name="article_templetherapy_163"/>
             <w:pPr>
               <w:spacing w:before="0" w:after="160" w:line="324" w:lineRule="auto"/>
             </w:pPr>
@@ -11755,7 +10938,7 @@
               </w:rPr>
               <w:t>Вчера, 30 апреля был день Собаки - день дружбы.</w:t>
             </w:r>
-            <w:bookmarkEnd w:id="45"/>
+            <w:bookmarkEnd w:id="41"/>
           </w:p>
           <w:p>
             <w:pPr>
@@ -11795,7 +10978,7 @@
         </w:tc>
         <w:tc>
           <w:tcPr>
-            <w:tcW w:type="dxa" w:w="5083"/>
+            <w:tcW w:type="dxa" w:w="5544"/>
             <w:tcMar>
               <w:top w:w="100" w:type="dxa"/>
               <w:start w:w="120" w:type="dxa"/>
@@ -11811,8 +10994,8 @@
             <w:r>
               <w:drawing>
                 <wp:inline xmlns:a="http://schemas.openxmlformats.org/drawingml/2006/main" xmlns:pic="http://schemas.openxmlformats.org/drawingml/2006/picture">
-                  <wp:extent cx="3200400" cy="3200400"/>
-                  <wp:docPr id="44" name="Picture 44"/>
+                  <wp:extent cx="3337560" cy="3337560"/>
+                  <wp:docPr id="41" name="Picture 41"/>
                   <wp:cNvGraphicFramePr>
                     <a:graphicFrameLocks noChangeAspect="1"/>
                   </wp:cNvGraphicFramePr>
@@ -11832,7 +11015,7 @@
                         <pic:spPr>
                           <a:xfrm>
                             <a:off x="0" y="0"/>
-                            <a:ext cx="3200400" cy="3200400"/>
+                            <a:ext cx="3337560" cy="3337560"/>
                           </a:xfrm>
                           <a:prstGeom prst="rect"/>
                         </pic:spPr>
@@ -12005,6 +11188,823 @@
         <w:br/>
         <w:br/>
         <w:t>Через мифический зов, что прозвучал из твоего Высшего Я, компаньоны судьбы выберут тебя -компаньоны, кто могут встретить тебя настоящего</w:t>
+      </w:r>
+    </w:p>
+    <w:p>
+      <w:bookmarkStart w:id="42" w:name="chapter_2"/>
+      <w:pPr>
+        <w:spacing w:before="240" w:after="200" w:line="300" w:lineRule="auto"/>
+      </w:pPr>
+      <w:r>
+        <w:rPr>
+          <w:rFonts w:ascii="Georgia" w:hAnsi="Georgia"/>
+          <w:b w:val="0"/>
+          <w:color w:val="6D5A4D"/>
+          <w:sz w:val="26"/>
+        </w:rPr>
+        <w:t>Собранные здесь исходные анонсы и предложения сохранены для полноты корпуса. Они не являются частью исторического или традиционного материала.</w:t>
+      </w:r>
+      <w:bookmarkEnd w:id="42"/>
+    </w:p>
+    <w:tbl>
+      <w:tblPr>
+        <w:tblW w:type="auto" w:w="0"/>
+        <w:tblLayout w:type="fixed"/>
+        <w:tblLook w:firstColumn="1" w:firstRow="1" w:lastColumn="0" w:lastRow="0" w:noHBand="0" w:noVBand="1" w:val="04A0"/>
+      </w:tblPr>
+      <w:tblGrid>
+        <w:gridCol w:w="10166"/>
+      </w:tblGrid>
+      <w:tr>
+        <w:tc>
+          <w:tcPr>
+            <w:tcW w:type="dxa" w:w="10166"/>
+            <w:shd w:fill="FBF4E9"/>
+            <w:tcMar>
+              <w:top w:w="100" w:type="dxa"/>
+              <w:start w:w="120" w:type="dxa"/>
+              <w:bottom w:w="100" w:type="dxa"/>
+              <w:end w:w="120" w:type="dxa"/>
+            </w:tcMar>
+            <w:vAlign w:val="center"/>
+          </w:tcPr>
+          <w:p>
+            <w:pPr>
+              <w:spacing w:before="0" w:after="0" w:line="324" w:lineRule="auto"/>
+            </w:pPr>
+            <w:r>
+              <w:rPr>
+                <w:rFonts w:ascii="Georgia" w:hAnsi="Georgia"/>
+                <w:b/>
+                <w:color w:val="B7791F"/>
+                <w:sz w:val="20"/>
+              </w:rPr>
+              <w:t>VIII. АНОНСЫ И ПРЕДЛОЖЕНИЯ</w:t>
+            </w:r>
+          </w:p>
+        </w:tc>
+      </w:tr>
+    </w:tbl>
+    <w:tbl>
+      <w:tblPr>
+        <w:tblW w:type="auto" w:w="0"/>
+        <w:jc w:val="right"/>
+        <w:tblLayout w:type="fixed"/>
+        <w:tblLook w:firstColumn="1" w:firstRow="1" w:lastColumn="0" w:lastRow="0" w:noHBand="0" w:noVBand="1" w:val="04A0"/>
+      </w:tblPr>
+      <w:tblGrid>
+        <w:gridCol w:w="4392"/>
+        <w:gridCol w:w="5544"/>
+      </w:tblGrid>
+      <w:tr>
+        <w:tc>
+          <w:tcPr>
+            <w:tcW w:type="dxa" w:w="4392"/>
+            <w:tcMar>
+              <w:top w:w="100" w:type="dxa"/>
+              <w:start w:w="120" w:type="dxa"/>
+              <w:bottom w:w="100" w:type="dxa"/>
+              <w:end w:w="120" w:type="dxa"/>
+            </w:tcMar>
+          </w:tcPr>
+          <w:p>
+            <w:bookmarkStart w:id="43" w:name="article_mayaismagic_154"/>
+            <w:pPr>
+              <w:spacing w:before="0" w:after="160" w:line="324" w:lineRule="auto"/>
+            </w:pPr>
+            <w:r>
+              <w:rPr>
+                <w:rFonts w:ascii="Georgia" w:hAnsi="Georgia"/>
+                <w:b/>
+                <w:color w:val="6B2F1A"/>
+                <w:sz w:val="40"/>
+              </w:rPr>
+              <w:t>ПОДАРОК. Определение своей сути и миссии в Традиции Майя.</w:t>
+            </w:r>
+            <w:bookmarkEnd w:id="43"/>
+          </w:p>
+          <w:p>
+            <w:pPr>
+              <w:spacing w:before="0" w:after="0" w:line="324" w:lineRule="auto"/>
+            </w:pPr>
+            <w:r>
+              <w:rPr>
+                <w:rFonts w:ascii="Georgia" w:hAnsi="Georgia"/>
+                <w:b/>
+                <w:color w:val="B7791F"/>
+                <w:sz w:val="21"/>
+              </w:rPr>
+              <w:t>Источник: Mayaismagic · пост 154</w:t>
+              <w:br/>
+            </w:r>
+            <w:r>
+              <w:rPr>
+                <w:rFonts w:ascii="Georgia" w:hAnsi="Georgia"/>
+                <w:b w:val="0"/>
+                <w:color w:val="6D5A4D"/>
+                <w:sz w:val="21"/>
+              </w:rPr>
+              <w:t>Дата: 11.02.2025 20:57:43 UTC-05:00</w:t>
+              <w:br/>
+            </w:r>
+            <w:r>
+              <w:rPr>
+                <w:rFonts w:ascii="Georgia" w:hAnsi="Georgia"/>
+                <w:b w:val="0"/>
+                <w:color w:val="6B2F1A"/>
+                <w:sz w:val="21"/>
+              </w:rPr>
+              <w:t>https://t.me/mayaismagic/154</w:t>
+              <w:br/>
+            </w:r>
+            <w:r>
+              <w:rPr>
+                <w:rFonts w:ascii="Georgia" w:hAnsi="Georgia"/>
+                <w:b/>
+                <w:color w:val="B7791F"/>
+                <w:sz w:val="21"/>
+              </w:rPr>
+              <w:t>Источник: TempleTherapy · пост 2255</w:t>
+              <w:br/>
+            </w:r>
+            <w:r>
+              <w:rPr>
+                <w:rFonts w:ascii="Georgia" w:hAnsi="Georgia"/>
+                <w:b w:val="0"/>
+                <w:color w:val="6D5A4D"/>
+                <w:sz w:val="21"/>
+              </w:rPr>
+              <w:t>Дата: 2025-01-29T02:17:21+00:00</w:t>
+              <w:br/>
+            </w:r>
+            <w:r>
+              <w:rPr>
+                <w:rFonts w:ascii="Georgia" w:hAnsi="Georgia"/>
+                <w:b w:val="0"/>
+                <w:color w:val="6B2F1A"/>
+                <w:sz w:val="21"/>
+              </w:rPr>
+              <w:t>https://t.me/TempleTherapy/2255</w:t>
+              <w:br/>
+            </w:r>
+          </w:p>
+        </w:tc>
+        <w:tc>
+          <w:tcPr>
+            <w:tcW w:type="dxa" w:w="5544"/>
+            <w:tcMar>
+              <w:top w:w="100" w:type="dxa"/>
+              <w:start w:w="120" w:type="dxa"/>
+              <w:bottom w:w="100" w:type="dxa"/>
+              <w:end w:w="120" w:type="dxa"/>
+            </w:tcMar>
+            <w:vAlign w:val="top"/>
+          </w:tcPr>
+          <w:p>
+            <w:pPr>
+              <w:jc w:val="right"/>
+            </w:pPr>
+            <w:r>
+              <w:drawing>
+                <wp:inline xmlns:a="http://schemas.openxmlformats.org/drawingml/2006/main" xmlns:pic="http://schemas.openxmlformats.org/drawingml/2006/picture">
+                  <wp:extent cx="3337560" cy="3337560"/>
+                  <wp:docPr id="42" name="Picture 42"/>
+                  <wp:cNvGraphicFramePr>
+                    <a:graphicFrameLocks noChangeAspect="1"/>
+                  </wp:cNvGraphicFramePr>
+                  <a:graphic>
+                    <a:graphicData uri="http://schemas.openxmlformats.org/drawingml/2006/picture">
+                      <pic:pic>
+                        <pic:nvPicPr>
+                          <pic:cNvPr id="0" name="photo_118@11-02-2025_20-57-43.jpg"/>
+                          <pic:cNvPicPr/>
+                        </pic:nvPicPr>
+                        <pic:blipFill>
+                          <a:blip r:embed="rId24"/>
+                          <a:stretch>
+                            <a:fillRect/>
+                          </a:stretch>
+                        </pic:blipFill>
+                        <pic:spPr>
+                          <a:xfrm>
+                            <a:off x="0" y="0"/>
+                            <a:ext cx="3337560" cy="3337560"/>
+                          </a:xfrm>
+                          <a:prstGeom prst="rect"/>
+                        </pic:spPr>
+                      </pic:pic>
+                    </a:graphicData>
+                  </a:graphic>
+                </wp:inline>
+              </w:drawing>
+            </w:r>
+          </w:p>
+        </w:tc>
+      </w:tr>
+    </w:tbl>
+    <w:p>
+      <w:pPr>
+        <w:spacing w:before="240" w:after="140" w:line="300" w:lineRule="auto"/>
+      </w:pPr>
+      <w:r>
+        <w:rPr>
+          <w:rFonts w:ascii="Georgia" w:hAnsi="Georgia"/>
+          <w:b w:val="0"/>
+          <w:color w:val="2F241D"/>
+          <w:sz w:val="30"/>
+        </w:rPr>
+        <w:t>ПОДАРОК. Определение своей сути и миссии в Традиции Майя.</w:t>
+        <w:br/>
+        <w:t>Разобрался с тем, как майя определяли предназначение.</w:t>
+        <w:br/>
+        <w:t>НАМ ПОМОГАЮТ НАСТРОЙКИ</w:t>
+        <w:br/>
+        <w:t>#1. К’инич (K’inich) - внутренний свет человека</w:t>
+        <w:br/>
+        <w:t>#2. Науаль (Nahual) - духовный помощник, покровитель - дает более глубокое включение в одну из 20 энергий сакрального календаря Цолькин.</w:t>
+        <w:br/>
+        <w:t>#3. К'охбаль (K'ojb'al) - долг, миссия - дает фиксацию в выбранном качестве.</w:t>
+        <w:br/>
+        <w:t>Например,</w:t>
+        <w:br/>
+        <w:t>- Имиш - утроба, Первородная мать.</w:t>
+        <w:br/>
+        <w:t>- Науаль Имиш - дает рост внутреннего потенциала творчества.</w:t>
+        <w:br/>
+        <w:t>- К'охбаль Имиш - формирует импульс творить, зачинать.</w:t>
+        <w:br/>
+        <w:t>- Ик" - энергия ветра, перемен, хаоса.</w:t>
+        <w:br/>
+        <w:t>- Науаль Ик' - готовность что-то изменить в своей жизни или жизни других, лидерская позиция агента перемен.</w:t>
+        <w:br/>
+        <w:t>- К'охб'аль Ик' - конкретные действия, желание что-то почистить, улучшить.</w:t>
+        <w:br/>
+        <w:t>❤️🔥🎁</w:t>
+        <w:br/>
+        <w:t>Вы можете написать мне город, свою дату рождения, а я определю ваш Науаль /дух-помощник майя и передам вам личную инициацию в эту энергию.</w:t>
+        <w:br/>
+        <w:t>Это подарок.😍🥰😘</w:t>
+        <w:br/>
+        <w:t>__</w:t>
+        <w:br/>
+        <w:t>PS. Качества в жизни можно выбирать любые те, что вам наболее интересны на сейчас:</w:t>
+        <w:br/>
+        <w:t>Перечень</w:t>
+        <w:br/>
+        <w:t>20 нахуалей майя (дни Цолькина)</w:t>
+        <w:br/>
+        <w:t>1. Imix (Имиш) – Крокодил, источник жизни, вода, интуиция, первичная энергия.</w:t>
+        <w:br/>
+        <w:t>2. Ik' (Ик') – Ветер, дух, дыхание, перемены, вдохновение.</w:t>
+        <w:br/>
+        <w:t>3. Ak'b'al (Ак'баль) – Ночь, тьма, сны, мудрость, тайны, интуиция.</w:t>
+        <w:br/>
+        <w:t>4. K'an (К'ан) – Семя, рост, процветание, потенциал.</w:t>
+        <w:br/>
+        <w:t>5. Chikchan (Чикчан) – Змея, жизненная сила, кундалини, страсть.</w:t>
+        <w:br/>
+        <w:t>6. Kimi (Кими) – Смерть, переход, трансформация, возрождение.</w:t>
+        <w:br/>
+        <w:t>7. Manik' (Маник') – Олень, гармония, жертва, защита.</w:t>
+        <w:br/>
+        <w:t>8. Lamat (Ламат) – Звезда, красота, плодородие, искусство, Венера.</w:t>
+        <w:br/>
+        <w:t>9. Muluc (Мулук) – Вода, очищение, жертва, дождь, карма.</w:t>
+        <w:br/>
+        <w:t>10. Ok (Ок) – Собака, верность, дружба, защита, проводник в мир духов.</w:t>
+        <w:br/>
+        <w:t>11. Chuwen (Чувен) – Обезьяна, творчество, игра, мастерство, ремесло.</w:t>
+        <w:br/>
+        <w:t>12. Eb (Эб) – Дорога, судьба, путь жизни, карма, целительство.</w:t>
+        <w:br/>
+        <w:t>13. B'en (Б'ен) – Тростник, лидерство, сила духа, амбиции.</w:t>
+        <w:br/>
+        <w:t>14. Ix (Иш) – Ягуар, магия, тайные знания, шаманизм.</w:t>
+        <w:br/>
+        <w:t>15. Men (Мен) – Орел, видение, пророчество, духовная сила.</w:t>
+        <w:br/>
+        <w:t>16. Kib' (Киб') – Сова, мудрость, медитация, очищение, прощение.</w:t>
+        <w:br/>
+        <w:t>17. Kaban (Кабан) – Земля, синхронность, наука, эволюция.</w:t>
+        <w:br/>
+        <w:t>18. Etz'nab' (Эц'наб') – Кремень, правда, решительность, духовный меч.</w:t>
+        <w:br/>
+        <w:t>19. Kawak (Кавак) – Буря, очищение, эмоции, перемены.</w:t>
+        <w:br/>
+        <w:t>20. Ajaw (Ахав) – Солнце, просветление, завершение, божественная сила.</w:t>
+        <w:br/>
+        <w:t>Ранее я уже описывал часть этих качеств, если надо могу описать что-то детальней.</w:t>
+        <w:br/>
+        <w:t>Можете скачать методичку по майя</w:t>
+      </w:r>
+    </w:p>
+    <w:tbl>
+      <w:tblPr>
+        <w:tblW w:type="auto" w:w="0"/>
+        <w:tblLayout w:type="fixed"/>
+        <w:tblLook w:firstColumn="1" w:firstRow="1" w:lastColumn="0" w:lastRow="0" w:noHBand="0" w:noVBand="1" w:val="04A0"/>
+      </w:tblPr>
+      <w:tblGrid>
+        <w:gridCol w:w="10166"/>
+      </w:tblGrid>
+      <w:tr>
+        <w:tc>
+          <w:tcPr>
+            <w:tcW w:type="dxa" w:w="10166"/>
+            <w:shd w:fill="FBF4E9"/>
+            <w:tcMar>
+              <w:top w:w="100" w:type="dxa"/>
+              <w:start w:w="120" w:type="dxa"/>
+              <w:bottom w:w="100" w:type="dxa"/>
+              <w:end w:w="120" w:type="dxa"/>
+            </w:tcMar>
+            <w:vAlign w:val="center"/>
+          </w:tcPr>
+          <w:p>
+            <w:pPr>
+              <w:spacing w:before="0" w:after="0" w:line="324" w:lineRule="auto"/>
+            </w:pPr>
+            <w:r>
+              <w:rPr>
+                <w:rFonts w:ascii="Georgia" w:hAnsi="Georgia"/>
+                <w:b/>
+                <w:color w:val="B7791F"/>
+                <w:sz w:val="20"/>
+              </w:rPr>
+              <w:t>VIII. АНОНСЫ И ПРЕДЛОЖЕНИЯ</w:t>
+            </w:r>
+          </w:p>
+        </w:tc>
+      </w:tr>
+    </w:tbl>
+    <w:tbl>
+      <w:tblPr>
+        <w:tblW w:type="auto" w:w="0"/>
+        <w:jc w:val="right"/>
+        <w:tblLayout w:type="fixed"/>
+        <w:tblLook w:firstColumn="1" w:firstRow="1" w:lastColumn="0" w:lastRow="0" w:noHBand="0" w:noVBand="1" w:val="04A0"/>
+      </w:tblPr>
+      <w:tblGrid>
+        <w:gridCol w:w="4392"/>
+        <w:gridCol w:w="5544"/>
+      </w:tblGrid>
+      <w:tr>
+        <w:tc>
+          <w:tcPr>
+            <w:tcW w:type="dxa" w:w="4392"/>
+            <w:tcMar>
+              <w:top w:w="100" w:type="dxa"/>
+              <w:start w:w="120" w:type="dxa"/>
+              <w:bottom w:w="100" w:type="dxa"/>
+              <w:end w:w="120" w:type="dxa"/>
+            </w:tcMar>
+          </w:tcPr>
+          <w:p>
+            <w:bookmarkStart w:id="44" w:name="article_templetherapy_573"/>
+            <w:pPr>
+              <w:spacing w:before="0" w:after="160" w:line="324" w:lineRule="auto"/>
+            </w:pPr>
+            <w:r>
+              <w:rPr>
+                <w:rFonts w:ascii="Georgia" w:hAnsi="Georgia"/>
+                <w:b/>
+                <w:color w:val="6B2F1A"/>
+                <w:sz w:val="40"/>
+              </w:rPr>
+              <w:t>Здесь краткое описание традиции Майя и одного из курсов, который можно пройти как через личные сессии, так и группой! :)</w:t>
+            </w:r>
+            <w:bookmarkEnd w:id="44"/>
+          </w:p>
+          <w:p>
+            <w:pPr>
+              <w:spacing w:before="0" w:after="0" w:line="324" w:lineRule="auto"/>
+            </w:pPr>
+            <w:r>
+              <w:rPr>
+                <w:rFonts w:ascii="Georgia" w:hAnsi="Georgia"/>
+                <w:b/>
+                <w:color w:val="B7791F"/>
+                <w:sz w:val="21"/>
+              </w:rPr>
+              <w:t>Источник: TempleTherapy · пост 573</w:t>
+              <w:br/>
+            </w:r>
+            <w:r>
+              <w:rPr>
+                <w:rFonts w:ascii="Georgia" w:hAnsi="Georgia"/>
+                <w:b w:val="0"/>
+                <w:color w:val="6D5A4D"/>
+                <w:sz w:val="21"/>
+              </w:rPr>
+              <w:t>Дата: 2022-02-11T14:26:26+00:00</w:t>
+              <w:br/>
+            </w:r>
+            <w:r>
+              <w:rPr>
+                <w:rFonts w:ascii="Georgia" w:hAnsi="Georgia"/>
+                <w:b w:val="0"/>
+                <w:color w:val="6B2F1A"/>
+                <w:sz w:val="21"/>
+              </w:rPr>
+              <w:t>https://t.me/TempleTherapy/573</w:t>
+              <w:br/>
+            </w:r>
+          </w:p>
+        </w:tc>
+        <w:tc>
+          <w:tcPr>
+            <w:tcW w:type="dxa" w:w="5544"/>
+            <w:tcMar>
+              <w:top w:w="100" w:type="dxa"/>
+              <w:start w:w="120" w:type="dxa"/>
+              <w:bottom w:w="100" w:type="dxa"/>
+              <w:end w:w="120" w:type="dxa"/>
+            </w:tcMar>
+            <w:vAlign w:val="top"/>
+          </w:tcPr>
+          <w:p>
+            <w:pPr>
+              <w:jc w:val="right"/>
+            </w:pPr>
+            <w:r>
+              <w:drawing>
+                <wp:inline xmlns:a="http://schemas.openxmlformats.org/drawingml/2006/main" xmlns:pic="http://schemas.openxmlformats.org/drawingml/2006/picture">
+                  <wp:extent cx="3337560" cy="2225040"/>
+                  <wp:docPr id="43" name="Picture 43"/>
+                  <wp:cNvGraphicFramePr>
+                    <a:graphicFrameLocks noChangeAspect="1"/>
+                  </wp:cNvGraphicFramePr>
+                  <a:graphic>
+                    <a:graphicData uri="http://schemas.openxmlformats.org/drawingml/2006/picture">
+                      <pic:pic>
+                        <pic:nvPicPr>
+                          <pic:cNvPr id="0" name="post-573-1.jpg"/>
+                          <pic:cNvPicPr/>
+                        </pic:nvPicPr>
+                        <pic:blipFill>
+                          <a:blip r:embed="rId25"/>
+                          <a:stretch>
+                            <a:fillRect/>
+                          </a:stretch>
+                        </pic:blipFill>
+                        <pic:spPr>
+                          <a:xfrm>
+                            <a:off x="0" y="0"/>
+                            <a:ext cx="3337560" cy="2225040"/>
+                          </a:xfrm>
+                          <a:prstGeom prst="rect"/>
+                        </pic:spPr>
+                      </pic:pic>
+                    </a:graphicData>
+                  </a:graphic>
+                </wp:inline>
+              </w:drawing>
+            </w:r>
+          </w:p>
+        </w:tc>
+      </w:tr>
+    </w:tbl>
+    <w:p>
+      <w:pPr>
+        <w:spacing w:before="240" w:after="140" w:line="300" w:lineRule="auto"/>
+      </w:pPr>
+      <w:r>
+        <w:rPr>
+          <w:rFonts w:ascii="Georgia" w:hAnsi="Georgia"/>
+          <w:b w:val="0"/>
+          <w:color w:val="2F241D"/>
+          <w:sz w:val="30"/>
+        </w:rPr>
+        <w:t>Здесь краткое описание традиции Майя и одного из курсов, который можно пройти как через личные сессии, так и группой! :)</w:t>
+        <w:br/>
+        <w:br/>
+        <w:t>АРХЕТИПИЧЕСКИЙ ГИПНОКОУЧИНГ</w:t>
+        <w:br/>
+        <w:br/>
+        <w:t>Цикл. Древние Мистерии.</w:t>
+        <w:br/>
+        <w:br/>
+        <w:t>Курс 6. ИМПУЛЬС ВРЕМЕНИ.</w:t>
+        <w:br/>
+        <w:t>Новый уровень.</w:t>
+        <w:br/>
+        <w:t>(Традиция Майя и Ацтеков)</w:t>
+        <w:br/>
+        <w:br/>
+        <w:t>Традицию Майя часто называют магией времени, так как она сотворила очень интересную модель творения реальности через энергии дней календаря.</w:t>
+        <w:br/>
+        <w:br/>
+        <w:t>Если кто читал мои заметки по дням календаря, там есть механизм весьма любопытной раскрутки от одного дня ко второму.</w:t>
+        <w:br/>
+        <w:br/>
+        <w:t>А запускается она энергией Кетцалькоатля.</w:t>
+        <w:br/>
+        <w:t>Через него вскрывается видение разных параллельных реальностей (=возможностей).</w:t>
+        <w:br/>
+        <w:br/>
+        <w:t>Это чем-то похоже на Эманации Орла в Традиции Толтеков у Кастанеды.</w:t>
+        <w:br/>
+        <w:br/>
+        <w:t>===</w:t>
+        <w:br/>
+        <w:t>Курс Импульс Времени - программа для тех, кто хочет запустить рождение чего-то нового в своей жизни. Семья, отношения, новый бизнес-проект, карьера и т.п.</w:t>
+        <w:br/>
+        <w:br/>
+        <w:t>Этот коучинг-курс базируется на Алгоритме Календаря Древних Майя.</w:t>
+        <w:br/>
+        <w:br/>
+        <w:t>Этот календарь точнее современного. А символика каждого его дня отражает алгоритм развития любого дела.</w:t>
+        <w:br/>
+        <w:br/>
+        <w:t>Мы применим алгоритм Майя к развитию Вашей цели и будем усиливать ее развитие энергией архетипов Майя и Ацтеков.</w:t>
+        <w:br/>
+        <w:br/>
+        <w:t>Тем самым будет повышаться масштаб, качество, эффективность вашего проекта.</w:t>
+        <w:br/>
+        <w:br/>
+        <w:t>Такая работа хороша, если вы хотите запустить новый или масштабировать текущий проект, вывести его на глобальный уровень.</w:t>
+        <w:br/>
+        <w:t>Добавить больше граней и глубины в отношения или в смыслы жизни.</w:t>
+        <w:br/>
+        <w:br/>
+        <w:t>ПРИМЕЧАНИЕ.</w:t>
+        <w:br/>
+        <w:t>Ключевые Архетипы Майя и Ацтеков.</w:t>
+        <w:br/>
+        <w:br/>
+        <w:t>Есть несколько центральных Сил, которые может быть полезно понимать, чтобы лучше прочувствовать культуру майя и ацтеков.</w:t>
+        <w:br/>
+        <w:br/>
+        <w:t>1. Демиург.</w:t>
+        <w:br/>
+        <w:br/>
+        <w:t>А запускается движение календаря Кетцалькоатлем, Пернатым Змеем, Демиургом.</w:t>
+        <w:br/>
+        <w:br/>
+        <w:t>Почему Пернатый змей?</w:t>
+        <w:br/>
+        <w:t>Змея - символ древней мудрости. А оперенья птицы символизируют Верхний Божественный мир, грани реальности.</w:t>
+        <w:br/>
+        <w:br/>
+        <w:t>Через Пернатого змея раскрывается видение разные линий реальности, т.е. возможностей.</w:t>
+        <w:br/>
+        <w:br/>
+        <w:t>Это чем-то похоже на Эманации Орла в Традиции Толтеков у Кастанеды.</w:t>
+        <w:br/>
+        <w:br/>
+        <w:t>2. Потенции мира, энергия.</w:t>
+        <w:br/>
+        <w:t>В этой традиции есть две ключевых стихии:</w:t>
+        <w:br/>
+        <w:t>А) ветер - привносит вероятности, возможности</w:t>
+        <w:br/>
+        <w:t>Иик, Эхекатль.</w:t>
+        <w:br/>
+        <w:t>Б) дождь - символизирует плодородие, блага жизни.</w:t>
+        <w:br/>
+        <w:t>Тлалок.</w:t>
+        <w:br/>
+        <w:t>В) так же есть бог огня и пожаров.</w:t>
+        <w:br/>
+        <w:br/>
+        <w:t>3. Бог Солнца Кинич Ахау, Верховный правитель.</w:t>
+        <w:br/>
+        <w:br/>
+        <w:t>Надо понимать, у любого архетипа, Бога есть светлая и темная (скрытая, дремучая) сторона.</w:t>
+        <w:br/>
+        <w:br/>
+        <w:t>Так, тайный-скрытый близнец Кетцалькоатлья - Шолотль, в виде трехголового пса, отражает неистовое стремление к цели сквозь любые препятствия.</w:t>
+        <w:br/>
+        <w:br/>
+        <w:t>А близнец Бога Солнца Кинич Ахау - проявляется в виде Ягуара, который ночью не зная слабости и пощады громит врагов и  препятствия.</w:t>
+        <w:br/>
+        <w:br/>
+        <w:t>Можно кстати вспомнить два типа спец-наза ацтекских воинов: воины-орлы и тайные воины-ягуары.</w:t>
+        <w:br/>
+        <w:br/>
+        <w:t>4. Древо Жизни.</w:t>
+        <w:br/>
+        <w:t>Мир,  вращается вокруг оси, центрального Древа.</w:t>
+        <w:br/>
+        <w:br/>
+        <w:t>Этим Древо Жизнь иногда проявлено как кукуруза - символ жизни, ключевая еда майя и ацтеков. Отсюда Бог кукурузы - Бог Жизни, целительства, прародитель людей.</w:t>
+        <w:br/>
+        <w:br/>
+        <w:t>5. А хранитель законы, порядки старец-мудрец Ицамна, который восседает птицей на верхушке Древа. Чем-то это может перекликаться с идеей времени, вечности.</w:t>
+        <w:br/>
+        <w:br/>
+        <w:t>6. Ну и Инь-Янь.</w:t>
+        <w:br/>
+        <w:t>У Бога Солнца, Кинич Ахау была возлюбленная/ мать/ жена, что проявлялось в виде Богин Иш Чель.</w:t>
+        <w:br/>
+        <w:t>Она проявлялась в виде разных циклов Луны.</w:t>
+        <w:br/>
+        <w:br/>
+        <w:t>Все становится вполне логичным и понятным :)</w:t>
+        <w:br/>
+        <w:br/>
+        <w:t>7. Лейт-мотив традиции это, конечно, кровь, как проявление жизненной силы, к'ух.</w:t>
+        <w:br/>
+        <w:br/>
+        <w:t>Это где-то пересекается с концепцией ци, прана.</w:t>
+        <w:br/>
+        <w:br/>
+        <w:t>К'ух - это первичная энергия, которая вращает миры, запускает любые процессы.</w:t>
+        <w:br/>
+        <w:t>Это та энергия, которой Кетцалькоатль сотворил мир. Это тот импульс творения, на накоплении и трансформации которого было построена вся майянская религия.</w:t>
+        <w:br/>
+        <w:br/>
+        <w:t>Это энергия, которая запускает Жизнь, Календарь, т.е. символично говоря, движение Солнца.</w:t>
+        <w:br/>
+        <w:br/>
+        <w:t>К'ух надо очищать.</w:t>
+        <w:br/>
+        <w:t>Слушать Богов, Мир, жить в гармонии с Календарем, т.е. синхронизироваться с миром.</w:t>
+      </w:r>
+    </w:p>
+    <w:tbl>
+      <w:tblPr>
+        <w:tblW w:type="auto" w:w="0"/>
+        <w:tblLayout w:type="fixed"/>
+        <w:tblLook w:firstColumn="1" w:firstRow="1" w:lastColumn="0" w:lastRow="0" w:noHBand="0" w:noVBand="1" w:val="04A0"/>
+      </w:tblPr>
+      <w:tblGrid>
+        <w:gridCol w:w="10166"/>
+      </w:tblGrid>
+      <w:tr>
+        <w:tc>
+          <w:tcPr>
+            <w:tcW w:type="dxa" w:w="10166"/>
+            <w:shd w:fill="FBF4E9"/>
+            <w:tcMar>
+              <w:top w:w="100" w:type="dxa"/>
+              <w:start w:w="120" w:type="dxa"/>
+              <w:bottom w:w="100" w:type="dxa"/>
+              <w:end w:w="120" w:type="dxa"/>
+            </w:tcMar>
+            <w:vAlign w:val="center"/>
+          </w:tcPr>
+          <w:p>
+            <w:pPr>
+              <w:spacing w:before="0" w:after="0" w:line="324" w:lineRule="auto"/>
+            </w:pPr>
+            <w:r>
+              <w:rPr>
+                <w:rFonts w:ascii="Georgia" w:hAnsi="Georgia"/>
+                <w:b/>
+                <w:color w:val="B7791F"/>
+                <w:sz w:val="20"/>
+              </w:rPr>
+              <w:t>VIII. АНОНСЫ И ПРЕДЛОЖЕНИЯ</w:t>
+            </w:r>
+          </w:p>
+        </w:tc>
+      </w:tr>
+    </w:tbl>
+    <w:tbl>
+      <w:tblPr>
+        <w:tblW w:type="auto" w:w="0"/>
+        <w:jc w:val="right"/>
+        <w:tblLayout w:type="fixed"/>
+        <w:tblLook w:firstColumn="1" w:firstRow="1" w:lastColumn="0" w:lastRow="0" w:noHBand="0" w:noVBand="1" w:val="04A0"/>
+      </w:tblPr>
+      <w:tblGrid>
+        <w:gridCol w:w="4392"/>
+        <w:gridCol w:w="5544"/>
+      </w:tblGrid>
+      <w:tr>
+        <w:tc>
+          <w:tcPr>
+            <w:tcW w:type="dxa" w:w="4392"/>
+            <w:tcMar>
+              <w:top w:w="100" w:type="dxa"/>
+              <w:start w:w="120" w:type="dxa"/>
+              <w:bottom w:w="100" w:type="dxa"/>
+              <w:end w:w="120" w:type="dxa"/>
+            </w:tcMar>
+          </w:tcPr>
+          <w:p>
+            <w:bookmarkStart w:id="45" w:name="article_templetherapy_574"/>
+            <w:pPr>
+              <w:spacing w:before="0" w:after="160" w:line="324" w:lineRule="auto"/>
+            </w:pPr>
+            <w:r>
+              <w:rPr>
+                <w:rFonts w:ascii="Georgia" w:hAnsi="Georgia"/>
+                <w:b/>
+                <w:color w:val="6B2F1A"/>
+                <w:sz w:val="40"/>
+              </w:rPr>
+              <w:t>И тогда твоя сила, твоя К'ух будет расти. Тогда ты будешь слышать шопот Кетцалькоатля</w:t>
+            </w:r>
+            <w:bookmarkEnd w:id="45"/>
+          </w:p>
+          <w:p>
+            <w:pPr>
+              <w:spacing w:before="0" w:after="0" w:line="324" w:lineRule="auto"/>
+            </w:pPr>
+            <w:r>
+              <w:rPr>
+                <w:rFonts w:ascii="Georgia" w:hAnsi="Georgia"/>
+                <w:b/>
+                <w:color w:val="B7791F"/>
+                <w:sz w:val="21"/>
+              </w:rPr>
+              <w:t>Источник: TempleTherapy · пост 574</w:t>
+              <w:br/>
+            </w:r>
+            <w:r>
+              <w:rPr>
+                <w:rFonts w:ascii="Georgia" w:hAnsi="Georgia"/>
+                <w:b w:val="0"/>
+                <w:color w:val="6D5A4D"/>
+                <w:sz w:val="21"/>
+              </w:rPr>
+              <w:t>Дата: 2022-02-11T14:26:26+00:00</w:t>
+              <w:br/>
+            </w:r>
+            <w:r>
+              <w:rPr>
+                <w:rFonts w:ascii="Georgia" w:hAnsi="Georgia"/>
+                <w:b w:val="0"/>
+                <w:color w:val="6B2F1A"/>
+                <w:sz w:val="21"/>
+              </w:rPr>
+              <w:t>https://t.me/TempleTherapy/574</w:t>
+              <w:br/>
+            </w:r>
+          </w:p>
+        </w:tc>
+        <w:tc>
+          <w:tcPr>
+            <w:tcW w:type="dxa" w:w="5544"/>
+            <w:tcMar>
+              <w:top w:w="100" w:type="dxa"/>
+              <w:start w:w="120" w:type="dxa"/>
+              <w:bottom w:w="100" w:type="dxa"/>
+              <w:end w:w="120" w:type="dxa"/>
+            </w:tcMar>
+            <w:vAlign w:val="top"/>
+          </w:tcPr>
+          <w:p>
+            <w:pPr>
+              <w:jc w:val="right"/>
+            </w:pPr>
+            <w:r>
+              <w:drawing>
+                <wp:inline xmlns:a="http://schemas.openxmlformats.org/drawingml/2006/main" xmlns:pic="http://schemas.openxmlformats.org/drawingml/2006/picture">
+                  <wp:extent cx="3337560" cy="3337560"/>
+                  <wp:docPr id="44" name="Picture 44"/>
+                  <wp:cNvGraphicFramePr>
+                    <a:graphicFrameLocks noChangeAspect="1"/>
+                  </wp:cNvGraphicFramePr>
+                  <a:graphic>
+                    <a:graphicData uri="http://schemas.openxmlformats.org/drawingml/2006/picture">
+                      <pic:pic>
+                        <pic:nvPicPr>
+                          <pic:cNvPr id="0" name="post-8-1.jpg"/>
+                          <pic:cNvPicPr/>
+                        </pic:nvPicPr>
+                        <pic:blipFill>
+                          <a:blip r:embed="rId26"/>
+                          <a:stretch>
+                            <a:fillRect/>
+                          </a:stretch>
+                        </pic:blipFill>
+                        <pic:spPr>
+                          <a:xfrm>
+                            <a:off x="0" y="0"/>
+                            <a:ext cx="3337560" cy="3337560"/>
+                          </a:xfrm>
+                          <a:prstGeom prst="rect"/>
+                        </pic:spPr>
+                      </pic:pic>
+                    </a:graphicData>
+                  </a:graphic>
+                </wp:inline>
+              </w:drawing>
+            </w:r>
+          </w:p>
+        </w:tc>
+      </w:tr>
+    </w:tbl>
+    <w:p>
+      <w:pPr>
+        <w:spacing w:before="240" w:after="140" w:line="300" w:lineRule="auto"/>
+      </w:pPr>
+      <w:r>
+        <w:rPr>
+          <w:rFonts w:ascii="Georgia" w:hAnsi="Georgia"/>
+          <w:b w:val="0"/>
+          <w:color w:val="2F241D"/>
+          <w:sz w:val="30"/>
+        </w:rPr>
+        <w:t>И тогда твоя сила, твоя К'ух будет расти. Тогда ты будешь слышать шопот Кетцалькоатля</w:t>
+        <w:br/>
+        <w:t>Видеть его перья-эманации (т.е. возможности) и слышать его мудрость (т.е. активировать интуицию, включаться в информополе планеты, коллективное бессознательное).</w:t>
+        <w:br/>
+        <w:br/>
+        <w:t>В рамках Курса Круг Пернатого Змея мы как раз будем учиться синхронизироваться с энергиями Календаря Майя, чувствовать Ритм Времени, и простраивать свои цели, проекты так, чтобы они расширялись и активировались под действием архетипов древней традиции.</w:t>
       </w:r>
     </w:p>
     <w:sectPr>

</xml_diff>

<commit_message>
refine: compact Maya reading typography
</commit_message>
<xml_diff>
--- a/source-books/book-3-maya-tradition/outputs/Maya_Calendar_Energies.docx
+++ b/source-books/book-3-maya-tradition/outputs/Maya_Calendar_Energies.docx
@@ -833,7 +833,7 @@
     <w:p>
       <w:bookmarkStart w:id="1" w:name="chapter_1"/>
       <w:pPr>
-        <w:spacing w:before="240" w:after="200" w:line="300" w:lineRule="auto"/>
+        <w:spacing w:before="240" w:after="200" w:line="264" w:lineRule="auto"/>
       </w:pPr>
       <w:r>
         <w:rPr>
@@ -1044,14 +1044,14 @@
     </w:tbl>
     <w:p>
       <w:pPr>
-        <w:spacing w:before="240" w:after="140" w:line="300" w:lineRule="auto"/>
+        <w:spacing w:before="180" w:after="100" w:line="264" w:lineRule="auto"/>
       </w:pPr>
       <w:r>
         <w:rPr>
           <w:rFonts w:ascii="Georgia" w:hAnsi="Georgia"/>
           <w:b w:val="0"/>
           <w:color w:val="2F241D"/>
-          <w:sz w:val="30"/>
+          <w:sz w:val="27"/>
         </w:rPr>
         <w:t>2. ЭНЕРГИЯ ИК' (Ветер).</w:t>
         <w:br/>
@@ -1310,14 +1310,14 @@
     </w:tbl>
     <w:p>
       <w:pPr>
-        <w:spacing w:before="240" w:after="140" w:line="300" w:lineRule="auto"/>
+        <w:spacing w:before="180" w:after="100" w:line="264" w:lineRule="auto"/>
       </w:pPr>
       <w:r>
         <w:rPr>
           <w:rFonts w:ascii="Georgia" w:hAnsi="Georgia"/>
           <w:b w:val="0"/>
           <w:color w:val="2F241D"/>
-          <w:sz w:val="30"/>
+          <w:sz w:val="27"/>
         </w:rPr>
         <w:t>Традиция Майя</w:t>
         <w:br/>
@@ -1548,14 +1548,14 @@
     </w:tbl>
     <w:p>
       <w:pPr>
-        <w:spacing w:before="240" w:after="140" w:line="300" w:lineRule="auto"/>
+        <w:spacing w:before="180" w:after="100" w:line="264" w:lineRule="auto"/>
       </w:pPr>
       <w:r>
         <w:rPr>
           <w:rFonts w:ascii="Georgia" w:hAnsi="Georgia"/>
           <w:b w:val="0"/>
           <w:color w:val="2F241D"/>
-          <w:sz w:val="30"/>
+          <w:sz w:val="27"/>
         </w:rPr>
         <w:t>Если у Вас есть желание, можем немного углубиться в Эманации Пернатого Змея - Значенич Энергии Дня (Кина) согласно традиции Майя и Ацтеков</w:t>
       </w:r>
@@ -1728,14 +1728,14 @@
     </w:tbl>
     <w:p>
       <w:pPr>
-        <w:spacing w:before="240" w:after="140" w:line="300" w:lineRule="auto"/>
+        <w:spacing w:before="180" w:after="100" w:line="264" w:lineRule="auto"/>
       </w:pPr>
       <w:r>
         <w:rPr>
           <w:rFonts w:ascii="Georgia" w:hAnsi="Georgia"/>
           <w:b w:val="0"/>
           <w:color w:val="2F241D"/>
-          <w:sz w:val="30"/>
+          <w:sz w:val="27"/>
         </w:rPr>
         <w:t>Первый месяц Календаря Хааб - Pop ("поп"). Мастер.</w:t>
         <w:br/>
@@ -1942,14 +1942,14 @@
     </w:tbl>
     <w:p>
       <w:pPr>
-        <w:spacing w:before="240" w:after="140" w:line="300" w:lineRule="auto"/>
+        <w:spacing w:before="180" w:after="100" w:line="264" w:lineRule="auto"/>
       </w:pPr>
       <w:r>
         <w:rPr>
           <w:rFonts w:ascii="Georgia" w:hAnsi="Georgia"/>
           <w:b w:val="0"/>
           <w:color w:val="2F241D"/>
-          <w:sz w:val="30"/>
+          <w:sz w:val="27"/>
         </w:rPr>
         <w:t>2 месяц: Uo (wo). Молчаливый исследователь.</w:t>
         <w:br/>
@@ -2188,14 +2188,14 @@
     </w:tbl>
     <w:p>
       <w:pPr>
-        <w:spacing w:before="240" w:after="140" w:line="300" w:lineRule="auto"/>
+        <w:spacing w:before="180" w:after="100" w:line="264" w:lineRule="auto"/>
       </w:pPr>
       <w:r>
         <w:rPr>
           <w:rFonts w:ascii="Georgia" w:hAnsi="Georgia"/>
           <w:b w:val="0"/>
           <w:color w:val="2F241D"/>
-          <w:sz w:val="30"/>
+          <w:sz w:val="27"/>
         </w:rPr>
         <w:t>3 месяц календаря майя, Zip</w:t>
         <w:br/>
@@ -2410,14 +2410,14 @@
     </w:tbl>
     <w:p>
       <w:pPr>
-        <w:spacing w:before="240" w:after="140" w:line="300" w:lineRule="auto"/>
+        <w:spacing w:before="180" w:after="100" w:line="264" w:lineRule="auto"/>
       </w:pPr>
       <w:r>
         <w:rPr>
           <w:rFonts w:ascii="Georgia" w:hAnsi="Georgia"/>
           <w:b w:val="0"/>
           <w:color w:val="2F241D"/>
-          <w:sz w:val="30"/>
+          <w:sz w:val="27"/>
         </w:rPr>
         <w:t>4 месяц. ZOTZ. Внимательность и знания.</w:t>
         <w:br/>
@@ -2628,14 +2628,14 @@
     </w:tbl>
     <w:p>
       <w:pPr>
-        <w:spacing w:before="240" w:after="140" w:line="300" w:lineRule="auto"/>
+        <w:spacing w:before="180" w:after="100" w:line="264" w:lineRule="auto"/>
       </w:pPr>
       <w:r>
         <w:rPr>
           <w:rFonts w:ascii="Georgia" w:hAnsi="Georgia"/>
           <w:b w:val="0"/>
           <w:color w:val="2F241D"/>
-          <w:sz w:val="30"/>
+          <w:sz w:val="27"/>
         </w:rPr>
         <w:t>5 месяц Хааб. TZEC. 1 окт.</w:t>
         <w:br/>
@@ -2856,14 +2856,14 @@
     </w:tbl>
     <w:p>
       <w:pPr>
-        <w:spacing w:before="240" w:after="140" w:line="300" w:lineRule="auto"/>
+        <w:spacing w:before="180" w:after="100" w:line="264" w:lineRule="auto"/>
       </w:pPr>
       <w:r>
         <w:rPr>
           <w:rFonts w:ascii="Georgia" w:hAnsi="Georgia"/>
           <w:b w:val="0"/>
           <w:color w:val="2F241D"/>
-          <w:sz w:val="30"/>
+          <w:sz w:val="27"/>
         </w:rPr>
         <w:t>6 месяц Майя. XUL</w:t>
         <w:br/>
@@ -3084,14 +3084,14 @@
     </w:tbl>
     <w:p>
       <w:pPr>
-        <w:spacing w:before="240" w:after="140" w:line="300" w:lineRule="auto"/>
+        <w:spacing w:before="180" w:after="100" w:line="264" w:lineRule="auto"/>
       </w:pPr>
       <w:r>
         <w:rPr>
           <w:rFonts w:ascii="Georgia" w:hAnsi="Georgia"/>
           <w:b w:val="0"/>
           <w:color w:val="2F241D"/>
-          <w:sz w:val="30"/>
+          <w:sz w:val="27"/>
         </w:rPr>
         <w:t>Алхимия Майя.</w:t>
         <w:br/>
@@ -3308,14 +3308,14 @@
     </w:tbl>
     <w:p>
       <w:pPr>
-        <w:spacing w:before="240" w:after="140" w:line="300" w:lineRule="auto"/>
+        <w:spacing w:before="180" w:after="100" w:line="264" w:lineRule="auto"/>
       </w:pPr>
       <w:r>
         <w:rPr>
           <w:rFonts w:ascii="Georgia" w:hAnsi="Georgia"/>
           <w:b w:val="0"/>
           <w:color w:val="2F241D"/>
-          <w:sz w:val="30"/>
+          <w:sz w:val="27"/>
         </w:rPr>
         <w:t>ПРАКТИЧЕСКИЙ ЭФФЕКТ.</w:t>
         <w:br/>
@@ -3548,14 +3548,14 @@
     </w:tbl>
     <w:p>
       <w:pPr>
-        <w:spacing w:before="240" w:after="140" w:line="300" w:lineRule="auto"/>
+        <w:spacing w:before="180" w:after="100" w:line="264" w:lineRule="auto"/>
       </w:pPr>
       <w:r>
         <w:rPr>
           <w:rFonts w:ascii="Georgia" w:hAnsi="Georgia"/>
           <w:b w:val="0"/>
           <w:color w:val="2F241D"/>
-          <w:sz w:val="30"/>
+          <w:sz w:val="27"/>
         </w:rPr>
         <w:t>У меня немного появилось время. Давайте продолжим исследование Шаманизма народов Майя.</w:t>
         <w:br/>
@@ -3828,14 +3828,14 @@
     </w:tbl>
     <w:p>
       <w:pPr>
-        <w:spacing w:before="240" w:after="140" w:line="300" w:lineRule="auto"/>
+        <w:spacing w:before="180" w:after="100" w:line="264" w:lineRule="auto"/>
       </w:pPr>
       <w:r>
         <w:rPr>
           <w:rFonts w:ascii="Georgia" w:hAnsi="Georgia"/>
           <w:b w:val="0"/>
           <w:color w:val="2F241D"/>
-          <w:sz w:val="30"/>
+          <w:sz w:val="27"/>
         </w:rPr>
         <w:t>Символ 7 апреля - МАНИК.</w:t>
         <w:br/>
@@ -4133,14 +4133,14 @@
     </w:tbl>
     <w:p>
       <w:pPr>
-        <w:spacing w:before="240" w:after="140" w:line="300" w:lineRule="auto"/>
+        <w:spacing w:before="180" w:after="100" w:line="264" w:lineRule="auto"/>
       </w:pPr>
       <w:r>
         <w:rPr>
           <w:rFonts w:ascii="Georgia" w:hAnsi="Georgia"/>
           <w:b w:val="0"/>
           <w:color w:val="2F241D"/>
-          <w:sz w:val="30"/>
+          <w:sz w:val="27"/>
         </w:rPr>
         <w:t>Если взять Поток Маник через Рейки Иггдрасиль - предлагаю свою версию:</w:t>
         <w:br/>
@@ -4354,14 +4354,14 @@
     </w:tbl>
     <w:p>
       <w:pPr>
-        <w:spacing w:before="240" w:after="140" w:line="300" w:lineRule="auto"/>
+        <w:spacing w:before="180" w:after="100" w:line="264" w:lineRule="auto"/>
       </w:pPr>
       <w:r>
         <w:rPr>
           <w:rFonts w:ascii="Georgia" w:hAnsi="Georgia"/>
           <w:b w:val="0"/>
           <w:color w:val="2F241D"/>
-          <w:sz w:val="30"/>
+          <w:sz w:val="27"/>
         </w:rPr>
         <w:t>8 апреля.</w:t>
         <w:br/>
@@ -4619,14 +4619,14 @@
     </w:tbl>
     <w:p>
       <w:pPr>
-        <w:spacing w:before="240" w:after="140" w:line="300" w:lineRule="auto"/>
+        <w:spacing w:before="180" w:after="100" w:line="264" w:lineRule="auto"/>
       </w:pPr>
       <w:r>
         <w:rPr>
           <w:rFonts w:ascii="Georgia" w:hAnsi="Georgia"/>
           <w:b w:val="0"/>
           <w:color w:val="2F241D"/>
-          <w:sz w:val="30"/>
+          <w:sz w:val="27"/>
         </w:rPr>
         <w:t>НАСТРОЙКА: ЛАМАТ (Эгрегор Майя).</w:t>
         <w:br/>
@@ -4850,14 +4850,14 @@
     </w:tbl>
     <w:p>
       <w:pPr>
-        <w:spacing w:before="240" w:after="140" w:line="300" w:lineRule="auto"/>
+        <w:spacing w:before="180" w:after="100" w:line="264" w:lineRule="auto"/>
       </w:pPr>
       <w:r>
         <w:rPr>
           <w:rFonts w:ascii="Georgia" w:hAnsi="Georgia"/>
           <w:b w:val="0"/>
           <w:color w:val="2F241D"/>
-          <w:sz w:val="30"/>
+          <w:sz w:val="27"/>
         </w:rPr>
         <w:t>9 апреля - день Луны.</w:t>
         <w:br/>
@@ -5113,14 +5113,14 @@
     </w:tbl>
     <w:p>
       <w:pPr>
-        <w:spacing w:before="240" w:after="140" w:line="300" w:lineRule="auto"/>
+        <w:spacing w:before="180" w:after="100" w:line="264" w:lineRule="auto"/>
       </w:pPr>
       <w:r>
         <w:rPr>
           <w:rFonts w:ascii="Georgia" w:hAnsi="Georgia"/>
           <w:b w:val="0"/>
           <w:color w:val="2F241D"/>
-          <w:sz w:val="30"/>
+          <w:sz w:val="27"/>
         </w:rPr>
         <w:t>11 апреля. День Мастера (Оьезьяны).</w:t>
         <w:br/>
@@ -5416,14 +5416,14 @@
     </w:tbl>
     <w:p>
       <w:pPr>
-        <w:spacing w:before="240" w:after="140" w:line="300" w:lineRule="auto"/>
+        <w:spacing w:before="180" w:after="100" w:line="264" w:lineRule="auto"/>
       </w:pPr>
       <w:r>
         <w:rPr>
           <w:rFonts w:ascii="Georgia" w:hAnsi="Georgia"/>
           <w:b w:val="0"/>
           <w:color w:val="2F241D"/>
-          <w:sz w:val="30"/>
+          <w:sz w:val="27"/>
         </w:rPr>
         <w:t>14 апреля - День Ягуара (Волшебника).</w:t>
         <w:br/>
@@ -5720,14 +5720,14 @@
     </w:tbl>
     <w:p>
       <w:pPr>
-        <w:spacing w:before="240" w:after="140" w:line="300" w:lineRule="auto"/>
+        <w:spacing w:before="180" w:after="100" w:line="264" w:lineRule="auto"/>
       </w:pPr>
       <w:r>
         <w:rPr>
           <w:rFonts w:ascii="Georgia" w:hAnsi="Georgia"/>
           <w:b w:val="0"/>
           <w:color w:val="2F241D"/>
-          <w:sz w:val="30"/>
+          <w:sz w:val="27"/>
         </w:rPr>
         <w:t>13 апреля - День Тростника.</w:t>
         <w:br/>
@@ -5969,14 +5969,14 @@
     </w:tbl>
     <w:p>
       <w:pPr>
-        <w:spacing w:before="240" w:after="140" w:line="300" w:lineRule="auto"/>
+        <w:spacing w:before="180" w:after="100" w:line="264" w:lineRule="auto"/>
       </w:pPr>
       <w:r>
         <w:rPr>
           <w:rFonts w:ascii="Georgia" w:hAnsi="Georgia"/>
           <w:b w:val="0"/>
           <w:color w:val="2F241D"/>
-          <w:sz w:val="30"/>
+          <w:sz w:val="27"/>
         </w:rPr>
         <w:t>Используй смелость и почувствуй свой путь через любые процессы, что кажутся сложными или некомфортными. Слушай сердце, небесный странник.</w:t>
         <w:br/>
@@ -6219,14 +6219,14 @@
     </w:tbl>
     <w:p>
       <w:pPr>
-        <w:spacing w:before="240" w:after="140" w:line="300" w:lineRule="auto"/>
+        <w:spacing w:before="180" w:after="100" w:line="264" w:lineRule="auto"/>
       </w:pPr>
       <w:r>
         <w:rPr>
           <w:rFonts w:ascii="Georgia" w:hAnsi="Georgia"/>
           <w:b w:val="0"/>
           <w:color w:val="2F241D"/>
-          <w:sz w:val="30"/>
+          <w:sz w:val="27"/>
         </w:rPr>
         <w:t>15 апреля - День Орла (шамана).</w:t>
         <w:br/>
@@ -6552,14 +6552,14 @@
     </w:tbl>
     <w:p>
       <w:pPr>
-        <w:spacing w:before="240" w:after="140" w:line="300" w:lineRule="auto"/>
+        <w:spacing w:before="180" w:after="100" w:line="264" w:lineRule="auto"/>
       </w:pPr>
       <w:r>
         <w:rPr>
           <w:rFonts w:ascii="Georgia" w:hAnsi="Georgia"/>
           <w:b w:val="0"/>
           <w:color w:val="2F241D"/>
-          <w:sz w:val="30"/>
+          <w:sz w:val="27"/>
         </w:rPr>
         <w:t>18 апреля. День ножа/ зеркала.</w:t>
         <w:br/>
@@ -6857,14 +6857,14 @@
     </w:tbl>
     <w:p>
       <w:pPr>
-        <w:spacing w:before="240" w:after="140" w:line="300" w:lineRule="auto"/>
+        <w:spacing w:before="180" w:after="100" w:line="264" w:lineRule="auto"/>
       </w:pPr>
       <w:r>
         <w:rPr>
           <w:rFonts w:ascii="Georgia" w:hAnsi="Georgia"/>
           <w:b w:val="0"/>
           <w:color w:val="2F241D"/>
-          <w:sz w:val="30"/>
+          <w:sz w:val="27"/>
         </w:rPr>
         <w:t>Я есть Эцнаб, зал зеркал.</w:t>
         <w:br/>
@@ -7144,14 +7144,14 @@
     </w:tbl>
     <w:p>
       <w:pPr>
-        <w:spacing w:before="240" w:after="140" w:line="300" w:lineRule="auto"/>
+        <w:spacing w:before="180" w:after="100" w:line="264" w:lineRule="auto"/>
       </w:pPr>
       <w:r>
         <w:rPr>
           <w:rFonts w:ascii="Georgia" w:hAnsi="Georgia"/>
           <w:b w:val="0"/>
           <w:color w:val="2F241D"/>
-          <w:sz w:val="30"/>
+          <w:sz w:val="27"/>
         </w:rPr>
         <w:t>19 апреля Кввак. День Молнии, Бури.</w:t>
         <w:br/>
@@ -7421,14 +7421,14 @@
     </w:tbl>
     <w:p>
       <w:pPr>
-        <w:spacing w:before="240" w:after="140" w:line="300" w:lineRule="auto"/>
+        <w:spacing w:before="180" w:after="100" w:line="264" w:lineRule="auto"/>
       </w:pPr>
       <w:r>
         <w:rPr>
           <w:rFonts w:ascii="Georgia" w:hAnsi="Georgia"/>
           <w:b w:val="0"/>
           <w:color w:val="2F241D"/>
-          <w:sz w:val="30"/>
+          <w:sz w:val="27"/>
         </w:rPr>
         <w:t>Ты пришёл к границе того, что ты знал о себе. Кавак манит тебя шагнуть в огонь, который изменит каждый уровень твоего существа. Осмелься шагнуть в неизвестное - и твои метаморфозы начнутся!</w:t>
         <w:br/>
@@ -7687,14 +7687,14 @@
     </w:tbl>
     <w:p>
       <w:pPr>
-        <w:spacing w:before="240" w:after="140" w:line="300" w:lineRule="auto"/>
+        <w:spacing w:before="180" w:after="100" w:line="264" w:lineRule="auto"/>
       </w:pPr>
       <w:r>
         <w:rPr>
           <w:rFonts w:ascii="Georgia" w:hAnsi="Georgia"/>
           <w:b w:val="0"/>
           <w:color w:val="2F241D"/>
-          <w:sz w:val="30"/>
+          <w:sz w:val="27"/>
         </w:rPr>
         <w:t>20 апреля. 20й знак - Ахау. Властелин. Владыка. Солнце.</w:t>
         <w:br/>
@@ -7986,14 +7986,14 @@
     </w:tbl>
     <w:p>
       <w:pPr>
-        <w:spacing w:before="240" w:after="140" w:line="300" w:lineRule="auto"/>
+        <w:spacing w:before="180" w:after="100" w:line="264" w:lineRule="auto"/>
       </w:pPr>
       <w:r>
         <w:rPr>
           <w:rFonts w:ascii="Georgia" w:hAnsi="Georgia"/>
           <w:b w:val="0"/>
           <w:color w:val="2F241D"/>
-          <w:sz w:val="30"/>
+          <w:sz w:val="27"/>
         </w:rPr>
         <w:t>Я есть вкус любовного нектара амброзии, напитывающегося через всё творение, как миллиарды звёзд, формирующих светящееся тело космического танцора, вращая Вселенные через время и пространство.</w:t>
         <w:br/>
@@ -8300,14 +8300,14 @@
     </w:tbl>
     <w:p>
       <w:pPr>
-        <w:spacing w:before="240" w:after="140" w:line="300" w:lineRule="auto"/>
+        <w:spacing w:before="180" w:after="100" w:line="264" w:lineRule="auto"/>
       </w:pPr>
       <w:r>
         <w:rPr>
           <w:rFonts w:ascii="Georgia" w:hAnsi="Georgia"/>
           <w:b w:val="0"/>
           <w:color w:val="2F241D"/>
-          <w:sz w:val="30"/>
+          <w:sz w:val="27"/>
         </w:rPr>
         <w:t>21 апреля - Имиш. Дракон. Крокодил. Древо Мира.</w:t>
         <w:br/>
@@ -8580,14 +8580,14 @@
     </w:tbl>
     <w:p>
       <w:pPr>
-        <w:spacing w:before="240" w:after="140" w:line="300" w:lineRule="auto"/>
+        <w:spacing w:before="180" w:after="100" w:line="264" w:lineRule="auto"/>
       </w:pPr>
       <w:r>
         <w:rPr>
           <w:rFonts w:ascii="Georgia" w:hAnsi="Georgia"/>
           <w:b w:val="0"/>
           <w:color w:val="2F241D"/>
-          <w:sz w:val="30"/>
+          <w:sz w:val="27"/>
         </w:rPr>
         <w:t>Я - Имиш, Первородная Мать.</w:t>
         <w:br/>
@@ -8848,14 +8848,14 @@
     </w:tbl>
     <w:p>
       <w:pPr>
-        <w:spacing w:before="240" w:after="140" w:line="300" w:lineRule="auto"/>
+        <w:spacing w:before="180" w:after="100" w:line="264" w:lineRule="auto"/>
       </w:pPr>
       <w:r>
         <w:rPr>
           <w:rFonts w:ascii="Georgia" w:hAnsi="Georgia"/>
           <w:b w:val="0"/>
           <w:color w:val="2F241D"/>
-          <w:sz w:val="30"/>
+          <w:sz w:val="27"/>
         </w:rPr>
         <w:t>22 апреля - ИК. Ветер.</w:t>
         <w:br/>
@@ -9143,14 +9143,14 @@
     </w:tbl>
     <w:p>
       <w:pPr>
-        <w:spacing w:before="240" w:after="140" w:line="300" w:lineRule="auto"/>
+        <w:spacing w:before="180" w:after="100" w:line="264" w:lineRule="auto"/>
       </w:pPr>
       <w:r>
         <w:rPr>
           <w:rFonts w:ascii="Georgia" w:hAnsi="Georgia"/>
           <w:b w:val="0"/>
           <w:color w:val="2F241D"/>
-          <w:sz w:val="30"/>
+          <w:sz w:val="27"/>
         </w:rPr>
         <w:t>Вдохните глубоко. Я зажигаю очертания твоего потенциала, я отражаю могущество твоего присутствия. Я - частота невидимых сил, через которую в данный момент реальность происходит.</w:t>
         <w:br/>
@@ -9431,14 +9431,14 @@
     </w:tbl>
     <w:p>
       <w:pPr>
-        <w:spacing w:before="240" w:after="140" w:line="300" w:lineRule="auto"/>
+        <w:spacing w:before="180" w:after="100" w:line="264" w:lineRule="auto"/>
       </w:pPr>
       <w:r>
         <w:rPr>
           <w:rFonts w:ascii="Georgia" w:hAnsi="Georgia"/>
           <w:b w:val="0"/>
           <w:color w:val="2F241D"/>
-          <w:sz w:val="30"/>
+          <w:sz w:val="27"/>
         </w:rPr>
         <w:t>23 апреля. День тьмы, ночи, сна.</w:t>
         <w:br/>
@@ -9638,14 +9638,14 @@
     </w:tbl>
     <w:p>
       <w:pPr>
-        <w:spacing w:before="240" w:after="140" w:line="300" w:lineRule="auto"/>
+        <w:spacing w:before="180" w:after="100" w:line="264" w:lineRule="auto"/>
       </w:pPr>
       <w:r>
         <w:rPr>
           <w:rFonts w:ascii="Georgia" w:hAnsi="Georgia"/>
           <w:b w:val="0"/>
           <w:color w:val="2F241D"/>
-          <w:sz w:val="30"/>
+          <w:sz w:val="27"/>
         </w:rPr>
         <w:t>Люди Ночи, наделенные «телесной молнией», молнией в крови, могут быть превосходными шаманами и прорицателями. Киче-майя считают, что они должны странствовать по иным мирам в поисках мудрости.</w:t>
         <w:br/>
@@ -9821,14 +9821,14 @@
     </w:tbl>
     <w:p>
       <w:pPr>
-        <w:spacing w:before="240" w:after="140" w:line="300" w:lineRule="auto"/>
+        <w:spacing w:before="180" w:after="100" w:line="264" w:lineRule="auto"/>
       </w:pPr>
       <w:r>
         <w:rPr>
           <w:rFonts w:ascii="Georgia" w:hAnsi="Georgia"/>
           <w:b w:val="0"/>
           <w:color w:val="2F241D"/>
-          <w:sz w:val="30"/>
+          <w:sz w:val="27"/>
         </w:rPr>
         <w:t>НАСТРОЙКА. АКБАЛЬ. ЭГРЕГОР МАЙЯ.</w:t>
         <w:br/>
@@ -10083,14 +10083,14 @@
     </w:tbl>
     <w:p>
       <w:pPr>
-        <w:spacing w:before="240" w:after="140" w:line="300" w:lineRule="auto"/>
+        <w:spacing w:before="180" w:after="100" w:line="264" w:lineRule="auto"/>
       </w:pPr>
       <w:r>
         <w:rPr>
           <w:rFonts w:ascii="Georgia" w:hAnsi="Georgia"/>
           <w:b w:val="0"/>
           <w:color w:val="2F241D"/>
-          <w:sz w:val="30"/>
+          <w:sz w:val="27"/>
         </w:rPr>
         <w:t>24 апреля. Время Возрождения. КАН.</w:t>
         <w:br/>
@@ -10353,14 +10353,14 @@
     </w:tbl>
     <w:p>
       <w:pPr>
-        <w:spacing w:before="240" w:after="140" w:line="300" w:lineRule="auto"/>
+        <w:spacing w:before="180" w:after="100" w:line="264" w:lineRule="auto"/>
       </w:pPr>
       <w:r>
         <w:rPr>
           <w:rFonts w:ascii="Georgia" w:hAnsi="Georgia"/>
           <w:b w:val="0"/>
           <w:color w:val="2F241D"/>
-          <w:sz w:val="30"/>
+          <w:sz w:val="27"/>
         </w:rPr>
         <w:t>ПРОРАБОТКА ТЕНИ:</w:t>
         <w:br/>
@@ -10628,14 +10628,14 @@
     </w:tbl>
     <w:p>
       <w:pPr>
-        <w:spacing w:before="240" w:after="140" w:line="300" w:lineRule="auto"/>
+        <w:spacing w:before="180" w:after="100" w:line="264" w:lineRule="auto"/>
       </w:pPr>
       <w:r>
         <w:rPr>
           <w:rFonts w:ascii="Georgia" w:hAnsi="Georgia"/>
           <w:b w:val="0"/>
           <w:color w:val="2F241D"/>
-          <w:sz w:val="30"/>
+          <w:sz w:val="27"/>
         </w:rPr>
         <w:t>25 апреля - День Кетцалькоатля.</w:t>
         <w:br/>
@@ -10830,14 +10830,14 @@
     </w:tbl>
     <w:p>
       <w:pPr>
-        <w:spacing w:before="240" w:after="140" w:line="300" w:lineRule="auto"/>
+        <w:spacing w:before="180" w:after="100" w:line="264" w:lineRule="auto"/>
       </w:pPr>
       <w:r>
         <w:rPr>
           <w:rFonts w:ascii="Georgia" w:hAnsi="Georgia"/>
           <w:b w:val="0"/>
           <w:color w:val="2F241D"/>
-          <w:sz w:val="30"/>
+          <w:sz w:val="27"/>
         </w:rPr>
         <w:t>Почувствуйте новые способы поведения, что принесут вам больше жизненной силы, спонтанности и приятных открытий в вашу жизнь. Если вы выбрали Чикчан, вас просят взглянуть на проблемы сексуальности и интимности. Выбирая этот звездный иероглиф, предполагается, что вы желаете поделиться вашим глубинным состоянием себя и, что вы стремитесь к глубинной связи и интимности.</w:t>
         <w:br/>
@@ -11060,14 +11060,14 @@
     </w:tbl>
     <w:p>
       <w:pPr>
-        <w:spacing w:before="240" w:after="140" w:line="300" w:lineRule="auto"/>
+        <w:spacing w:before="180" w:after="100" w:line="264" w:lineRule="auto"/>
       </w:pPr>
       <w:r>
         <w:rPr>
           <w:rFonts w:ascii="Georgia" w:hAnsi="Georgia"/>
           <w:b w:val="0"/>
           <w:color w:val="2F241D"/>
-          <w:sz w:val="30"/>
+          <w:sz w:val="27"/>
         </w:rPr>
         <w:t>Простите себя. Простите других. Отпустите. Сдайтесь тому, что ограничивает Вас. Встретьте то, чему Вы сопротивляетесь. Опыт любой потери учит, что всегда можно всё исправить. Через Ваше устремление пройти тёмным лесом озарения и откровения естественно придут.</w:t>
         <w:br/>
@@ -11312,14 +11312,14 @@
     </w:tbl>
     <w:p>
       <w:pPr>
-        <w:spacing w:before="240" w:after="140" w:line="300" w:lineRule="auto"/>
+        <w:spacing w:before="180" w:after="100" w:line="264" w:lineRule="auto"/>
       </w:pPr>
       <w:r>
         <w:rPr>
           <w:rFonts w:ascii="Georgia" w:hAnsi="Georgia"/>
           <w:b w:val="0"/>
           <w:color w:val="2F241D"/>
-          <w:sz w:val="30"/>
+          <w:sz w:val="27"/>
         </w:rPr>
         <w:t>Вчера, 30 апреля был день Собаки - день дружбы.</w:t>
         <w:br/>
@@ -11474,7 +11474,7 @@
     <w:p>
       <w:bookmarkStart w:id="43" w:name="chapter_2"/>
       <w:pPr>
-        <w:spacing w:before="240" w:after="200" w:line="300" w:lineRule="auto"/>
+        <w:spacing w:before="240" w:after="200" w:line="264" w:lineRule="auto"/>
       </w:pPr>
       <w:r>
         <w:rPr>
@@ -11685,14 +11685,14 @@
     </w:tbl>
     <w:p>
       <w:pPr>
-        <w:spacing w:before="240" w:after="140" w:line="300" w:lineRule="auto"/>
+        <w:spacing w:before="180" w:after="100" w:line="252" w:lineRule="auto"/>
       </w:pPr>
       <w:r>
         <w:rPr>
           <w:rFonts w:ascii="Georgia" w:hAnsi="Georgia"/>
           <w:b w:val="0"/>
           <w:color w:val="2F241D"/>
-          <w:sz w:val="30"/>
+          <w:sz w:val="25"/>
         </w:rPr>
         <w:t>ПОДАРОК. Определение своей сути и миссии в Традиции Майя.</w:t>
         <w:br/>
@@ -11947,14 +11947,14 @@
     </w:tbl>
     <w:p>
       <w:pPr>
-        <w:spacing w:before="240" w:after="140" w:line="300" w:lineRule="auto"/>
+        <w:spacing w:before="180" w:after="100" w:line="252" w:lineRule="auto"/>
       </w:pPr>
       <w:r>
         <w:rPr>
           <w:rFonts w:ascii="Georgia" w:hAnsi="Georgia"/>
           <w:b w:val="0"/>
           <w:color w:val="2F241D"/>
-          <w:sz w:val="30"/>
+          <w:sz w:val="25"/>
         </w:rPr>
         <w:t>Здесь краткое описание традиции Майя и одного из курсов, который можно пройти как через личные сессии, так и группой! :)</w:t>
         <w:br/>
@@ -12271,14 +12271,14 @@
     </w:tbl>
     <w:p>
       <w:pPr>
-        <w:spacing w:before="240" w:after="140" w:line="300" w:lineRule="auto"/>
+        <w:spacing w:before="180" w:after="100" w:line="252" w:lineRule="auto"/>
       </w:pPr>
       <w:r>
         <w:rPr>
           <w:rFonts w:ascii="Georgia" w:hAnsi="Georgia"/>
           <w:b w:val="0"/>
           <w:color w:val="2F241D"/>
-          <w:sz w:val="30"/>
+          <w:sz w:val="25"/>
         </w:rPr>
         <w:t>И тогда твоя сила, твоя К'ух будет расти. Тогда ты будешь слышать шопот Кетцалькоатля</w:t>
         <w:br/>
@@ -12705,11 +12705,11 @@
     <w:qFormat/>
     <w:rsid w:val="00FC693F"/>
     <w:pPr>
-      <w:spacing w:line="300" w:lineRule="auto"/>
+      <w:spacing w:line="264" w:lineRule="auto"/>
     </w:pPr>
     <w:rPr>
       <w:rFonts w:ascii="Georgia" w:hAnsi="Georgia"/>
-      <w:sz w:val="30"/>
+      <w:sz w:val="27"/>
     </w:rPr>
   </w:style>
   <w:style w:type="paragraph" w:styleId="Header">

</xml_diff>